<commit_message>
bb3 Fixed templates button in bb3
</commit_message>
<xml_diff>
--- a/docs/wes2/Next fix bb3 notes, plus circuits.docx
+++ b/docs/wes2/Next fix bb3 notes, plus circuits.docx
@@ -89,6 +89,15 @@
       </w:r>
       <w:r>
         <w:t>Circuit logic wes2 needs to be fixed, UI improved.</w:t>
+      </w:r>
+      <w:r>
+        <w:br/>
+      </w:r>
+      <w:r>
+        <w:br/>
+      </w:r>
+      <w:r>
+        <w:br/>
       </w:r>
     </w:p>
     <w:sectPr>
@@ -801,6 +810,7 @@
   <w:style w:type="character" w:default="1" w:styleId="DefaultParagraphFont">
     <w:name w:val="Default Paragraph Font"/>
     <w:uiPriority w:val="1"/>
+    <w:semiHidden/>
     <w:unhideWhenUsed/>
   </w:style>
   <w:style w:type="table" w:default="1" w:styleId="TableNormal">

</xml_diff>

<commit_message>
WES2 big ong think, may have fixed edge case cascade hint issue. reps matching hint and weight not cuasing subsequent sets to default reps to 1 regardless fo e1rm. other wrong e1rm for set 2 conditions arising also
</commit_message>
<xml_diff>
--- a/docs/wes2/Next fix bb3 notes, plus circuits.docx
+++ b/docs/wes2/Next fix bb3 notes, plus circuits.docx
@@ -66,7 +66,22 @@
     <w:p/>
     <w:p>
       <w:r>
-        <w:t>Can we add double tap to accept hint value showing.</w:t>
+        <w:t>Can we add double tap to accept hint value showing</w:t>
+      </w:r>
+      <w:r>
+        <w:t xml:space="preserve">? This should be just like </w:t>
+      </w:r>
+      <w:proofErr w:type="spellStart"/>
+      <w:r>
+        <w:t>workoutentryscreen</w:t>
+      </w:r>
+      <w:proofErr w:type="spellEnd"/>
+      <w:r>
+        <w:t xml:space="preserve">, I think you have that file and the relevant part of that file related to this task in this thread, let me know if you can read it from that file you have, or if you want me to send the whole file again. </w:t>
+      </w:r>
+      <w:r>
+        <w:br/>
+        <w:t xml:space="preserve">Double tap to accept hint should mean whatever value is currently showing in that field gets entered as the user-entered value. Should not result in any thing else becoming the user-entered value other than the exact hint value currently showing in the field at the time of double-tap. </w:t>
       </w:r>
     </w:p>
     <w:p>
@@ -82,6 +97,35 @@
         <w:t xml:space="preserve"> original</w:t>
       </w:r>
       <w:r>
+        <w:t xml:space="preserve">. Right </w:t>
+      </w:r>
+      <w:proofErr w:type="gramStart"/>
+      <w:r>
+        <w:t>now</w:t>
+      </w:r>
+      <w:proofErr w:type="gramEnd"/>
+      <w:r>
+        <w:t xml:space="preserve"> notes </w:t>
+      </w:r>
+      <w:proofErr w:type="spellStart"/>
+      <w:r>
+        <w:t>enterd</w:t>
+      </w:r>
+      <w:proofErr w:type="spellEnd"/>
+      <w:r>
+        <w:t xml:space="preserve"> into bb3 do not show up in wes2, there is no icon like in </w:t>
+      </w:r>
+      <w:proofErr w:type="spellStart"/>
+      <w:r>
+        <w:t>wes</w:t>
+      </w:r>
+      <w:proofErr w:type="spellEnd"/>
+      <w:r>
+        <w:t xml:space="preserve"> original. </w:t>
+      </w:r>
+    </w:p>
+    <w:p>
+      <w:r>
         <w:br/>
       </w:r>
       <w:r>
@@ -89,6 +133,66 @@
       </w:r>
       <w:r>
         <w:t>Circuit logic wes2 needs to be fixed, UI improved.</w:t>
+      </w:r>
+    </w:p>
+    <w:p/>
+    <w:p/>
+    <w:p>
+      <w:r>
+        <w:t>BB3 UI edit.</w:t>
+      </w:r>
+      <w:r>
+        <w:br/>
+      </w:r>
+      <w:r>
+        <w:br/>
+        <w:t xml:space="preserve">Can we also change the cross icon to delete exercise in bb3 to become a </w:t>
+      </w:r>
+      <w:proofErr w:type="gramStart"/>
+      <w:r>
+        <w:t>3 dot</w:t>
+      </w:r>
+      <w:proofErr w:type="gramEnd"/>
+      <w:r>
+        <w:t xml:space="preserve"> menu per exercise? And can that 3 dot </w:t>
+      </w:r>
+      <w:proofErr w:type="gramStart"/>
+      <w:r>
+        <w:t>menu</w:t>
+      </w:r>
+      <w:proofErr w:type="gramEnd"/>
+      <w:r>
+        <w:t xml:space="preserve"> have the options:</w:t>
+      </w:r>
+    </w:p>
+    <w:p>
+      <w:r>
+        <w:t>Delete exercise – Same as current delete feature, include the red delete ‘X’ icon currently used, to the left of the word ‘delete’</w:t>
+      </w:r>
+      <w:r>
+        <w:br/>
+        <w:t>Replace exercise – This new feature should open up an add exercise dialog, same UI as main add exercise button,</w:t>
+      </w:r>
+      <w:r>
+        <w:t xml:space="preserve"> with layout, groupings, planned only toggle, etc</w:t>
+      </w:r>
+      <w:r>
+        <w:t xml:space="preserve"> but be for one exercise only, so not the normal</w:t>
+      </w:r>
+      <w:r>
+        <w:t xml:space="preserve"> check tick boxes for multiple exercises, should just be for one exercise only. If exercise is tapped/selected from this list, then the current exercise should be deleted, and the selected exercise should be slotted in its place. Is this much clear? Let me know if you are unsure. Please restate in your own words, </w:t>
+      </w:r>
+      <w:r>
+        <w:lastRenderedPageBreak/>
+        <w:t xml:space="preserve">concisely, then give me the </w:t>
+      </w:r>
+      <w:proofErr w:type="spellStart"/>
+      <w:r>
+        <w:t>claude</w:t>
+      </w:r>
+      <w:proofErr w:type="spellEnd"/>
+      <w:r>
+        <w:t xml:space="preserve"> code prompt.</w:t>
       </w:r>
       <w:r>
         <w:br/>
@@ -113,6 +217,119 @@
 <file path=word/numbering.xml><?xml version="1.0" encoding="utf-8"?>
 <w:numbering xmlns:wpc="http://schemas.microsoft.com/office/word/2010/wordprocessingCanvas" xmlns:cx="http://schemas.microsoft.com/office/drawing/2014/chartex" xmlns:cx1="http://schemas.microsoft.com/office/drawing/2015/9/8/chartex" xmlns:cx2="http://schemas.microsoft.com/office/drawing/2015/10/21/chartex" xmlns:cx3="http://schemas.microsoft.com/office/drawing/2016/5/9/chartex" xmlns:cx4="http://schemas.microsoft.com/office/drawing/2016/5/10/chartex" xmlns:cx5="http://schemas.microsoft.com/office/drawing/2016/5/11/chartex" xmlns:cx6="http://schemas.microsoft.com/office/drawing/2016/5/12/chartex" xmlns:cx7="http://schemas.microsoft.com/office/drawing/2016/5/13/chartex" xmlns:cx8="http://schemas.microsoft.com/office/drawing/2016/5/14/chartex" xmlns:mc="http://schemas.openxmlformats.org/markup-compatibility/2006" xmlns:aink="http://schemas.microsoft.com/office/drawing/2016/ink" xmlns:am3d="http://schemas.microsoft.com/office/drawing/2017/model3d" xmlns:o="urn:schemas-microsoft-com:office:office" xmlns:oel="http://schemas.microsoft.com/office/2019/extlst" xmlns:r="http://schemas.openxmlformats.org/officeDocument/2006/relationships" xmlns:m="http://schemas.openxmlformats.org/officeDocument/2006/math" xmlns:v="urn:schemas-microsoft-com:vml" xmlns:wp14="http://schemas.microsoft.com/office/word/2010/wordprocessingDrawing" xmlns:wp="http://schemas.openxmlformats.org/drawingml/2006/wordprocessingDrawing" xmlns:w10="urn:schemas-microsoft-com:office:word" xmlns:w="http://schemas.openxmlformats.org/wordprocessingml/2006/main" xmlns:w14="http://schemas.microsoft.com/office/word/2010/wordml" xmlns:w15="http://schemas.microsoft.com/office/word/2012/wordml" xmlns:w16cex="http://schemas.microsoft.com/office/word/2018/wordml/cex" xmlns:w16cid="http://schemas.microsoft.com/office/word/2016/wordml/cid" xmlns:w16="http://schemas.microsoft.com/office/word/2018/wordml" xmlns:w16du="http://schemas.microsoft.com/office/word/2023/wordml/word16du" xmlns:w16sdtdh="http://schemas.microsoft.com/office/word/2020/wordml/sdtdatahash" xmlns:w16sdtfl="http://schemas.microsoft.com/office/word/2024/wordml/sdtformatlock" xmlns:w16se="http://schemas.microsoft.com/office/word/2015/wordml/symex" xmlns:wpg="http://schemas.microsoft.com/office/word/2010/wordprocessingGroup" xmlns:wpi="http://schemas.microsoft.com/office/word/2010/wordprocessingInk" xmlns:wne="http://schemas.microsoft.com/office/word/2006/wordml" xmlns:wps="http://schemas.microsoft.com/office/word/2010/wordprocessingShape" mc:Ignorable="w14 w15 w16se w16cid w16 w16cex w16sdtdh w16sdtfl w16du wp14">
   <w:abstractNum w:abstractNumId="0" w15:restartNumberingAfterBreak="0">
+    <w:nsid w:val="39250F5E"/>
+    <w:multiLevelType w:val="hybridMultilevel"/>
+    <w:tmpl w:val="F3F8F17E"/>
+    <w:lvl w:ilvl="0" w:tplc="6CFEC0DA">
+      <w:start w:val="3"/>
+      <w:numFmt w:val="bullet"/>
+      <w:lvlText w:val=""/>
+      <w:lvlJc w:val="left"/>
+      <w:pPr>
+        <w:ind w:left="720" w:hanging="360"/>
+      </w:pPr>
+      <w:rPr>
+        <w:rFonts w:ascii="Symbol" w:eastAsiaTheme="minorHAnsi" w:hAnsi="Symbol" w:cstheme="minorBidi" w:hint="default"/>
+      </w:rPr>
+    </w:lvl>
+    <w:lvl w:ilvl="1" w:tplc="14090003" w:tentative="1">
+      <w:start w:val="1"/>
+      <w:numFmt w:val="bullet"/>
+      <w:lvlText w:val="o"/>
+      <w:lvlJc w:val="left"/>
+      <w:pPr>
+        <w:ind w:left="1440" w:hanging="360"/>
+      </w:pPr>
+      <w:rPr>
+        <w:rFonts w:ascii="Courier New" w:hAnsi="Courier New" w:cs="Courier New" w:hint="default"/>
+      </w:rPr>
+    </w:lvl>
+    <w:lvl w:ilvl="2" w:tplc="14090005" w:tentative="1">
+      <w:start w:val="1"/>
+      <w:numFmt w:val="bullet"/>
+      <w:lvlText w:val=""/>
+      <w:lvlJc w:val="left"/>
+      <w:pPr>
+        <w:ind w:left="2160" w:hanging="360"/>
+      </w:pPr>
+      <w:rPr>
+        <w:rFonts w:ascii="Wingdings" w:hAnsi="Wingdings" w:hint="default"/>
+      </w:rPr>
+    </w:lvl>
+    <w:lvl w:ilvl="3" w:tplc="14090001" w:tentative="1">
+      <w:start w:val="1"/>
+      <w:numFmt w:val="bullet"/>
+      <w:lvlText w:val=""/>
+      <w:lvlJc w:val="left"/>
+      <w:pPr>
+        <w:ind w:left="2880" w:hanging="360"/>
+      </w:pPr>
+      <w:rPr>
+        <w:rFonts w:ascii="Symbol" w:hAnsi="Symbol" w:hint="default"/>
+      </w:rPr>
+    </w:lvl>
+    <w:lvl w:ilvl="4" w:tplc="14090003" w:tentative="1">
+      <w:start w:val="1"/>
+      <w:numFmt w:val="bullet"/>
+      <w:lvlText w:val="o"/>
+      <w:lvlJc w:val="left"/>
+      <w:pPr>
+        <w:ind w:left="3600" w:hanging="360"/>
+      </w:pPr>
+      <w:rPr>
+        <w:rFonts w:ascii="Courier New" w:hAnsi="Courier New" w:cs="Courier New" w:hint="default"/>
+      </w:rPr>
+    </w:lvl>
+    <w:lvl w:ilvl="5" w:tplc="14090005" w:tentative="1">
+      <w:start w:val="1"/>
+      <w:numFmt w:val="bullet"/>
+      <w:lvlText w:val=""/>
+      <w:lvlJc w:val="left"/>
+      <w:pPr>
+        <w:ind w:left="4320" w:hanging="360"/>
+      </w:pPr>
+      <w:rPr>
+        <w:rFonts w:ascii="Wingdings" w:hAnsi="Wingdings" w:hint="default"/>
+      </w:rPr>
+    </w:lvl>
+    <w:lvl w:ilvl="6" w:tplc="14090001" w:tentative="1">
+      <w:start w:val="1"/>
+      <w:numFmt w:val="bullet"/>
+      <w:lvlText w:val=""/>
+      <w:lvlJc w:val="left"/>
+      <w:pPr>
+        <w:ind w:left="5040" w:hanging="360"/>
+      </w:pPr>
+      <w:rPr>
+        <w:rFonts w:ascii="Symbol" w:hAnsi="Symbol" w:hint="default"/>
+      </w:rPr>
+    </w:lvl>
+    <w:lvl w:ilvl="7" w:tplc="14090003" w:tentative="1">
+      <w:start w:val="1"/>
+      <w:numFmt w:val="bullet"/>
+      <w:lvlText w:val="o"/>
+      <w:lvlJc w:val="left"/>
+      <w:pPr>
+        <w:ind w:left="5760" w:hanging="360"/>
+      </w:pPr>
+      <w:rPr>
+        <w:rFonts w:ascii="Courier New" w:hAnsi="Courier New" w:cs="Courier New" w:hint="default"/>
+      </w:rPr>
+    </w:lvl>
+    <w:lvl w:ilvl="8" w:tplc="14090005" w:tentative="1">
+      <w:start w:val="1"/>
+      <w:numFmt w:val="bullet"/>
+      <w:lvlText w:val=""/>
+      <w:lvlJc w:val="left"/>
+      <w:pPr>
+        <w:ind w:left="6480" w:hanging="360"/>
+      </w:pPr>
+      <w:rPr>
+        <w:rFonts w:ascii="Wingdings" w:hAnsi="Wingdings" w:hint="default"/>
+      </w:rPr>
+    </w:lvl>
+  </w:abstractNum>
+  <w:abstractNum w:abstractNumId="1" w15:restartNumberingAfterBreak="0">
     <w:nsid w:val="6A64573E"/>
     <w:multiLevelType w:val="hybridMultilevel"/>
     <w:tmpl w:val="7EA88296"/>
@@ -202,6 +419,9 @@
     </w:lvl>
   </w:abstractNum>
   <w:num w:numId="1" w16cid:durableId="1524397689">
+    <w:abstractNumId w:val="1"/>
+  </w:num>
+  <w:num w:numId="2" w16cid:durableId="642201778">
     <w:abstractNumId w:val="0"/>
   </w:num>
 </w:numbering>

</xml_diff>

<commit_message>
added prints to exercisesettings in wes2
</commit_message>
<xml_diff>
--- a/docs/wes2/Next fix bb3 notes, plus circuits.docx
+++ b/docs/wes2/Next fix bb3 notes, plus circuits.docx
@@ -63,76 +63,62 @@
         <w:t xml:space="preserve"> for each user to, and responsive to which ever user is loaded</w:t>
       </w:r>
     </w:p>
+    <w:p>
+      <w:r>
+        <w:br/>
+      </w:r>
+      <w:r>
+        <w:br/>
+      </w:r>
+      <w:r>
+        <w:t>Circuit logic wes2 needs to be fixed, UI improved.</w:t>
+      </w:r>
+    </w:p>
+    <w:p>
+      <w:r>
+        <w:t xml:space="preserve">Of these next two proposed fixes, which do you think will be easier, given current state, and less likely to break anything already in place? then </w:t>
+      </w:r>
+      <w:proofErr w:type="spellStart"/>
+      <w:proofErr w:type="gramStart"/>
+      <w:r>
+        <w:t>lets</w:t>
+      </w:r>
+      <w:proofErr w:type="spellEnd"/>
+      <w:proofErr w:type="gramEnd"/>
+      <w:r>
+        <w:t xml:space="preserve"> do the easier one first and save it, then move to next.</w:t>
+      </w:r>
+    </w:p>
+    <w:p>
+      <w:r>
+        <w:br/>
+      </w:r>
+      <w:r>
+        <w:t xml:space="preserve">Ok next thing to fix is retroactive edits to previous workouts. Can you read the spec doc on this please, and summarise intended behaviour in your own words? </w:t>
+      </w:r>
+      <w:r>
+        <w:br/>
+      </w:r>
+      <w:r>
+        <w:br/>
+      </w:r>
+      <w:r>
+        <w:br/>
+        <w:t xml:space="preserve">Next thing to implement is live edits updating on multiple devices, including last write win rules. Can you summarise spec doc requirements on that please? </w:t>
+      </w:r>
+    </w:p>
     <w:p/>
     <w:p>
       <w:r>
-        <w:t>Can we add double tap to accept hint value showing</w:t>
-      </w:r>
-      <w:r>
-        <w:t xml:space="preserve">? This should be just like </w:t>
+        <w:t xml:space="preserve">can we also update this top sets screen specifically for body weight exercises, to make it show added weight in the weight section, and in the E1RM, rather than absolute weight. use the most recent weigh in up to that date from bodyweights, if not already </w:t>
       </w:r>
       <w:proofErr w:type="spellStart"/>
       <w:r>
-        <w:t>workoutentryscreen</w:t>
+        <w:t>availbale</w:t>
       </w:r>
       <w:proofErr w:type="spellEnd"/>
       <w:r>
-        <w:t xml:space="preserve">, I think you have that file and the relevant part of that file related to this task in this thread, let me know if you can read it from that file you have, or if you want me to send the whole file again. </w:t>
-      </w:r>
-      <w:r>
-        <w:br/>
-        <w:t xml:space="preserve">Double tap to accept hint should mean whatever value is currently showing in that field gets entered as the user-entered value. Should not result in any thing else becoming the user-entered value other than the exact hint value currently showing in the field at the time of double-tap. </w:t>
-      </w:r>
-    </w:p>
-    <w:p>
-      <w:r>
-        <w:t xml:space="preserve">Can we make bb3 entered notes from coach show a conditional note icon to the right of exercise name? should be bright yellow if unread, greyed if read. Notes can be specific to set or just for the exercise in general. This works in </w:t>
-      </w:r>
-      <w:proofErr w:type="spellStart"/>
-      <w:r>
-        <w:t>wes</w:t>
-      </w:r>
-      <w:proofErr w:type="spellEnd"/>
-      <w:r>
-        <w:t xml:space="preserve"> original</w:t>
-      </w:r>
-      <w:r>
-        <w:t xml:space="preserve">. Right </w:t>
-      </w:r>
-      <w:proofErr w:type="gramStart"/>
-      <w:r>
-        <w:t>now</w:t>
-      </w:r>
-      <w:proofErr w:type="gramEnd"/>
-      <w:r>
-        <w:t xml:space="preserve"> notes </w:t>
-      </w:r>
-      <w:proofErr w:type="spellStart"/>
-      <w:r>
-        <w:t>enterd</w:t>
-      </w:r>
-      <w:proofErr w:type="spellEnd"/>
-      <w:r>
-        <w:t xml:space="preserve"> into bb3 do not show up in wes2, there is no icon like in </w:t>
-      </w:r>
-      <w:proofErr w:type="spellStart"/>
-      <w:r>
-        <w:t>wes</w:t>
-      </w:r>
-      <w:proofErr w:type="spellEnd"/>
-      <w:r>
-        <w:t xml:space="preserve"> original. </w:t>
-      </w:r>
-    </w:p>
-    <w:p>
-      <w:r>
-        <w:br/>
-      </w:r>
-      <w:r>
-        <w:br/>
-      </w:r>
-      <w:r>
-        <w:t>Circuit logic wes2 needs to be fixed, UI improved.</w:t>
+        <w:t xml:space="preserve"> in the calculation from the workout? </w:t>
       </w:r>
     </w:p>
     <w:p/>
@@ -146,62 +132,201 @@
       </w:r>
       <w:r>
         <w:br/>
-        <w:t xml:space="preserve">Can we also change the cross icon to delete exercise in bb3 to become a </w:t>
-      </w:r>
-      <w:proofErr w:type="gramStart"/>
-      <w:r>
-        <w:t>3 dot</w:t>
-      </w:r>
-      <w:proofErr w:type="gramEnd"/>
-      <w:r>
-        <w:t xml:space="preserve"> menu per exercise? And can that 3 dot </w:t>
-      </w:r>
-      <w:proofErr w:type="gramStart"/>
-      <w:r>
-        <w:t>menu</w:t>
-      </w:r>
-      <w:proofErr w:type="gramEnd"/>
-      <w:r>
-        <w:t xml:space="preserve"> have the options:</w:t>
+      </w:r>
+      <w:r>
+        <w:br/>
+        <w:t xml:space="preserve">Hi Aja, this is your reminder to do better today. </w:t>
+      </w:r>
+      <w:r>
+        <w:br/>
+      </w:r>
+      <w:r>
+        <w:br/>
+        <w:t>Hi Aja, you last workout was not enough. If you ever want to be a firefighting lady, you are going to have to train harder</w:t>
+      </w:r>
+    </w:p>
+    <w:p/>
+    <w:p>
+      <w:r>
+        <w:lastRenderedPageBreak/>
+        <w:t xml:space="preserve">Hi Aja, your last session I decided you were not trying hard enough so I didn’t count it. Please start again from scratch. </w:t>
+      </w:r>
+      <w:r>
+        <w:br/>
+      </w:r>
+      <w:r>
+        <w:br/>
+        <w:t>Hi, Aja, why can you still fit through doors?? Eat more protein.</w:t>
+      </w:r>
+      <w:r>
+        <w:br/>
+      </w:r>
+      <w:r>
+        <w:br/>
+      </w:r>
+      <w:r>
+        <w:t>Hi Aja, your workout is ready. For today’s added conditioning stimulus, a live bear has been programmed to attack at an undisclosed time. Good luck.</w:t>
       </w:r>
     </w:p>
     <w:p>
       <w:r>
-        <w:t>Delete exercise – Same as current delete feature, include the red delete ‘X’ icon currently used, to the left of the word ‘delete’</w:t>
-      </w:r>
-      <w:r>
-        <w:br/>
-        <w:t>Replace exercise – This new feature should open up an add exercise dialog, same UI as main add exercise button,</w:t>
-      </w:r>
-      <w:r>
-        <w:t xml:space="preserve"> with layout, groupings, planned only toggle, etc</w:t>
-      </w:r>
-      <w:r>
-        <w:t xml:space="preserve"> but be for one exercise only, so not the normal</w:t>
-      </w:r>
-      <w:r>
-        <w:t xml:space="preserve"> check tick boxes for multiple exercises, should just be for one exercise only. If exercise is tapped/selected from this list, then the current exercise should be deleted, and the selected exercise should be slotted in its place. Is this much clear? Let me know if you are unsure. Please restate in your own words, </w:t>
-      </w:r>
+        <w:br w:type="page"/>
+      </w:r>
+    </w:p>
+    <w:p>
       <w:r>
         <w:lastRenderedPageBreak/>
-        <w:t xml:space="preserve">concisely, then give me the </w:t>
-      </w:r>
-      <w:proofErr w:type="spellStart"/>
-      <w:r>
-        <w:t>claude</w:t>
-      </w:r>
-      <w:proofErr w:type="spellEnd"/>
-      <w:r>
-        <w:t xml:space="preserve"> code prompt.</w:t>
-      </w:r>
-      <w:r>
-        <w:br/>
-      </w:r>
-      <w:r>
-        <w:br/>
-      </w:r>
-      <w:r>
-        <w:br/>
+        <w:t xml:space="preserve">Hi Aja, your workout is ready. </w:t>
+      </w:r>
+      <w:r>
+        <w:t>The</w:t>
+      </w:r>
+      <w:r>
+        <w:t xml:space="preserve"> exit doors </w:t>
+      </w:r>
+      <w:r>
+        <w:t>have been</w:t>
+      </w:r>
+      <w:r>
+        <w:t xml:space="preserve"> </w:t>
+      </w:r>
+      <w:proofErr w:type="gramStart"/>
+      <w:r>
+        <w:t>lock</w:t>
+      </w:r>
+      <w:r>
+        <w:t>ed</w:t>
+      </w:r>
+      <w:proofErr w:type="gramEnd"/>
+      <w:r>
+        <w:t xml:space="preserve"> and s</w:t>
+      </w:r>
+      <w:r>
+        <w:t xml:space="preserve">taff have been notified </w:t>
+      </w:r>
+      <w:r>
+        <w:t>prevent you from</w:t>
+      </w:r>
+      <w:r>
+        <w:t xml:space="preserve"> leav</w:t>
+      </w:r>
+      <w:r>
+        <w:t>ing</w:t>
+      </w:r>
+      <w:r>
+        <w:t xml:space="preserve"> until sufficient effort has been demonstrated.</w:t>
+      </w:r>
+      <w:r>
+        <w:t xml:space="preserve"> </w:t>
+      </w:r>
+    </w:p>
+    <w:p/>
+    <w:p>
+      <w:r>
+        <w:t xml:space="preserve">Hi Aja, your workout is ready. For today’s added conditioning stimulus, a goose with poor </w:t>
+      </w:r>
+      <w:r>
+        <w:t xml:space="preserve">personal </w:t>
+      </w:r>
+      <w:r>
+        <w:t>boundar</w:t>
+      </w:r>
+      <w:r>
+        <w:t>y understanding</w:t>
+      </w:r>
+      <w:r>
+        <w:t xml:space="preserve"> has been programmed to appear at an undisclosed time. Good luck.</w:t>
+      </w:r>
+    </w:p>
+    <w:p/>
+    <w:p>
+      <w:r>
+        <w:t xml:space="preserve">Hi Aja, your workout is ready. </w:t>
+      </w:r>
+      <w:r>
+        <w:t>Today the</w:t>
+      </w:r>
+      <w:r>
+        <w:t xml:space="preserve"> floor will become lava</w:t>
+      </w:r>
+      <w:r>
+        <w:t xml:space="preserve"> if you rest for too long, or too short. Get it right</w:t>
+      </w:r>
+      <w:r>
+        <w:t>.</w:t>
+      </w:r>
+      <w:r>
+        <w:br/>
+      </w:r>
+      <w:r>
+        <w:t>Good luck.</w:t>
+      </w:r>
+      <w:r>
+        <w:br/>
+      </w:r>
+      <w:r>
+        <w:br/>
+      </w:r>
+      <w:r>
+        <w:br/>
+        <w:t>Hi Mike, this is your friendly reminder to do better.</w:t>
+      </w:r>
+      <w:r>
+        <w:br/>
+      </w:r>
+      <w:r>
+        <w:br/>
+        <w:t xml:space="preserve">Hi Mike, try smiling. </w:t>
+      </w:r>
+    </w:p>
+    <w:p/>
+    <w:p>
+      <w:r>
+        <w:t xml:space="preserve">Hi Mike, everyone here thinks you are great. </w:t>
+      </w:r>
+      <w:r>
+        <w:br/>
+      </w:r>
+      <w:r>
+        <w:br/>
+        <w:t xml:space="preserve">Hi Mike, </w:t>
+      </w:r>
+      <w:proofErr w:type="gramStart"/>
+      <w:r>
+        <w:t>Remember</w:t>
+      </w:r>
+      <w:proofErr w:type="gramEnd"/>
+      <w:r>
+        <w:t xml:space="preserve"> to put people in their place today, help them </w:t>
+      </w:r>
+      <w:r>
+        <w:t>to control their</w:t>
+      </w:r>
+      <w:r>
+        <w:t xml:space="preserve"> ego’s, it’s a kindness. </w:t>
+      </w:r>
+      <w:r>
+        <w:br/>
+      </w:r>
+    </w:p>
+    <w:p>
+      <w:r>
+        <w:t xml:space="preserve">Hi </w:t>
+      </w:r>
+      <w:r>
+        <w:t>Mike</w:t>
+      </w:r>
+      <w:r>
+        <w:t>, your workout is ready. For today’s added motivation, an unpaid intern has been instructed to boo any set performed below target RIR.</w:t>
+      </w:r>
+    </w:p>
+    <w:p>
+      <w:r>
+        <w:br/>
+        <w:t xml:space="preserve">Hi Steven, </w:t>
+      </w:r>
+      <w:r>
+        <w:t>your workout is ready. For today’s added accountability measure, a judgemental goose has been assigned to monitor your rest periods.</w:t>
       </w:r>
     </w:p>
     <w:sectPr>
@@ -1030,7 +1155,6 @@
   <w:style w:type="character" w:default="1" w:styleId="DefaultParagraphFont">
     <w:name w:val="Default Paragraph Font"/>
     <w:uiPriority w:val="1"/>
-    <w:semiHidden/>
     <w:unhideWhenUsed/>
   </w:style>
   <w:style w:type="table" w:default="1" w:styleId="TableNormal">

</xml_diff>

<commit_message>
pubspec yaml and andorid setting updated for next builds.
Main fix: new users wes2 now works on account creation without needing manual block save to enable
</commit_message>
<xml_diff>
--- a/docs/wes2/Next fix bb3 notes, plus circuits.docx
+++ b/docs/wes2/Next fix bb3 notes, plus circuits.docx
@@ -76,33 +76,6 @@
     </w:p>
     <w:p>
       <w:r>
-        <w:t xml:space="preserve">Of these next two proposed fixes, which do you think will be easier, given current state, and less likely to break anything already in place? then </w:t>
-      </w:r>
-      <w:proofErr w:type="spellStart"/>
-      <w:proofErr w:type="gramStart"/>
-      <w:r>
-        <w:t>lets</w:t>
-      </w:r>
-      <w:proofErr w:type="spellEnd"/>
-      <w:proofErr w:type="gramEnd"/>
-      <w:r>
-        <w:t xml:space="preserve"> do the easier one first and save it, then move to next.</w:t>
-      </w:r>
-    </w:p>
-    <w:p>
-      <w:r>
-        <w:br/>
-      </w:r>
-      <w:r>
-        <w:t xml:space="preserve">Ok next thing to fix is retroactive edits to previous workouts. Can you read the spec doc on this please, and summarise intended behaviour in your own words? </w:t>
-      </w:r>
-      <w:r>
-        <w:br/>
-      </w:r>
-      <w:r>
-        <w:br/>
-      </w:r>
-      <w:r>
         <w:br/>
         <w:t xml:space="preserve">Next thing to implement is live edits updating on multiple devices, including last write win rules. Can you summarise spec doc requirements on that please? </w:t>
       </w:r>
@@ -110,15 +83,157 @@
     <w:p/>
     <w:p>
       <w:r>
-        <w:t xml:space="preserve">can we also update this top sets screen specifically for body weight exercises, to make it show added weight in the weight section, and in the E1RM, rather than absolute weight. use the most recent weigh in up to that date from bodyweights, if not already </w:t>
+        <w:t xml:space="preserve">Can we please make hint logic in bb3 follow the same instance indexing rules as </w:t>
       </w:r>
       <w:proofErr w:type="spellStart"/>
       <w:r>
-        <w:t>availbale</w:t>
+        <w:t>wes</w:t>
       </w:r>
       <w:proofErr w:type="spellEnd"/>
       <w:r>
-        <w:t xml:space="preserve"> in the calculation from the workout? </w:t>
+        <w:t xml:space="preserve"> 2 for reps, RIR and set count? Except that in bb3, except that in bb3 planned exercises should respond to other planned exercises hint values. </w:t>
+      </w:r>
+      <w:proofErr w:type="gramStart"/>
+      <w:r>
+        <w:t>So</w:t>
+      </w:r>
+      <w:proofErr w:type="gramEnd"/>
+      <w:r>
+        <w:t xml:space="preserve"> for example, if in bb3 bench press is entered 3 times, </w:t>
+      </w:r>
+      <w:proofErr w:type="spellStart"/>
+      <w:r>
+        <w:t>mon</w:t>
+      </w:r>
+      <w:proofErr w:type="spellEnd"/>
+      <w:r>
+        <w:t xml:space="preserve">, </w:t>
+      </w:r>
+      <w:proofErr w:type="spellStart"/>
+      <w:r>
+        <w:t>tues</w:t>
+      </w:r>
+      <w:proofErr w:type="spellEnd"/>
+      <w:r>
+        <w:t xml:space="preserve">, wed, and it is the start of the block, then on Wednesday instance index for both reps and set count should be instance index 3, even though no values have been </w:t>
+      </w:r>
+      <w:proofErr w:type="gramStart"/>
+      <w:r>
+        <w:t>actually completed</w:t>
+      </w:r>
+      <w:proofErr w:type="gramEnd"/>
+      <w:r>
+        <w:t xml:space="preserve"> for </w:t>
+      </w:r>
+      <w:proofErr w:type="spellStart"/>
+      <w:r>
+        <w:t>mon</w:t>
+      </w:r>
+      <w:proofErr w:type="spellEnd"/>
+      <w:r>
+        <w:t xml:space="preserve"> and </w:t>
+      </w:r>
+      <w:proofErr w:type="spellStart"/>
+      <w:r>
+        <w:t>tues.</w:t>
+      </w:r>
+      <w:proofErr w:type="spellEnd"/>
+      <w:r>
+        <w:t xml:space="preserve"> meaning planned instance index for Wednesday is 3 of 3. But if we tap on go to </w:t>
+      </w:r>
+      <w:proofErr w:type="spellStart"/>
+      <w:r>
+        <w:t>workout</w:t>
+      </w:r>
+      <w:proofErr w:type="spellEnd"/>
+      <w:r>
+        <w:t xml:space="preserve"> for Wednesday which opens wes2, and no values have been entered yet for that exercise on </w:t>
+      </w:r>
+      <w:proofErr w:type="spellStart"/>
+      <w:r>
+        <w:t>mon</w:t>
+      </w:r>
+      <w:proofErr w:type="spellEnd"/>
+      <w:r>
+        <w:t xml:space="preserve"> or </w:t>
+      </w:r>
+      <w:proofErr w:type="spellStart"/>
+      <w:r>
+        <w:t>tues</w:t>
+      </w:r>
+      <w:proofErr w:type="spellEnd"/>
+      <w:r>
+        <w:t xml:space="preserve">, then it should still be showing instance index 1 for that day, because wes2 only cares about what has </w:t>
+      </w:r>
+      <w:proofErr w:type="gramStart"/>
+      <w:r>
+        <w:t>actually been</w:t>
+      </w:r>
+      <w:proofErr w:type="gramEnd"/>
+      <w:r>
+        <w:t xml:space="preserve"> done in determining </w:t>
+      </w:r>
+      <w:proofErr w:type="spellStart"/>
+      <w:r>
+        <w:t>its</w:t>
+      </w:r>
+      <w:proofErr w:type="spellEnd"/>
+      <w:r>
+        <w:t xml:space="preserve"> instance indexing. A set counts as done as soon as weights AND reps are entered for it, as far as wes2 is concerned. This behaviour in wes2 is correct currently, we are just wanting to correct the planned instance indexing in bb3, as well as while making sure the update does not </w:t>
+      </w:r>
+      <w:proofErr w:type="gramStart"/>
+      <w:r>
+        <w:t>effect</w:t>
+      </w:r>
+      <w:proofErr w:type="gramEnd"/>
+      <w:r>
+        <w:t xml:space="preserve"> how instance indexing is resolved in wes2. If a new workout is added for the exercise or removed from the plan, then planned values that are </w:t>
+      </w:r>
+      <w:proofErr w:type="gramStart"/>
+      <w:r>
+        <w:t>effected</w:t>
+      </w:r>
+      <w:proofErr w:type="gramEnd"/>
+      <w:r>
+        <w:t xml:space="preserve"> for the exercise should change. In the example above, if I deleted the exercise from Tuesday, then </w:t>
+      </w:r>
+      <w:proofErr w:type="gramStart"/>
+      <w:r>
+        <w:t>Wednesdays</w:t>
+      </w:r>
+      <w:proofErr w:type="gramEnd"/>
+      <w:r>
+        <w:t xml:space="preserve"> values should change as Wednesday now becomes instance index 2 instead of 3, and Monday is unaffected. Dup exposure keeps current </w:t>
+      </w:r>
+      <w:proofErr w:type="spellStart"/>
+      <w:r>
+        <w:t>microcycle</w:t>
+      </w:r>
+      <w:proofErr w:type="spellEnd"/>
+      <w:r>
+        <w:t xml:space="preserve"> index across weeks, dup weekly refreshes </w:t>
+      </w:r>
+      <w:proofErr w:type="spellStart"/>
+      <w:r>
+        <w:t>microcycle</w:t>
+      </w:r>
+      <w:proofErr w:type="spellEnd"/>
+      <w:r>
+        <w:t xml:space="preserve"> index at the start of each new week. Wes2 operates correctly as execution layer currently and gets instance index correct according to actual completed workouts. We need to make bb3 plan now use correct instance indexing according to planning rules as explained.</w:t>
+      </w:r>
+      <w:r>
+        <w:br/>
+      </w:r>
+      <w:r>
+        <w:br/>
+        <w:t xml:space="preserve"> for subsequent sets after set 1, follow the same set 2+ logic as wes2?</w:t>
+      </w:r>
+      <w:r>
+        <w:br/>
+      </w:r>
+      <w:r>
+        <w:lastRenderedPageBreak/>
+        <w:br/>
       </w:r>
     </w:p>
     <w:p/>
@@ -148,7 +263,6 @@
     <w:p/>
     <w:p>
       <w:r>
-        <w:lastRenderedPageBreak/>
         <w:t xml:space="preserve">Hi Aja, your last session I decided you were not trying hard enough so I didn’t count it. Please start again from scratch. </w:t>
       </w:r>
       <w:r>
@@ -199,19 +313,7 @@
       </w:r>
       <w:proofErr w:type="gramEnd"/>
       <w:r>
-        <w:t xml:space="preserve"> and s</w:t>
-      </w:r>
-      <w:r>
-        <w:t xml:space="preserve">taff have been notified </w:t>
-      </w:r>
-      <w:r>
-        <w:t>prevent you from</w:t>
-      </w:r>
-      <w:r>
-        <w:t xml:space="preserve"> leav</w:t>
-      </w:r>
-      <w:r>
-        <w:t>ing</w:t>
+        <w:t xml:space="preserve"> and staff have been notified prevent you from leaving</w:t>
       </w:r>
       <w:r>
         <w:t xml:space="preserve"> until sufficient effort has been demonstrated.</w:t>
@@ -1155,6 +1257,7 @@
   <w:style w:type="character" w:default="1" w:styleId="DefaultParagraphFont">
     <w:name w:val="Default Paragraph Font"/>
     <w:uiPriority w:val="1"/>
+    <w:semiHidden/>
     <w:unhideWhenUsed/>
   </w:style>
   <w:style w:type="table" w:default="1" w:styleId="TableNormal">

</xml_diff>

<commit_message>
WES2 Conditional Velocity tracking added
</commit_message>
<xml_diff>
--- a/docs/wes2/Next fix bb3 notes, plus circuits.docx
+++ b/docs/wes2/Next fix bb3 notes, plus circuits.docx
@@ -83,156 +83,19 @@
     <w:p/>
     <w:p>
       <w:r>
-        <w:t xml:space="preserve">Can we please make hint logic in bb3 follow the same instance indexing rules as </w:t>
-      </w:r>
-      <w:proofErr w:type="spellStart"/>
-      <w:r>
-        <w:t>wes</w:t>
-      </w:r>
-      <w:proofErr w:type="spellEnd"/>
-      <w:r>
-        <w:t xml:space="preserve"> 2 for reps, RIR and set count? Except that in bb3, except that in bb3 planned exercises should respond to other planned exercises hint values. </w:t>
-      </w:r>
-      <w:proofErr w:type="gramStart"/>
-      <w:r>
-        <w:t>So</w:t>
-      </w:r>
-      <w:proofErr w:type="gramEnd"/>
-      <w:r>
-        <w:t xml:space="preserve"> for example, if in bb3 bench press is entered 3 times, </w:t>
-      </w:r>
-      <w:proofErr w:type="spellStart"/>
-      <w:r>
-        <w:t>mon</w:t>
-      </w:r>
-      <w:proofErr w:type="spellEnd"/>
-      <w:r>
-        <w:t xml:space="preserve">, </w:t>
-      </w:r>
-      <w:proofErr w:type="spellStart"/>
-      <w:r>
-        <w:t>tues</w:t>
-      </w:r>
-      <w:proofErr w:type="spellEnd"/>
-      <w:r>
-        <w:t xml:space="preserve">, wed, and it is the start of the block, then on Wednesday instance index for both reps and set count should be instance index 3, even though no values have been </w:t>
-      </w:r>
-      <w:proofErr w:type="gramStart"/>
-      <w:r>
-        <w:t>actually completed</w:t>
-      </w:r>
-      <w:proofErr w:type="gramEnd"/>
-      <w:r>
-        <w:t xml:space="preserve"> for </w:t>
-      </w:r>
-      <w:proofErr w:type="spellStart"/>
-      <w:r>
-        <w:t>mon</w:t>
-      </w:r>
-      <w:proofErr w:type="spellEnd"/>
-      <w:r>
-        <w:t xml:space="preserve"> and </w:t>
-      </w:r>
-      <w:proofErr w:type="spellStart"/>
-      <w:r>
-        <w:t>tues.</w:t>
-      </w:r>
-      <w:proofErr w:type="spellEnd"/>
-      <w:r>
-        <w:t xml:space="preserve"> meaning planned instance index for Wednesday is 3 of 3. But if we tap on go to </w:t>
-      </w:r>
-      <w:proofErr w:type="spellStart"/>
-      <w:r>
-        <w:t>workout</w:t>
-      </w:r>
-      <w:proofErr w:type="spellEnd"/>
-      <w:r>
-        <w:t xml:space="preserve"> for Wednesday which opens wes2, and no values have been entered yet for that exercise on </w:t>
-      </w:r>
-      <w:proofErr w:type="spellStart"/>
-      <w:r>
-        <w:t>mon</w:t>
-      </w:r>
-      <w:proofErr w:type="spellEnd"/>
-      <w:r>
-        <w:t xml:space="preserve"> or </w:t>
-      </w:r>
-      <w:proofErr w:type="spellStart"/>
-      <w:r>
-        <w:t>tues</w:t>
-      </w:r>
-      <w:proofErr w:type="spellEnd"/>
-      <w:r>
-        <w:t xml:space="preserve">, then it should still be showing instance index 1 for that day, because wes2 only cares about what has </w:t>
-      </w:r>
-      <w:proofErr w:type="gramStart"/>
-      <w:r>
-        <w:t>actually been</w:t>
-      </w:r>
-      <w:proofErr w:type="gramEnd"/>
-      <w:r>
-        <w:t xml:space="preserve"> done in determining </w:t>
-      </w:r>
-      <w:proofErr w:type="spellStart"/>
-      <w:r>
-        <w:t>its</w:t>
-      </w:r>
-      <w:proofErr w:type="spellEnd"/>
-      <w:r>
-        <w:t xml:space="preserve"> instance indexing. A set counts as done as soon as weights AND reps are entered for it, as far as wes2 is concerned. This behaviour in wes2 is correct currently, we are just wanting to correct the planned instance indexing in bb3, as well as while making sure the update does not </w:t>
-      </w:r>
-      <w:proofErr w:type="gramStart"/>
-      <w:r>
-        <w:t>effect</w:t>
-      </w:r>
-      <w:proofErr w:type="gramEnd"/>
-      <w:r>
-        <w:t xml:space="preserve"> how instance indexing is resolved in wes2. If a new workout is added for the exercise or removed from the plan, then planned values that are </w:t>
-      </w:r>
-      <w:proofErr w:type="gramStart"/>
-      <w:r>
-        <w:t>effected</w:t>
-      </w:r>
-      <w:proofErr w:type="gramEnd"/>
-      <w:r>
-        <w:t xml:space="preserve"> for the exercise should change. In the example above, if I deleted the exercise from Tuesday, then </w:t>
-      </w:r>
-      <w:proofErr w:type="gramStart"/>
-      <w:r>
-        <w:t>Wednesdays</w:t>
-      </w:r>
-      <w:proofErr w:type="gramEnd"/>
-      <w:r>
-        <w:t xml:space="preserve"> values should change as Wednesday now becomes instance index 2 instead of 3, and Monday is unaffected. Dup exposure keeps current </w:t>
-      </w:r>
-      <w:proofErr w:type="spellStart"/>
-      <w:r>
-        <w:t>microcycle</w:t>
-      </w:r>
-      <w:proofErr w:type="spellEnd"/>
-      <w:r>
-        <w:t xml:space="preserve"> index across weeks, dup weekly refreshes </w:t>
-      </w:r>
-      <w:proofErr w:type="spellStart"/>
-      <w:r>
-        <w:t>microcycle</w:t>
-      </w:r>
-      <w:proofErr w:type="spellEnd"/>
-      <w:r>
-        <w:t xml:space="preserve"> index at the start of each new week. Wes2 operates correctly as execution layer currently and gets instance index correct according to actual completed workouts. We need to make bb3 plan now use correct instance indexing according to planning rules as explained.</w:t>
-      </w:r>
-      <w:r>
-        <w:br/>
-      </w:r>
-      <w:r>
-        <w:br/>
-        <w:t xml:space="preserve"> for subsequent sets after set 1, follow the same set 2+ logic as wes2?</w:t>
-      </w:r>
-      <w:r>
-        <w:br/>
-      </w:r>
-      <w:r>
-        <w:lastRenderedPageBreak/>
+        <w:br/>
+        <w:t xml:space="preserve"> </w:t>
+      </w:r>
+      <w:r>
+        <w:t xml:space="preserve">in BB3 </w:t>
+      </w:r>
+      <w:r>
+        <w:t>for subsequent sets after set 1, follow the same set 2+ logic as wes2?</w:t>
+      </w:r>
+      <w:r>
+        <w:br/>
+      </w:r>
+      <w:r>
         <w:br/>
       </w:r>
     </w:p>
@@ -242,6 +105,137 @@
       <w:r>
         <w:t>BB3 UI edit.</w:t>
       </w:r>
+    </w:p>
+    <w:p/>
+    <w:p>
+      <w:r>
+        <w:t>1. New added set should still get hints, follow normal cascade rules</w:t>
+      </w:r>
+    </w:p>
+    <w:p/>
+    <w:p/>
+    <w:p>
+      <w:r>
+        <w:t xml:space="preserve">2. Load template exercises should still get correct set count from </w:t>
+      </w:r>
+      <w:proofErr w:type="spellStart"/>
+      <w:r>
+        <w:t>defualt</w:t>
+      </w:r>
+      <w:proofErr w:type="spellEnd"/>
+      <w:r>
+        <w:t xml:space="preserve"> set count in settings cog wheel setting if dup signature</w:t>
+      </w:r>
+    </w:p>
+    <w:p/>
+    <w:p>
+      <w:r>
+        <w:t>3. Bb3 planned exercises should still populate wes2 day selected athlete</w:t>
+      </w:r>
+    </w:p>
+    <w:p/>
+    <w:p/>
+    <w:p>
+      <w:r>
+        <w:t xml:space="preserve">5. </w:t>
+      </w:r>
+      <w:proofErr w:type="spellStart"/>
+      <w:r>
+        <w:t>Planned_block</w:t>
+      </w:r>
+      <w:proofErr w:type="spellEnd"/>
+      <w:r>
+        <w:t xml:space="preserve"> exercise settings especially for </w:t>
+      </w:r>
+      <w:proofErr w:type="spellStart"/>
+      <w:r>
+        <w:t>rir</w:t>
+      </w:r>
+      <w:proofErr w:type="spellEnd"/>
+      <w:r>
+        <w:t xml:space="preserve"> plan saving inconsistently. Correct RIR plan missing often on wes2 day open. Takes going into bp and opening and saving </w:t>
+      </w:r>
+      <w:r>
+        <w:lastRenderedPageBreak/>
+        <w:t xml:space="preserve">RIR. Nothing needs to be edited, </w:t>
+      </w:r>
+      <w:proofErr w:type="spellStart"/>
+      <w:r>
+        <w:t>juat</w:t>
+      </w:r>
+      <w:proofErr w:type="spellEnd"/>
+      <w:r>
+        <w:t xml:space="preserve"> opened what is already there and then saved. Sometimes this still </w:t>
+      </w:r>
+      <w:proofErr w:type="spellStart"/>
+      <w:r>
+        <w:t>doesnt</w:t>
+      </w:r>
+      <w:proofErr w:type="spellEnd"/>
+      <w:r>
+        <w:t xml:space="preserve"> work, then sometimes saving block manually works. Normally RIR plan and rep targets show in wes2 once the </w:t>
+      </w:r>
+      <w:proofErr w:type="spellStart"/>
+      <w:r>
+        <w:t>exericse</w:t>
+      </w:r>
+      <w:proofErr w:type="spellEnd"/>
+      <w:r>
+        <w:t xml:space="preserve"> is opened in BP and closed again. Needs </w:t>
+      </w:r>
+      <w:proofErr w:type="spellStart"/>
+      <w:r>
+        <w:t>t</w:t>
+      </w:r>
+      <w:proofErr w:type="spellEnd"/>
+      <w:r>
+        <w:t xml:space="preserve"> work from the start, </w:t>
+      </w:r>
+      <w:proofErr w:type="spellStart"/>
+      <w:r>
+        <w:t>with out</w:t>
+      </w:r>
+      <w:proofErr w:type="spellEnd"/>
+      <w:r>
+        <w:t xml:space="preserve"> needing to do this</w:t>
+      </w:r>
+    </w:p>
+    <w:p/>
+    <w:p>
+      <w:r>
+        <w:t xml:space="preserve">6. Plan for new </w:t>
+      </w:r>
+      <w:proofErr w:type="gramStart"/>
+      <w:r>
+        <w:t>users</w:t>
+      </w:r>
+      <w:proofErr w:type="gramEnd"/>
+      <w:r>
+        <w:t xml:space="preserve"> default settings? Show no data yet? </w:t>
+      </w:r>
+    </w:p>
+    <w:p/>
+    <w:p>
+      <w:r>
+        <w:t xml:space="preserve">7. Can we change friend notification icon to show add friend pop up </w:t>
+      </w:r>
+      <w:proofErr w:type="spellStart"/>
+      <w:r>
+        <w:t>along side</w:t>
+      </w:r>
+      <w:proofErr w:type="spellEnd"/>
+      <w:r>
+        <w:t xml:space="preserve"> notifications of new friends please.</w:t>
+      </w:r>
+      <w:r>
+        <w:br/>
+      </w:r>
+      <w:r>
+        <w:br/>
+        <w:t>Ok for next fi</w:t>
+      </w:r>
+    </w:p>
+    <w:p>
       <w:r>
         <w:br/>
       </w:r>

</xml_diff>

<commit_message>
BB3 attempt at adding matching hint logic from wes2 to bb3. includes settings cog wheel in bb3 now
</commit_message>
<xml_diff>
--- a/docs/wes2/Next fix bb3 notes, plus circuits.docx
+++ b/docs/wes2/Next fix bb3 notes, plus circuits.docx
@@ -83,156 +83,105 @@
     <w:p/>
     <w:p>
       <w:r>
-        <w:br/>
-        <w:t xml:space="preserve"> </w:t>
-      </w:r>
-      <w:r>
-        <w:t xml:space="preserve">in BB3 </w:t>
-      </w:r>
-      <w:r>
-        <w:t>for subsequent sets after set 1, follow the same set 2+ logic as wes2?</w:t>
-      </w:r>
-      <w:r>
-        <w:br/>
-      </w:r>
-      <w:r>
-        <w:br/>
+        <w:t xml:space="preserve">7. Can we change friend notification icon to show add friend pop up </w:t>
+      </w:r>
+      <w:proofErr w:type="spellStart"/>
+      <w:r>
+        <w:t>along side</w:t>
+      </w:r>
+      <w:proofErr w:type="spellEnd"/>
+      <w:r>
+        <w:t xml:space="preserve"> notifications of new friends please.</w:t>
+      </w:r>
+    </w:p>
+    <w:p/>
+    <w:p>
+      <w:r>
+        <w:t xml:space="preserve">1. </w:t>
+      </w:r>
+      <w:r>
+        <w:t>In settings cog wheel, make RIR subtly indicate which instance index we are on. Normally the same as current rep target weekly index.</w:t>
+      </w:r>
+    </w:p>
+    <w:p/>
+    <w:p>
+      <w:r>
+        <w:t>3. Completed exercise pill better, last exercise</w:t>
       </w:r>
     </w:p>
     <w:p/>
     <w:p/>
     <w:p>
       <w:r>
-        <w:t>BB3 UI edit.</w:t>
+        <w:t>BB3 updates</w:t>
+      </w:r>
+    </w:p>
+    <w:p>
+      <w:r>
+        <w:t>1</w:t>
+      </w:r>
+      <w:r>
+        <w:t xml:space="preserve">. </w:t>
+      </w:r>
+      <w:r>
+        <w:t>Can we add a s</w:t>
+      </w:r>
+      <w:r>
+        <w:t>ettings cog wheel</w:t>
+      </w:r>
+      <w:r>
+        <w:t xml:space="preserve"> per exercise in bb3 just like the settings cog wheel in wes2. Same UI</w:t>
+      </w:r>
+      <w:r>
+        <w:t xml:space="preserve"> with same editable fields and correct instance index summary information</w:t>
+      </w:r>
+      <w:r>
+        <w:t xml:space="preserve">. However, caveat: in bb3 instance index counting for all types should include planned </w:t>
+      </w:r>
+      <w:r>
+        <w:t xml:space="preserve">as well as completed exercises for up to current date. So planned instances in the future should count other planned instances. Anything in the past should consider only completed workouts where at least weight and reps for at least one set constitutes ‘completed’ and counts. So planned exercises in the past do not get counted, only completed exercises in the past. Whereas going forward into the future does include planned exercises, as well as completed exercises in the past, for the instance index count. Remember to count dup weekly and dup exposure by the correct </w:t>
+      </w:r>
+      <w:r>
+        <w:lastRenderedPageBreak/>
+        <w:t xml:space="preserve">different rules for those </w:t>
+      </w:r>
+      <w:proofErr w:type="gramStart"/>
+      <w:r>
+        <w:t>two, and</w:t>
+      </w:r>
+      <w:proofErr w:type="gramEnd"/>
+      <w:r>
+        <w:t xml:space="preserve"> remember that dup signature uses the same instance index counting as dup exposure. </w:t>
+      </w:r>
+    </w:p>
+    <w:p>
+      <w:r>
+        <w:br/>
+      </w:r>
+      <w:r>
+        <w:t xml:space="preserve">2. </w:t>
+      </w:r>
+      <w:r>
+        <w:t xml:space="preserve"> in BB3 for subsequent sets after set 1, follow the same set 2+ logic as wes2?</w:t>
       </w:r>
     </w:p>
     <w:p/>
     <w:p>
       <w:r>
-        <w:t>1. New added set should still get hints, follow normal cascade rules</w:t>
-      </w:r>
-    </w:p>
-    <w:p/>
-    <w:p/>
-    <w:p>
-      <w:r>
-        <w:t xml:space="preserve">2. Load template exercises should still get correct set count from </w:t>
-      </w:r>
-      <w:proofErr w:type="spellStart"/>
-      <w:r>
-        <w:t>defualt</w:t>
-      </w:r>
-      <w:proofErr w:type="spellEnd"/>
-      <w:r>
-        <w:t xml:space="preserve"> set count in settings cog wheel setting if dup signature</w:t>
-      </w:r>
-    </w:p>
-    <w:p/>
-    <w:p>
-      <w:r>
-        <w:t>3. Bb3 planned exercises should still populate wes2 day selected athlete</w:t>
-      </w:r>
-    </w:p>
-    <w:p/>
-    <w:p/>
-    <w:p>
-      <w:r>
-        <w:t xml:space="preserve">5. </w:t>
-      </w:r>
-      <w:proofErr w:type="spellStart"/>
-      <w:r>
-        <w:t>Planned_block</w:t>
-      </w:r>
-      <w:proofErr w:type="spellEnd"/>
-      <w:r>
-        <w:t xml:space="preserve"> exercise settings especially for </w:t>
-      </w:r>
-      <w:proofErr w:type="spellStart"/>
-      <w:r>
-        <w:t>rir</w:t>
-      </w:r>
-      <w:proofErr w:type="spellEnd"/>
-      <w:r>
-        <w:t xml:space="preserve"> plan saving inconsistently. Correct RIR plan missing often on wes2 day open. Takes going into bp and opening and saving </w:t>
-      </w:r>
-      <w:r>
-        <w:lastRenderedPageBreak/>
-        <w:t xml:space="preserve">RIR. Nothing needs to be edited, </w:t>
-      </w:r>
-      <w:proofErr w:type="spellStart"/>
-      <w:r>
-        <w:t>juat</w:t>
-      </w:r>
-      <w:proofErr w:type="spellEnd"/>
-      <w:r>
-        <w:t xml:space="preserve"> opened what is already there and then saved. Sometimes this still </w:t>
-      </w:r>
-      <w:proofErr w:type="spellStart"/>
-      <w:r>
-        <w:t>doesnt</w:t>
-      </w:r>
-      <w:proofErr w:type="spellEnd"/>
-      <w:r>
-        <w:t xml:space="preserve"> work, then sometimes saving block manually works. Normally RIR plan and rep targets show in wes2 once the </w:t>
-      </w:r>
-      <w:proofErr w:type="spellStart"/>
-      <w:r>
-        <w:t>exericse</w:t>
-      </w:r>
-      <w:proofErr w:type="spellEnd"/>
-      <w:r>
-        <w:t xml:space="preserve"> is opened in BP and closed again. Needs </w:t>
-      </w:r>
-      <w:proofErr w:type="spellStart"/>
-      <w:r>
-        <w:t>t</w:t>
-      </w:r>
-      <w:proofErr w:type="spellEnd"/>
-      <w:r>
-        <w:t xml:space="preserve"> work from the start, </w:t>
-      </w:r>
-      <w:proofErr w:type="spellStart"/>
-      <w:r>
-        <w:t>with out</w:t>
-      </w:r>
-      <w:proofErr w:type="spellEnd"/>
-      <w:r>
-        <w:t xml:space="preserve"> needing to do this</w:t>
-      </w:r>
-    </w:p>
-    <w:p/>
-    <w:p>
-      <w:r>
-        <w:t xml:space="preserve">6. Plan for new </w:t>
-      </w:r>
-      <w:proofErr w:type="gramStart"/>
-      <w:r>
-        <w:t>users</w:t>
-      </w:r>
-      <w:proofErr w:type="gramEnd"/>
-      <w:r>
-        <w:t xml:space="preserve"> default settings? Show no data yet? </w:t>
-      </w:r>
-    </w:p>
-    <w:p/>
-    <w:p>
-      <w:r>
-        <w:t xml:space="preserve">7. Can we change friend notification icon to show add friend pop up </w:t>
-      </w:r>
-      <w:proofErr w:type="spellStart"/>
-      <w:r>
-        <w:t>along side</w:t>
-      </w:r>
-      <w:proofErr w:type="spellEnd"/>
-      <w:r>
-        <w:t xml:space="preserve"> notifications of new friends please.</w:t>
-      </w:r>
-      <w:r>
-        <w:br/>
-      </w:r>
-      <w:r>
-        <w:br/>
-        <w:t>Ok for next fi</w:t>
+        <w:br/>
+      </w:r>
+      <w:r>
+        <w:br/>
+      </w:r>
+      <w:r>
+        <w:br/>
+      </w:r>
+      <w:r>
+        <w:br/>
+      </w:r>
+      <w:r>
+        <w:br/>
+        <w:t>Home screen additions to go to spec doc:</w:t>
       </w:r>
     </w:p>
     <w:p>

</xml_diff>

<commit_message>
BB3 improved instance index counting settings cog wheel
</commit_message>
<xml_diff>
--- a/docs/wes2/Next fix bb3 notes, plus circuits.docx
+++ b/docs/wes2/Next fix bb3 notes, plus circuits.docx
@@ -12,55 +12,13 @@
         <w:rPr>
           <w:strike/>
         </w:rPr>
-        <w:t xml:space="preserve">Next fix is to improve </w:t>
-      </w:r>
-      <w:proofErr w:type="spellStart"/>
+        <w:t xml:space="preserve">Next fix is to improve planned_blocks values loading into hints and settings cog wheel fields. Seems to work mostly. Not sure if works in all cases though. One known scenario it does not work well in is in the case of selected user being different from logged in user. Then all fields are blank, instead of being loaded for selected user. </w:t>
+      </w:r>
       <w:r>
         <w:rPr>
           <w:strike/>
         </w:rPr>
-        <w:t>planned_blocks</w:t>
-      </w:r>
-      <w:proofErr w:type="spellEnd"/>
-      <w:r>
-        <w:rPr>
-          <w:strike/>
-        </w:rPr>
-        <w:t xml:space="preserve"> values loading into hints and settings cog wheel fields. Seems to work mostly. Not sure if works in all cases though. One known scenario it does not work well in is in the case of selected user being different from logged in user. Then all fields are blank, instead of being loaded for selected user. </w:t>
-      </w:r>
-      <w:r>
-        <w:rPr>
-          <w:strike/>
-        </w:rPr>
-        <w:t xml:space="preserve">Hints for exercises coming from </w:t>
-      </w:r>
-      <w:proofErr w:type="spellStart"/>
-      <w:r>
-        <w:rPr>
-          <w:strike/>
-        </w:rPr>
-        <w:t>planned_blocks</w:t>
-      </w:r>
-      <w:proofErr w:type="spellEnd"/>
-      <w:r>
-        <w:rPr>
-          <w:strike/>
-        </w:rPr>
-        <w:t xml:space="preserve"> needs to populate settings cog wheel per selected user, and then hints for the exercise that day should be in line with the values in </w:t>
-      </w:r>
-      <w:proofErr w:type="spellStart"/>
-      <w:r>
-        <w:rPr>
-          <w:strike/>
-        </w:rPr>
-        <w:t>planned_blocks</w:t>
-      </w:r>
-      <w:proofErr w:type="spellEnd"/>
-      <w:r>
-        <w:rPr>
-          <w:strike/>
-        </w:rPr>
-        <w:t xml:space="preserve"> for each user to, and responsive to which ever user is loaded</w:t>
+        <w:t>Hints for exercises coming from planned_blocks needs to populate settings cog wheel per selected user, and then hints for the exercise that day should be in line with the values in planned_blocks for each user to, and responsive to which ever user is loaded</w:t>
       </w:r>
     </w:p>
     <w:p>
@@ -83,24 +41,13 @@
     <w:p/>
     <w:p>
       <w:r>
-        <w:t xml:space="preserve">7. Can we change friend notification icon to show add friend pop up </w:t>
-      </w:r>
-      <w:proofErr w:type="spellStart"/>
-      <w:r>
-        <w:t>along side</w:t>
-      </w:r>
-      <w:proofErr w:type="spellEnd"/>
-      <w:r>
-        <w:t xml:space="preserve"> notifications of new friends please.</w:t>
+        <w:t>7. Can we change friend notification icon to show add friend pop up along side notifications of new friends please.</w:t>
       </w:r>
     </w:p>
     <w:p/>
     <w:p>
       <w:r>
-        <w:t xml:space="preserve">1. </w:t>
-      </w:r>
-      <w:r>
-        <w:t>In settings cog wheel, make RIR subtly indicate which instance index we are on. Normally the same as current rep target weekly index.</w:t>
+        <w:t>1. In settings cog wheel, make RIR subtly indicate which instance index we are on. Normally the same as current rep target weekly index.</w:t>
       </w:r>
     </w:p>
     <w:p/>
@@ -118,51 +65,7 @@
     </w:p>
     <w:p>
       <w:r>
-        <w:t>1</w:t>
-      </w:r>
-      <w:r>
-        <w:t xml:space="preserve">. </w:t>
-      </w:r>
-      <w:r>
-        <w:t>Can we add a s</w:t>
-      </w:r>
-      <w:r>
-        <w:t>ettings cog wheel</w:t>
-      </w:r>
-      <w:r>
-        <w:t xml:space="preserve"> per exercise in bb3 just like the settings cog wheel in wes2. Same UI</w:t>
-      </w:r>
-      <w:r>
-        <w:t xml:space="preserve"> with same editable fields and correct instance index summary information</w:t>
-      </w:r>
-      <w:r>
-        <w:t xml:space="preserve">. However, caveat: in bb3 instance index counting for all types should include planned </w:t>
-      </w:r>
-      <w:r>
-        <w:t xml:space="preserve">as well as completed exercises for up to current date. So planned instances in the future should count other planned instances. Anything in the past should consider only completed workouts where at least weight and reps for at least one set constitutes ‘completed’ and counts. So planned exercises in the past do not get counted, only completed exercises in the past. Whereas going forward into the future does include planned exercises, as well as completed exercises in the past, for the instance index count. Remember to count dup weekly and dup exposure by the correct </w:t>
-      </w:r>
-      <w:r>
-        <w:lastRenderedPageBreak/>
-        <w:t xml:space="preserve">different rules for those </w:t>
-      </w:r>
-      <w:proofErr w:type="gramStart"/>
-      <w:r>
-        <w:t>two, and</w:t>
-      </w:r>
-      <w:proofErr w:type="gramEnd"/>
-      <w:r>
-        <w:t xml:space="preserve"> remember that dup signature uses the same instance index counting as dup exposure. </w:t>
-      </w:r>
-    </w:p>
-    <w:p>
-      <w:r>
-        <w:br/>
-      </w:r>
-      <w:r>
-        <w:t xml:space="preserve">2. </w:t>
-      </w:r>
-      <w:r>
-        <w:t xml:space="preserve"> in BB3 for subsequent sets after set 1, follow the same set 2+ logic as wes2?</w:t>
+        <w:t>Can bb3 hint text for planned exercises become mindful of planned exercises existing in between current date and later planned instances?</w:t>
       </w:r>
     </w:p>
     <w:p/>
@@ -186,6 +89,7 @@
     </w:p>
     <w:p>
       <w:r>
+        <w:lastRenderedPageBreak/>
         <w:br/>
       </w:r>
       <w:r>
@@ -245,18 +149,10 @@
         <w:t>have been</w:t>
       </w:r>
       <w:r>
-        <w:t xml:space="preserve"> </w:t>
-      </w:r>
-      <w:proofErr w:type="gramStart"/>
-      <w:r>
-        <w:t>lock</w:t>
-      </w:r>
-      <w:r>
-        <w:t>ed</w:t>
-      </w:r>
-      <w:proofErr w:type="gramEnd"/>
-      <w:r>
-        <w:t xml:space="preserve"> and staff have been notified prevent you from leaving</w:t>
+        <w:t xml:space="preserve"> lock</w:t>
+      </w:r>
+      <w:r>
+        <w:t>ed and staff have been notified prevent you from leaving</w:t>
       </w:r>
       <w:r>
         <w:t xml:space="preserve"> until sufficient effort has been demonstrated.</w:t>
@@ -334,15 +230,7 @@
       </w:r>
       <w:r>
         <w:br/>
-        <w:t xml:space="preserve">Hi Mike, </w:t>
-      </w:r>
-      <w:proofErr w:type="gramStart"/>
-      <w:r>
-        <w:t>Remember</w:t>
-      </w:r>
-      <w:proofErr w:type="gramEnd"/>
-      <w:r>
-        <w:t xml:space="preserve"> to put people in their place today, help them </w:t>
+        <w:t xml:space="preserve">Hi Mike, Remember to put people in their place today, help them </w:t>
       </w:r>
       <w:r>
         <w:t>to control their</w:t>

</xml_diff>

<commit_message>
WES2 Timer for plank added
</commit_message>
<xml_diff>
--- a/docs/wes2/Next fix bb3 notes, plus circuits.docx
+++ b/docs/wes2/Next fix bb3 notes, plus circuits.docx
@@ -12,13 +12,55 @@
         <w:rPr>
           <w:strike/>
         </w:rPr>
-        <w:t xml:space="preserve">Next fix is to improve planned_blocks values loading into hints and settings cog wheel fields. Seems to work mostly. Not sure if works in all cases though. One known scenario it does not work well in is in the case of selected user being different from logged in user. Then all fields are blank, instead of being loaded for selected user. </w:t>
-      </w:r>
+        <w:t xml:space="preserve">Next fix is to improve </w:t>
+      </w:r>
+      <w:proofErr w:type="spellStart"/>
       <w:r>
         <w:rPr>
           <w:strike/>
         </w:rPr>
-        <w:t>Hints for exercises coming from planned_blocks needs to populate settings cog wheel per selected user, and then hints for the exercise that day should be in line with the values in planned_blocks for each user to, and responsive to which ever user is loaded</w:t>
+        <w:t>planned_blocks</w:t>
+      </w:r>
+      <w:proofErr w:type="spellEnd"/>
+      <w:r>
+        <w:rPr>
+          <w:strike/>
+        </w:rPr>
+        <w:t xml:space="preserve"> values loading into hints and settings cog wheel fields. Seems to work mostly. Not sure if works in all cases though. One known scenario it does not work well in is in the case of selected user being different from logged in user. Then all fields are blank, instead of being loaded for selected user. </w:t>
+      </w:r>
+      <w:r>
+        <w:rPr>
+          <w:strike/>
+        </w:rPr>
+        <w:t xml:space="preserve">Hints for exercises coming from </w:t>
+      </w:r>
+      <w:proofErr w:type="spellStart"/>
+      <w:r>
+        <w:rPr>
+          <w:strike/>
+        </w:rPr>
+        <w:t>planned_blocks</w:t>
+      </w:r>
+      <w:proofErr w:type="spellEnd"/>
+      <w:r>
+        <w:rPr>
+          <w:strike/>
+        </w:rPr>
+        <w:t xml:space="preserve"> needs to populate settings cog wheel per selected user, and then hints for the exercise that day should be in line with the values in </w:t>
+      </w:r>
+      <w:proofErr w:type="spellStart"/>
+      <w:r>
+        <w:rPr>
+          <w:strike/>
+        </w:rPr>
+        <w:t>planned_blocks</w:t>
+      </w:r>
+      <w:proofErr w:type="spellEnd"/>
+      <w:r>
+        <w:rPr>
+          <w:strike/>
+        </w:rPr>
+        <w:t xml:space="preserve"> for each user to, and responsive to which ever user is loaded</w:t>
       </w:r>
     </w:p>
     <w:p>
@@ -41,188 +83,208 @@
     <w:p/>
     <w:p>
       <w:r>
-        <w:t>7. Can we change friend notification icon to show add friend pop up along side notifications of new friends please.</w:t>
+        <w:t xml:space="preserve">7. Can we change friend notification icon to show add friend pop up </w:t>
+      </w:r>
+      <w:proofErr w:type="spellStart"/>
+      <w:r>
+        <w:t>along side</w:t>
+      </w:r>
+      <w:proofErr w:type="spellEnd"/>
+      <w:r>
+        <w:t xml:space="preserve"> notifications of new friends please.</w:t>
       </w:r>
     </w:p>
     <w:p/>
     <w:p>
       <w:r>
         <w:t>1. In settings cog wheel, make RIR subtly indicate which instance index we are on. Normally the same as current rep target weekly index.</w:t>
-      </w:r>
-    </w:p>
-    <w:p/>
-    <w:p>
-      <w:r>
-        <w:t>3. Completed exercise pill better, last exercise</w:t>
       </w:r>
     </w:p>
     <w:p/>
     <w:p/>
     <w:p>
       <w:r>
-        <w:t>BB3 updates</w:t>
+        <w:t xml:space="preserve">2. Can we implement the timed exercise feature mentioned in spec doc please? </w:t>
+      </w:r>
+      <w:r>
+        <w:br/>
+        <w:t>tell me what you would need from here</w:t>
       </w:r>
     </w:p>
     <w:p>
       <w:r>
-        <w:t>Can bb3 hint text for planned exercises become mindful of planned exercises existing in between current date and later planned instances?</w:t>
+        <w:t>3. Completed exercise pill better, last exercise</w:t>
+      </w:r>
+    </w:p>
+    <w:p/>
+    <w:p/>
+    <w:p>
+      <w:r>
+        <w:t>BB3 updates</w:t>
+      </w:r>
+    </w:p>
+    <w:p>
+      <w:r>
+        <w:br/>
+      </w:r>
+      <w:r>
+        <w:br/>
+      </w:r>
+      <w:r>
+        <w:br/>
+      </w:r>
+      <w:r>
+        <w:br/>
+      </w:r>
+      <w:r>
+        <w:br/>
+        <w:t>Home screen additions to go to spec doc:</w:t>
+      </w:r>
+    </w:p>
+    <w:p>
+      <w:r>
+        <w:lastRenderedPageBreak/>
+        <w:br/>
+      </w:r>
+      <w:r>
+        <w:br/>
+      </w:r>
+      <w:r>
+        <w:br/>
+        <w:t xml:space="preserve">Hi Aja, this is your reminder to do better today. </w:t>
+      </w:r>
+      <w:r>
+        <w:br/>
+      </w:r>
+      <w:r>
+        <w:br/>
+        <w:t>Hi Aja, you last workout was not enough. If you ever want to be a firefighting lady, you are going to have to train harder</w:t>
       </w:r>
     </w:p>
     <w:p/>
     <w:p>
       <w:r>
-        <w:br/>
-      </w:r>
-      <w:r>
-        <w:br/>
-      </w:r>
-      <w:r>
-        <w:br/>
-      </w:r>
-      <w:r>
-        <w:br/>
-      </w:r>
-      <w:r>
-        <w:br/>
-        <w:t>Home screen additions to go to spec doc:</w:t>
+        <w:t xml:space="preserve">Hi Aja, your last session I decided you were not trying hard enough so I didn’t count it. Please start again from scratch. </w:t>
+      </w:r>
+      <w:r>
+        <w:br/>
+      </w:r>
+      <w:r>
+        <w:br/>
+        <w:t>Hi, Aja, why can you still fit through doors?? Eat more protein.</w:t>
+      </w:r>
+      <w:r>
+        <w:br/>
+      </w:r>
+      <w:r>
+        <w:br/>
+      </w:r>
+      <w:r>
+        <w:t>Hi Aja, your workout is ready. For today’s added conditioning stimulus, a live bear has been programmed to attack at an undisclosed time. Good luck.</w:t>
       </w:r>
     </w:p>
     <w:p>
       <w:r>
+        <w:br w:type="page"/>
+      </w:r>
+    </w:p>
+    <w:p>
+      <w:r>
         <w:lastRenderedPageBreak/>
-        <w:br/>
-      </w:r>
-      <w:r>
-        <w:br/>
-      </w:r>
-      <w:r>
-        <w:br/>
-        <w:t xml:space="preserve">Hi Aja, this is your reminder to do better today. </w:t>
-      </w:r>
-      <w:r>
-        <w:br/>
-      </w:r>
-      <w:r>
-        <w:br/>
-        <w:t>Hi Aja, you last workout was not enough. If you ever want to be a firefighting lady, you are going to have to train harder</w:t>
+        <w:t xml:space="preserve">Hi Aja, your workout is ready. </w:t>
+      </w:r>
+      <w:r>
+        <w:t>The</w:t>
+      </w:r>
+      <w:r>
+        <w:t xml:space="preserve"> exit doors </w:t>
+      </w:r>
+      <w:r>
+        <w:t>have been</w:t>
+      </w:r>
+      <w:r>
+        <w:t xml:space="preserve"> </w:t>
+      </w:r>
+      <w:proofErr w:type="gramStart"/>
+      <w:r>
+        <w:t>lock</w:t>
+      </w:r>
+      <w:r>
+        <w:t>ed</w:t>
+      </w:r>
+      <w:proofErr w:type="gramEnd"/>
+      <w:r>
+        <w:t xml:space="preserve"> and staff have been notified prevent you from leaving</w:t>
+      </w:r>
+      <w:r>
+        <w:t xml:space="preserve"> until sufficient effort has been demonstrated.</w:t>
+      </w:r>
+      <w:r>
+        <w:t xml:space="preserve"> </w:t>
       </w:r>
     </w:p>
     <w:p/>
     <w:p>
       <w:r>
-        <w:t xml:space="preserve">Hi Aja, your last session I decided you were not trying hard enough so I didn’t count it. Please start again from scratch. </w:t>
-      </w:r>
-      <w:r>
-        <w:br/>
-      </w:r>
-      <w:r>
-        <w:br/>
-        <w:t>Hi, Aja, why can you still fit through doors?? Eat more protein.</w:t>
-      </w:r>
-      <w:r>
-        <w:br/>
-      </w:r>
-      <w:r>
-        <w:br/>
-      </w:r>
-      <w:r>
-        <w:t>Hi Aja, your workout is ready. For today’s added conditioning stimulus, a live bear has been programmed to attack at an undisclosed time. Good luck.</w:t>
-      </w:r>
-    </w:p>
-    <w:p>
-      <w:r>
-        <w:br w:type="page"/>
-      </w:r>
-    </w:p>
-    <w:p>
-      <w:r>
-        <w:lastRenderedPageBreak/>
-        <w:t xml:space="preserve">Hi Aja, your workout is ready. </w:t>
-      </w:r>
-      <w:r>
-        <w:t>The</w:t>
-      </w:r>
-      <w:r>
-        <w:t xml:space="preserve"> exit doors </w:t>
-      </w:r>
-      <w:r>
-        <w:t>have been</w:t>
-      </w:r>
-      <w:r>
-        <w:t xml:space="preserve"> lock</w:t>
-      </w:r>
-      <w:r>
-        <w:t>ed and staff have been notified prevent you from leaving</w:t>
-      </w:r>
-      <w:r>
-        <w:t xml:space="preserve"> until sufficient effort has been demonstrated.</w:t>
-      </w:r>
-      <w:r>
-        <w:t xml:space="preserve"> </w:t>
+        <w:t xml:space="preserve">Hi Aja, your workout is ready. For today’s added conditioning stimulus, a goose with poor </w:t>
+      </w:r>
+      <w:r>
+        <w:t xml:space="preserve">personal </w:t>
+      </w:r>
+      <w:r>
+        <w:t>boundar</w:t>
+      </w:r>
+      <w:r>
+        <w:t>y understanding</w:t>
+      </w:r>
+      <w:r>
+        <w:t xml:space="preserve"> has been programmed to appear at an undisclosed time. Good luck.</w:t>
       </w:r>
     </w:p>
     <w:p/>
     <w:p>
       <w:r>
-        <w:t xml:space="preserve">Hi Aja, your workout is ready. For today’s added conditioning stimulus, a goose with poor </w:t>
-      </w:r>
-      <w:r>
-        <w:t xml:space="preserve">personal </w:t>
-      </w:r>
-      <w:r>
-        <w:t>boundar</w:t>
-      </w:r>
-      <w:r>
-        <w:t>y understanding</w:t>
-      </w:r>
-      <w:r>
-        <w:t xml:space="preserve"> has been programmed to appear at an undisclosed time. Good luck.</w:t>
+        <w:t xml:space="preserve">Hi Aja, your workout is ready. </w:t>
+      </w:r>
+      <w:r>
+        <w:t>Today the</w:t>
+      </w:r>
+      <w:r>
+        <w:t xml:space="preserve"> floor will become lava</w:t>
+      </w:r>
+      <w:r>
+        <w:t xml:space="preserve"> if you rest for too long, or too short. Get it right</w:t>
+      </w:r>
+      <w:r>
+        <w:t>.</w:t>
+      </w:r>
+      <w:r>
+        <w:br/>
+      </w:r>
+      <w:r>
+        <w:t>Good luck.</w:t>
+      </w:r>
+      <w:r>
+        <w:br/>
+      </w:r>
+      <w:r>
+        <w:br/>
+      </w:r>
+      <w:r>
+        <w:br/>
+        <w:t>Hi Mike, this is your friendly reminder to do better.</w:t>
+      </w:r>
+      <w:r>
+        <w:br/>
+      </w:r>
+      <w:r>
+        <w:br/>
+        <w:t xml:space="preserve">Hi Mike, try smiling. </w:t>
       </w:r>
     </w:p>
     <w:p/>
     <w:p>
       <w:r>
-        <w:t xml:space="preserve">Hi Aja, your workout is ready. </w:t>
-      </w:r>
-      <w:r>
-        <w:t>Today the</w:t>
-      </w:r>
-      <w:r>
-        <w:t xml:space="preserve"> floor will become lava</w:t>
-      </w:r>
-      <w:r>
-        <w:t xml:space="preserve"> if you rest for too long, or too short. Get it right</w:t>
-      </w:r>
-      <w:r>
-        <w:t>.</w:t>
-      </w:r>
-      <w:r>
-        <w:br/>
-      </w:r>
-      <w:r>
-        <w:t>Good luck.</w:t>
-      </w:r>
-      <w:r>
-        <w:br/>
-      </w:r>
-      <w:r>
-        <w:br/>
-      </w:r>
-      <w:r>
-        <w:br/>
-        <w:t>Hi Mike, this is your friendly reminder to do better.</w:t>
-      </w:r>
-      <w:r>
-        <w:br/>
-      </w:r>
-      <w:r>
-        <w:br/>
-        <w:t xml:space="preserve">Hi Mike, try smiling. </w:t>
-      </w:r>
-    </w:p>
-    <w:p/>
-    <w:p>
-      <w:r>
         <w:t xml:space="preserve">Hi Mike, everyone here thinks you are great. </w:t>
       </w:r>
       <w:r>
@@ -230,7 +292,15 @@
       </w:r>
       <w:r>
         <w:br/>
-        <w:t xml:space="preserve">Hi Mike, Remember to put people in their place today, help them </w:t>
+        <w:t xml:space="preserve">Hi Mike, </w:t>
+      </w:r>
+      <w:proofErr w:type="gramStart"/>
+      <w:r>
+        <w:t>Remember</w:t>
+      </w:r>
+      <w:proofErr w:type="gramEnd"/>
+      <w:r>
+        <w:t xml:space="preserve"> to put people in their place today, help them </w:t>
       </w:r>
       <w:r>
         <w:t>to control their</w:t>

</xml_diff>

<commit_message>
Fixed info.plist for apple
</commit_message>
<xml_diff>
--- a/docs/wes2/Next fix bb3 notes, plus circuits.docx
+++ b/docs/wes2/Next fix bb3 notes, plus circuits.docx
@@ -3,64 +3,329 @@
 <w:document xmlns:wpc="http://schemas.microsoft.com/office/word/2010/wordprocessingCanvas" xmlns:cx="http://schemas.microsoft.com/office/drawing/2014/chartex" xmlns:cx1="http://schemas.microsoft.com/office/drawing/2015/9/8/chartex" xmlns:cx2="http://schemas.microsoft.com/office/drawing/2015/10/21/chartex" xmlns:cx3="http://schemas.microsoft.com/office/drawing/2016/5/9/chartex" xmlns:cx4="http://schemas.microsoft.com/office/drawing/2016/5/10/chartex" xmlns:cx5="http://schemas.microsoft.com/office/drawing/2016/5/11/chartex" xmlns:cx6="http://schemas.microsoft.com/office/drawing/2016/5/12/chartex" xmlns:cx7="http://schemas.microsoft.com/office/drawing/2016/5/13/chartex" xmlns:cx8="http://schemas.microsoft.com/office/drawing/2016/5/14/chartex" xmlns:mc="http://schemas.openxmlformats.org/markup-compatibility/2006" xmlns:aink="http://schemas.microsoft.com/office/drawing/2016/ink" xmlns:am3d="http://schemas.microsoft.com/office/drawing/2017/model3d" xmlns:o="urn:schemas-microsoft-com:office:office" xmlns:oel="http://schemas.microsoft.com/office/2019/extlst" xmlns:r="http://schemas.openxmlformats.org/officeDocument/2006/relationships" xmlns:m="http://schemas.openxmlformats.org/officeDocument/2006/math" xmlns:v="urn:schemas-microsoft-com:vml" xmlns:wp14="http://schemas.microsoft.com/office/word/2010/wordprocessingDrawing" xmlns:wp="http://schemas.openxmlformats.org/drawingml/2006/wordprocessingDrawing" xmlns:w10="urn:schemas-microsoft-com:office:word" xmlns:w="http://schemas.openxmlformats.org/wordprocessingml/2006/main" xmlns:w14="http://schemas.microsoft.com/office/word/2010/wordml" xmlns:w15="http://schemas.microsoft.com/office/word/2012/wordml" xmlns:w16cex="http://schemas.microsoft.com/office/word/2018/wordml/cex" xmlns:w16cid="http://schemas.microsoft.com/office/word/2016/wordml/cid" xmlns:w16="http://schemas.microsoft.com/office/word/2018/wordml" xmlns:w16du="http://schemas.microsoft.com/office/word/2023/wordml/word16du" xmlns:w16sdtdh="http://schemas.microsoft.com/office/word/2020/wordml/sdtdatahash" xmlns:w16sdtfl="http://schemas.microsoft.com/office/word/2024/wordml/sdtformatlock" xmlns:w16se="http://schemas.microsoft.com/office/word/2015/wordml/symex" xmlns:wpg="http://schemas.microsoft.com/office/word/2010/wordprocessingGroup" xmlns:wpi="http://schemas.microsoft.com/office/word/2010/wordprocessingInk" xmlns:wne="http://schemas.microsoft.com/office/word/2006/wordml" xmlns:wps="http://schemas.microsoft.com/office/word/2010/wordprocessingShape" mc:Ignorable="w14 w15 w16se w16cid w16 w16cex w16sdtdh w16sdtfl w16du wp14">
   <w:body>
     <w:p>
-      <w:pPr>
+      <w:r>
         <w:rPr>
-          <w:strike/>
+          <w:i/>
+          <w:iCs/>
         </w:rPr>
-      </w:pPr>
+        <w:t>WES2</w:t>
+      </w:r>
+    </w:p>
+    <w:p/>
+    <w:p>
+      <w:r>
+        <w:t xml:space="preserve"> Snack bar for empty exercise </w:t>
+      </w:r>
+      <w:proofErr w:type="gramStart"/>
+      <w:r>
+        <w:t>replace</w:t>
+      </w:r>
+      <w:proofErr w:type="gramEnd"/>
+      <w:r>
+        <w:t xml:space="preserve"> removed </w:t>
+      </w:r>
+    </w:p>
+    <w:p/>
+    <w:p>
+      <w:r>
+        <w:t>Legacy template load bb3</w:t>
+      </w:r>
+    </w:p>
+    <w:p/>
+    <w:p>
       <w:r>
         <w:rPr>
-          <w:strike/>
+          <w:i/>
+          <w:iCs/>
         </w:rPr>
-        <w:t xml:space="preserve">Next fix is to improve </w:t>
+        <w:t>Account Creation</w:t>
+      </w:r>
+      <w:r>
+        <w:br/>
+      </w:r>
+      <w:r>
+        <w:br/>
+      </w:r>
+      <w:r>
+        <w:br/>
+      </w:r>
+    </w:p>
+    <w:p>
+      <w:pPr>
+        <w:numPr>
+          <w:ilvl w:val="0"/>
+          <w:numId w:val="4"/>
+        </w:numPr>
+      </w:pPr>
+      <w:r>
+        <w:t>Fix planned block exercises and workout template lists depending on user onboarding</w:t>
+      </w:r>
+      <w:r>
+        <w:t>.</w:t>
+      </w:r>
+    </w:p>
+    <w:p>
+      <w:r>
+        <w:t>2.aa Still not auto creating blocks to be length 26 weeks or half a year, can we change please? Each block by default when autogenerated or manually generated should be 26 weeks, not something else.</w:t>
+      </w:r>
+    </w:p>
+    <w:p>
+      <w:r>
+        <w:t xml:space="preserve">2.a Can we make sure the following changes are made to work for selected user, which may be different from logged in user? Can we make the </w:t>
       </w:r>
       <w:proofErr w:type="spellStart"/>
       <w:r>
-        <w:rPr>
-          <w:strike/>
-        </w:rPr>
-        <w:t>planned_blocks</w:t>
+        <w:t>ensureNewBlock</w:t>
       </w:r>
       <w:proofErr w:type="spellEnd"/>
       <w:r>
-        <w:rPr>
-          <w:strike/>
-        </w:rPr>
-        <w:t xml:space="preserve"> values loading into hints and settings cog wheel fields. Seems to work mostly. Not sure if works in all cases though. One known scenario it does not work well in is in the case of selected user being different from logged in user. Then all fields are blank, instead of being loaded for selected user. </w:t>
-      </w:r>
-      <w:r>
-        <w:rPr>
-          <w:strike/>
-        </w:rPr>
-        <w:t xml:space="preserve">Hints for exercises coming from </w:t>
+        <w:t xml:space="preserve"> exists function </w:t>
+      </w:r>
+      <w:proofErr w:type="gramStart"/>
+      <w:r>
+        <w:t>actually use</w:t>
+      </w:r>
+      <w:proofErr w:type="gramEnd"/>
+      <w:r>
+        <w:t xml:space="preserve"> the entire exercise list. Then can we store </w:t>
       </w:r>
       <w:proofErr w:type="spellStart"/>
       <w:r>
-        <w:rPr>
-          <w:strike/>
-        </w:rPr>
-        <w:t>planned_blocks</w:t>
+        <w:t>seperately</w:t>
       </w:r>
       <w:proofErr w:type="spellEnd"/>
       <w:r>
-        <w:rPr>
-          <w:strike/>
-        </w:rPr>
-        <w:t xml:space="preserve"> needs to populate settings cog wheel per selected user, and then hints for the exercise that day should be in line with the values in </w:t>
+        <w:t xml:space="preserve"> the list of exercises that </w:t>
       </w:r>
       <w:proofErr w:type="spellStart"/>
       <w:r>
-        <w:rPr>
-          <w:strike/>
-        </w:rPr>
-        <w:t>planned_blocks</w:t>
+        <w:t>workoutplanner</w:t>
       </w:r>
       <w:proofErr w:type="spellEnd"/>
       <w:r>
-        <w:rPr>
-          <w:strike/>
-        </w:rPr>
-        <w:t xml:space="preserve"> for each user to, and responsive to which ever user is loaded</w:t>
+        <w:t xml:space="preserve"> uses to build templates from, depending on user onboarding preferences. So that when a user changes their preferences, say increased emphasis on a particular body part, or changes weekly training frequency, then the list of exercises their templates are built from changes accordingly, rather than the exercises in their planned block changes - instead all exercises should always be in planned block by default, (but can be deleted and added back in if preferred by user) and the exercises this current block is using to build templates from changes according to user preferences, while planned block exercises stays the full exercise list, all exercises by default. This will mean if someone adds an exercise that </w:t>
+      </w:r>
+      <w:proofErr w:type="spellStart"/>
+      <w:r>
+        <w:t>isnt</w:t>
+      </w:r>
+      <w:proofErr w:type="spellEnd"/>
+      <w:r>
+        <w:t xml:space="preserve"> in their block, they at least get the default block planned values for it. And makes block planning simpler, </w:t>
+      </w:r>
+      <w:proofErr w:type="spellStart"/>
+      <w:proofErr w:type="gramStart"/>
+      <w:r>
+        <w:t>its</w:t>
+      </w:r>
+      <w:proofErr w:type="spellEnd"/>
+      <w:proofErr w:type="gramEnd"/>
+      <w:r>
+        <w:t xml:space="preserve"> always all the exercises, and the templates get built from a separate list within all exercises used in the block, that comes from user preferences.  Restate in your own words please.</w:t>
+      </w:r>
+    </w:p>
+    <w:p/>
+    <w:p>
+      <w:r>
+        <w:t xml:space="preserve">2.b In addition, on </w:t>
+      </w:r>
+      <w:proofErr w:type="spellStart"/>
+      <w:r>
+        <w:t>plannedblocks</w:t>
+      </w:r>
+      <w:proofErr w:type="spellEnd"/>
+      <w:r>
+        <w:t xml:space="preserve"> page, can we please list all the exercises currently existing in that </w:t>
+      </w:r>
+      <w:proofErr w:type="gramStart"/>
+      <w:r>
+        <w:t>users</w:t>
+      </w:r>
+      <w:proofErr w:type="gramEnd"/>
+      <w:r>
+        <w:t xml:space="preserve"> active block templates, alphabetically, and first, before any exercises that are not currently included in the </w:t>
+      </w:r>
+      <w:proofErr w:type="gramStart"/>
+      <w:r>
+        <w:t>users</w:t>
+      </w:r>
+      <w:proofErr w:type="gramEnd"/>
+      <w:r>
+        <w:t xml:space="preserve"> templates. So that if they have 12 exercises used across their templates for active block, then those 12 exercises should be listed first at the start of </w:t>
+      </w:r>
+      <w:proofErr w:type="spellStart"/>
+      <w:r>
+        <w:t>plannedblock</w:t>
+      </w:r>
+      <w:proofErr w:type="spellEnd"/>
+      <w:r>
+        <w:t xml:space="preserve"> exercise list. Then </w:t>
+      </w:r>
+      <w:proofErr w:type="spellStart"/>
+      <w:r>
+        <w:t>aclear</w:t>
+      </w:r>
+      <w:proofErr w:type="spellEnd"/>
+      <w:r>
+        <w:t xml:space="preserve"> white line shows like </w:t>
+      </w:r>
+      <w:r>
+        <w:lastRenderedPageBreak/>
+        <w:t>a border, and beneath that, also alphabetically, all the remaining exercises. This white line is kind of in place already but the description of what counts as a planned exercise was not clear, now we are making it clear by saying any exercise that is currently used in the selected user’s templates within the Templates that are tied to that current opened block. Restate in your own words please.</w:t>
+      </w:r>
+    </w:p>
+    <w:p/>
+    <w:p>
+      <w:r>
+        <w:t xml:space="preserve">2.c Can we also then make all places that toggle on/off ‘planned exercises’ mostly in various add/replace exercise pickers across the app, use the list of exercises that are planned for the user based off their preferences, instead of the full list of all exercises now in planned blocks? </w:t>
+      </w:r>
+      <w:proofErr w:type="gramStart"/>
+      <w:r>
+        <w:t>So</w:t>
+      </w:r>
+      <w:proofErr w:type="gramEnd"/>
+      <w:r>
+        <w:t xml:space="preserve"> the same list as the one the template builder uses based off the user’s preferences to build their templates. Not all exercises in the list must be used for the templates, but all can be. This list is the one that should toggle on off with the ‘planned only’ toggles throughout the app used in alert dialogs to add exercises. Especially in templates page, wes2, and bb3.</w:t>
+      </w:r>
+    </w:p>
+    <w:p>
+      <w:r>
+        <w:br/>
+      </w:r>
+    </w:p>
+    <w:p>
+      <w:r>
+        <w:br/>
+      </w:r>
+    </w:p>
+    <w:p>
+      <w:pPr>
+        <w:numPr>
+          <w:ilvl w:val="0"/>
+          <w:numId w:val="6"/>
+        </w:numPr>
+      </w:pPr>
+      <w:r>
+        <w:t xml:space="preserve">Can we also then check if any of the </w:t>
+      </w:r>
+      <w:proofErr w:type="spellStart"/>
+      <w:r>
+        <w:t>warmupservice</w:t>
+      </w:r>
+      <w:proofErr w:type="spellEnd"/>
+      <w:r>
+        <w:t xml:space="preserve"> functions are necessary anymore? They might be tied only to </w:t>
+      </w:r>
+      <w:proofErr w:type="spellStart"/>
+      <w:r>
+        <w:t>workout_entry_screen</w:t>
+      </w:r>
+      <w:proofErr w:type="spellEnd"/>
+      <w:r>
+        <w:t xml:space="preserve"> and Camp_BB2, which we have now replaced and use WES2, and BB3 instead. Check this is safe and </w:t>
+      </w:r>
+      <w:proofErr w:type="spellStart"/>
+      <w:proofErr w:type="gramStart"/>
+      <w:r>
+        <w:t>their</w:t>
+      </w:r>
+      <w:proofErr w:type="gramEnd"/>
+      <w:r>
+        <w:t xml:space="preserve"> are</w:t>
+      </w:r>
+      <w:proofErr w:type="spellEnd"/>
+      <w:r>
+        <w:t xml:space="preserve"> now problems with removing it first, and that </w:t>
+      </w:r>
+      <w:proofErr w:type="gramStart"/>
+      <w:r>
+        <w:t>it</w:t>
+      </w:r>
+      <w:proofErr w:type="gramEnd"/>
+      <w:r>
+        <w:t xml:space="preserve"> </w:t>
+      </w:r>
+      <w:proofErr w:type="spellStart"/>
+      <w:r>
+        <w:t>wont</w:t>
+      </w:r>
+      <w:proofErr w:type="spellEnd"/>
+      <w:r>
+        <w:t xml:space="preserve"> effect the newer pages and flow of app in anyway. Then can we also check the Isar files? I think only </w:t>
+      </w:r>
+      <w:proofErr w:type="spellStart"/>
+      <w:r>
+        <w:t>claude_bullet</w:t>
+      </w:r>
+      <w:proofErr w:type="spellEnd"/>
+      <w:r>
+        <w:t xml:space="preserve"> functions are used now, in those pages. We want to clear the way for the new </w:t>
+      </w:r>
+      <w:proofErr w:type="spellStart"/>
+      <w:r>
+        <w:t>isar</w:t>
+      </w:r>
+      <w:proofErr w:type="spellEnd"/>
+      <w:r>
+        <w:t xml:space="preserve"> files coming, which will be used by WES2 and possibly bb3, but the old ones are built ineffectively, and </w:t>
+      </w:r>
+      <w:proofErr w:type="spellStart"/>
+      <w:proofErr w:type="gramStart"/>
+      <w:r>
+        <w:t>wont</w:t>
+      </w:r>
+      <w:proofErr w:type="spellEnd"/>
+      <w:proofErr w:type="gramEnd"/>
+      <w:r>
+        <w:t xml:space="preserve"> be needed anymore, just check </w:t>
+      </w:r>
+      <w:proofErr w:type="spellStart"/>
+      <w:r>
+        <w:t>its</w:t>
+      </w:r>
+      <w:proofErr w:type="spellEnd"/>
+      <w:r>
+        <w:t xml:space="preserve"> only those two we need. </w:t>
+      </w:r>
+    </w:p>
+    <w:p>
+      <w:r>
+        <w:br/>
+      </w:r>
+    </w:p>
+    <w:p>
+      <w:pPr>
+        <w:numPr>
+          <w:ilvl w:val="0"/>
+          <w:numId w:val="7"/>
+        </w:numPr>
+      </w:pPr>
+      <w:r>
+        <w:t>Make obvious what to do next once account created.</w:t>
+      </w:r>
+    </w:p>
+    <w:p>
+      <w:r>
+        <w:t>5.a Can we make it easier / more obvious for a new user to understand what to do next after successful account creation? We want to direct them to workout planner so that they can see their new workouts and easily change the workouts there. Drag and drop to re-order, drag to bin to delete, tap to replace, tap add circuit to add circuit to workout. </w:t>
+      </w:r>
+    </w:p>
+    <w:p>
+      <w:r>
+        <w:t xml:space="preserve">5.b And then can we direct their attention to WES2, labelled ‘Enter Workout’ in the app. We want to make it super clear how to enter values for each field when training. Double tap to accept suggestion, type in to enter something different. The algorithm first determines your rep target and RIR target, then calculates weight according to training </w:t>
+      </w:r>
+      <w:r>
+        <w:lastRenderedPageBreak/>
+        <w:t>history. If you have never entered any workouts for that exercise yet, it will be set to defaults. Explain on first workout alert pop up, plus have accessible somewhere all the time </w:t>
+      </w:r>
+    </w:p>
+    <w:p>
+      <w:r>
+        <w:br/>
+      </w:r>
+    </w:p>
+    <w:p>
+      <w:r>
+        <w:t>Make seeking online training more accessible/ easy</w:t>
       </w:r>
     </w:p>
     <w:p>
@@ -345,6 +610,458 @@
 <file path=word/numbering.xml><?xml version="1.0" encoding="utf-8"?>
 <w:numbering xmlns:wpc="http://schemas.microsoft.com/office/word/2010/wordprocessingCanvas" xmlns:cx="http://schemas.microsoft.com/office/drawing/2014/chartex" xmlns:cx1="http://schemas.microsoft.com/office/drawing/2015/9/8/chartex" xmlns:cx2="http://schemas.microsoft.com/office/drawing/2015/10/21/chartex" xmlns:cx3="http://schemas.microsoft.com/office/drawing/2016/5/9/chartex" xmlns:cx4="http://schemas.microsoft.com/office/drawing/2016/5/10/chartex" xmlns:cx5="http://schemas.microsoft.com/office/drawing/2016/5/11/chartex" xmlns:cx6="http://schemas.microsoft.com/office/drawing/2016/5/12/chartex" xmlns:cx7="http://schemas.microsoft.com/office/drawing/2016/5/13/chartex" xmlns:cx8="http://schemas.microsoft.com/office/drawing/2016/5/14/chartex" xmlns:mc="http://schemas.openxmlformats.org/markup-compatibility/2006" xmlns:aink="http://schemas.microsoft.com/office/drawing/2016/ink" xmlns:am3d="http://schemas.microsoft.com/office/drawing/2017/model3d" xmlns:o="urn:schemas-microsoft-com:office:office" xmlns:oel="http://schemas.microsoft.com/office/2019/extlst" xmlns:r="http://schemas.openxmlformats.org/officeDocument/2006/relationships" xmlns:m="http://schemas.openxmlformats.org/officeDocument/2006/math" xmlns:v="urn:schemas-microsoft-com:vml" xmlns:wp14="http://schemas.microsoft.com/office/word/2010/wordprocessingDrawing" xmlns:wp="http://schemas.openxmlformats.org/drawingml/2006/wordprocessingDrawing" xmlns:w10="urn:schemas-microsoft-com:office:word" xmlns:w="http://schemas.openxmlformats.org/wordprocessingml/2006/main" xmlns:w14="http://schemas.microsoft.com/office/word/2010/wordml" xmlns:w15="http://schemas.microsoft.com/office/word/2012/wordml" xmlns:w16cex="http://schemas.microsoft.com/office/word/2018/wordml/cex" xmlns:w16cid="http://schemas.microsoft.com/office/word/2016/wordml/cid" xmlns:w16="http://schemas.microsoft.com/office/word/2018/wordml" xmlns:w16du="http://schemas.microsoft.com/office/word/2023/wordml/word16du" xmlns:w16sdtdh="http://schemas.microsoft.com/office/word/2020/wordml/sdtdatahash" xmlns:w16sdtfl="http://schemas.microsoft.com/office/word/2024/wordml/sdtformatlock" xmlns:w16se="http://schemas.microsoft.com/office/word/2015/wordml/symex" xmlns:wpg="http://schemas.microsoft.com/office/word/2010/wordprocessingGroup" xmlns:wpi="http://schemas.microsoft.com/office/word/2010/wordprocessingInk" xmlns:wne="http://schemas.microsoft.com/office/word/2006/wordml" xmlns:wps="http://schemas.microsoft.com/office/word/2010/wordprocessingShape" mc:Ignorable="w14 w15 w16se w16cid w16 w16cex w16sdtdh w16sdtfl w16du wp14">
   <w:abstractNum w:abstractNumId="0" w15:restartNumberingAfterBreak="0">
+    <w:nsid w:val="217D6479"/>
+    <w:multiLevelType w:val="multilevel"/>
+    <w:tmpl w:val="9D74146C"/>
+    <w:lvl w:ilvl="0">
+      <w:start w:val="3"/>
+      <w:numFmt w:val="decimal"/>
+      <w:lvlText w:val="%1."/>
+      <w:lvlJc w:val="left"/>
+      <w:pPr>
+        <w:tabs>
+          <w:tab w:val="num" w:pos="720"/>
+        </w:tabs>
+        <w:ind w:left="720" w:hanging="360"/>
+      </w:pPr>
+    </w:lvl>
+    <w:lvl w:ilvl="1" w:tentative="1">
+      <w:start w:val="1"/>
+      <w:numFmt w:val="decimal"/>
+      <w:lvlText w:val="%2."/>
+      <w:lvlJc w:val="left"/>
+      <w:pPr>
+        <w:tabs>
+          <w:tab w:val="num" w:pos="1440"/>
+        </w:tabs>
+        <w:ind w:left="1440" w:hanging="360"/>
+      </w:pPr>
+    </w:lvl>
+    <w:lvl w:ilvl="2" w:tentative="1">
+      <w:start w:val="1"/>
+      <w:numFmt w:val="decimal"/>
+      <w:lvlText w:val="%3."/>
+      <w:lvlJc w:val="left"/>
+      <w:pPr>
+        <w:tabs>
+          <w:tab w:val="num" w:pos="2160"/>
+        </w:tabs>
+        <w:ind w:left="2160" w:hanging="360"/>
+      </w:pPr>
+    </w:lvl>
+    <w:lvl w:ilvl="3" w:tentative="1">
+      <w:start w:val="1"/>
+      <w:numFmt w:val="decimal"/>
+      <w:lvlText w:val="%4."/>
+      <w:lvlJc w:val="left"/>
+      <w:pPr>
+        <w:tabs>
+          <w:tab w:val="num" w:pos="2880"/>
+        </w:tabs>
+        <w:ind w:left="2880" w:hanging="360"/>
+      </w:pPr>
+    </w:lvl>
+    <w:lvl w:ilvl="4" w:tentative="1">
+      <w:start w:val="1"/>
+      <w:numFmt w:val="decimal"/>
+      <w:lvlText w:val="%5."/>
+      <w:lvlJc w:val="left"/>
+      <w:pPr>
+        <w:tabs>
+          <w:tab w:val="num" w:pos="3600"/>
+        </w:tabs>
+        <w:ind w:left="3600" w:hanging="360"/>
+      </w:pPr>
+    </w:lvl>
+    <w:lvl w:ilvl="5" w:tentative="1">
+      <w:start w:val="1"/>
+      <w:numFmt w:val="decimal"/>
+      <w:lvlText w:val="%6."/>
+      <w:lvlJc w:val="left"/>
+      <w:pPr>
+        <w:tabs>
+          <w:tab w:val="num" w:pos="4320"/>
+        </w:tabs>
+        <w:ind w:left="4320" w:hanging="360"/>
+      </w:pPr>
+    </w:lvl>
+    <w:lvl w:ilvl="6" w:tentative="1">
+      <w:start w:val="1"/>
+      <w:numFmt w:val="decimal"/>
+      <w:lvlText w:val="%7."/>
+      <w:lvlJc w:val="left"/>
+      <w:pPr>
+        <w:tabs>
+          <w:tab w:val="num" w:pos="5040"/>
+        </w:tabs>
+        <w:ind w:left="5040" w:hanging="360"/>
+      </w:pPr>
+    </w:lvl>
+    <w:lvl w:ilvl="7" w:tentative="1">
+      <w:start w:val="1"/>
+      <w:numFmt w:val="decimal"/>
+      <w:lvlText w:val="%8."/>
+      <w:lvlJc w:val="left"/>
+      <w:pPr>
+        <w:tabs>
+          <w:tab w:val="num" w:pos="5760"/>
+        </w:tabs>
+        <w:ind w:left="5760" w:hanging="360"/>
+      </w:pPr>
+    </w:lvl>
+    <w:lvl w:ilvl="8" w:tentative="1">
+      <w:start w:val="1"/>
+      <w:numFmt w:val="decimal"/>
+      <w:lvlText w:val="%9."/>
+      <w:lvlJc w:val="left"/>
+      <w:pPr>
+        <w:tabs>
+          <w:tab w:val="num" w:pos="6480"/>
+        </w:tabs>
+        <w:ind w:left="6480" w:hanging="360"/>
+      </w:pPr>
+    </w:lvl>
+  </w:abstractNum>
+  <w:abstractNum w:abstractNumId="1" w15:restartNumberingAfterBreak="0">
+    <w:nsid w:val="220F502C"/>
+    <w:multiLevelType w:val="multilevel"/>
+    <w:tmpl w:val="BBCC09F0"/>
+    <w:lvl w:ilvl="0">
+      <w:start w:val="1"/>
+      <w:numFmt w:val="decimal"/>
+      <w:lvlText w:val="%1."/>
+      <w:lvlJc w:val="left"/>
+      <w:pPr>
+        <w:tabs>
+          <w:tab w:val="num" w:pos="720"/>
+        </w:tabs>
+        <w:ind w:left="720" w:hanging="360"/>
+      </w:pPr>
+    </w:lvl>
+    <w:lvl w:ilvl="1" w:tentative="1">
+      <w:start w:val="1"/>
+      <w:numFmt w:val="decimal"/>
+      <w:lvlText w:val="%2."/>
+      <w:lvlJc w:val="left"/>
+      <w:pPr>
+        <w:tabs>
+          <w:tab w:val="num" w:pos="1440"/>
+        </w:tabs>
+        <w:ind w:left="1440" w:hanging="360"/>
+      </w:pPr>
+    </w:lvl>
+    <w:lvl w:ilvl="2" w:tentative="1">
+      <w:start w:val="1"/>
+      <w:numFmt w:val="decimal"/>
+      <w:lvlText w:val="%3."/>
+      <w:lvlJc w:val="left"/>
+      <w:pPr>
+        <w:tabs>
+          <w:tab w:val="num" w:pos="2160"/>
+        </w:tabs>
+        <w:ind w:left="2160" w:hanging="360"/>
+      </w:pPr>
+    </w:lvl>
+    <w:lvl w:ilvl="3" w:tentative="1">
+      <w:start w:val="1"/>
+      <w:numFmt w:val="decimal"/>
+      <w:lvlText w:val="%4."/>
+      <w:lvlJc w:val="left"/>
+      <w:pPr>
+        <w:tabs>
+          <w:tab w:val="num" w:pos="2880"/>
+        </w:tabs>
+        <w:ind w:left="2880" w:hanging="360"/>
+      </w:pPr>
+    </w:lvl>
+    <w:lvl w:ilvl="4" w:tentative="1">
+      <w:start w:val="1"/>
+      <w:numFmt w:val="decimal"/>
+      <w:lvlText w:val="%5."/>
+      <w:lvlJc w:val="left"/>
+      <w:pPr>
+        <w:tabs>
+          <w:tab w:val="num" w:pos="3600"/>
+        </w:tabs>
+        <w:ind w:left="3600" w:hanging="360"/>
+      </w:pPr>
+    </w:lvl>
+    <w:lvl w:ilvl="5" w:tentative="1">
+      <w:start w:val="1"/>
+      <w:numFmt w:val="decimal"/>
+      <w:lvlText w:val="%6."/>
+      <w:lvlJc w:val="left"/>
+      <w:pPr>
+        <w:tabs>
+          <w:tab w:val="num" w:pos="4320"/>
+        </w:tabs>
+        <w:ind w:left="4320" w:hanging="360"/>
+      </w:pPr>
+    </w:lvl>
+    <w:lvl w:ilvl="6" w:tentative="1">
+      <w:start w:val="1"/>
+      <w:numFmt w:val="decimal"/>
+      <w:lvlText w:val="%7."/>
+      <w:lvlJc w:val="left"/>
+      <w:pPr>
+        <w:tabs>
+          <w:tab w:val="num" w:pos="5040"/>
+        </w:tabs>
+        <w:ind w:left="5040" w:hanging="360"/>
+      </w:pPr>
+    </w:lvl>
+    <w:lvl w:ilvl="7" w:tentative="1">
+      <w:start w:val="1"/>
+      <w:numFmt w:val="decimal"/>
+      <w:lvlText w:val="%8."/>
+      <w:lvlJc w:val="left"/>
+      <w:pPr>
+        <w:tabs>
+          <w:tab w:val="num" w:pos="5760"/>
+        </w:tabs>
+        <w:ind w:left="5760" w:hanging="360"/>
+      </w:pPr>
+    </w:lvl>
+    <w:lvl w:ilvl="8" w:tentative="1">
+      <w:start w:val="1"/>
+      <w:numFmt w:val="decimal"/>
+      <w:lvlText w:val="%9."/>
+      <w:lvlJc w:val="left"/>
+      <w:pPr>
+        <w:tabs>
+          <w:tab w:val="num" w:pos="6480"/>
+        </w:tabs>
+        <w:ind w:left="6480" w:hanging="360"/>
+      </w:pPr>
+    </w:lvl>
+  </w:abstractNum>
+  <w:abstractNum w:abstractNumId="2" w15:restartNumberingAfterBreak="0">
+    <w:nsid w:val="25F61545"/>
+    <w:multiLevelType w:val="multilevel"/>
+    <w:tmpl w:val="388E266A"/>
+    <w:lvl w:ilvl="0">
+      <w:start w:val="4"/>
+      <w:numFmt w:val="decimal"/>
+      <w:lvlText w:val="%1."/>
+      <w:lvlJc w:val="left"/>
+      <w:pPr>
+        <w:tabs>
+          <w:tab w:val="num" w:pos="720"/>
+        </w:tabs>
+        <w:ind w:left="720" w:hanging="360"/>
+      </w:pPr>
+    </w:lvl>
+    <w:lvl w:ilvl="1" w:tentative="1">
+      <w:start w:val="1"/>
+      <w:numFmt w:val="decimal"/>
+      <w:lvlText w:val="%2."/>
+      <w:lvlJc w:val="left"/>
+      <w:pPr>
+        <w:tabs>
+          <w:tab w:val="num" w:pos="1440"/>
+        </w:tabs>
+        <w:ind w:left="1440" w:hanging="360"/>
+      </w:pPr>
+    </w:lvl>
+    <w:lvl w:ilvl="2" w:tentative="1">
+      <w:start w:val="1"/>
+      <w:numFmt w:val="decimal"/>
+      <w:lvlText w:val="%3."/>
+      <w:lvlJc w:val="left"/>
+      <w:pPr>
+        <w:tabs>
+          <w:tab w:val="num" w:pos="2160"/>
+        </w:tabs>
+        <w:ind w:left="2160" w:hanging="360"/>
+      </w:pPr>
+    </w:lvl>
+    <w:lvl w:ilvl="3" w:tentative="1">
+      <w:start w:val="1"/>
+      <w:numFmt w:val="decimal"/>
+      <w:lvlText w:val="%4."/>
+      <w:lvlJc w:val="left"/>
+      <w:pPr>
+        <w:tabs>
+          <w:tab w:val="num" w:pos="2880"/>
+        </w:tabs>
+        <w:ind w:left="2880" w:hanging="360"/>
+      </w:pPr>
+    </w:lvl>
+    <w:lvl w:ilvl="4" w:tentative="1">
+      <w:start w:val="1"/>
+      <w:numFmt w:val="decimal"/>
+      <w:lvlText w:val="%5."/>
+      <w:lvlJc w:val="left"/>
+      <w:pPr>
+        <w:tabs>
+          <w:tab w:val="num" w:pos="3600"/>
+        </w:tabs>
+        <w:ind w:left="3600" w:hanging="360"/>
+      </w:pPr>
+    </w:lvl>
+    <w:lvl w:ilvl="5" w:tentative="1">
+      <w:start w:val="1"/>
+      <w:numFmt w:val="decimal"/>
+      <w:lvlText w:val="%6."/>
+      <w:lvlJc w:val="left"/>
+      <w:pPr>
+        <w:tabs>
+          <w:tab w:val="num" w:pos="4320"/>
+        </w:tabs>
+        <w:ind w:left="4320" w:hanging="360"/>
+      </w:pPr>
+    </w:lvl>
+    <w:lvl w:ilvl="6" w:tentative="1">
+      <w:start w:val="1"/>
+      <w:numFmt w:val="decimal"/>
+      <w:lvlText w:val="%7."/>
+      <w:lvlJc w:val="left"/>
+      <w:pPr>
+        <w:tabs>
+          <w:tab w:val="num" w:pos="5040"/>
+        </w:tabs>
+        <w:ind w:left="5040" w:hanging="360"/>
+      </w:pPr>
+    </w:lvl>
+    <w:lvl w:ilvl="7" w:tentative="1">
+      <w:start w:val="1"/>
+      <w:numFmt w:val="decimal"/>
+      <w:lvlText w:val="%8."/>
+      <w:lvlJc w:val="left"/>
+      <w:pPr>
+        <w:tabs>
+          <w:tab w:val="num" w:pos="5760"/>
+        </w:tabs>
+        <w:ind w:left="5760" w:hanging="360"/>
+      </w:pPr>
+    </w:lvl>
+    <w:lvl w:ilvl="8" w:tentative="1">
+      <w:start w:val="1"/>
+      <w:numFmt w:val="decimal"/>
+      <w:lvlText w:val="%9."/>
+      <w:lvlJc w:val="left"/>
+      <w:pPr>
+        <w:tabs>
+          <w:tab w:val="num" w:pos="6480"/>
+        </w:tabs>
+        <w:ind w:left="6480" w:hanging="360"/>
+      </w:pPr>
+    </w:lvl>
+  </w:abstractNum>
+  <w:abstractNum w:abstractNumId="3" w15:restartNumberingAfterBreak="0">
+    <w:nsid w:val="2CAD29D7"/>
+    <w:multiLevelType w:val="multilevel"/>
+    <w:tmpl w:val="B8CE4DF2"/>
+    <w:lvl w:ilvl="0">
+      <w:start w:val="2"/>
+      <w:numFmt w:val="decimal"/>
+      <w:lvlText w:val="%1."/>
+      <w:lvlJc w:val="left"/>
+      <w:pPr>
+        <w:tabs>
+          <w:tab w:val="num" w:pos="720"/>
+        </w:tabs>
+        <w:ind w:left="720" w:hanging="360"/>
+      </w:pPr>
+    </w:lvl>
+    <w:lvl w:ilvl="1" w:tentative="1">
+      <w:start w:val="1"/>
+      <w:numFmt w:val="decimal"/>
+      <w:lvlText w:val="%2."/>
+      <w:lvlJc w:val="left"/>
+      <w:pPr>
+        <w:tabs>
+          <w:tab w:val="num" w:pos="1440"/>
+        </w:tabs>
+        <w:ind w:left="1440" w:hanging="360"/>
+      </w:pPr>
+    </w:lvl>
+    <w:lvl w:ilvl="2" w:tentative="1">
+      <w:start w:val="1"/>
+      <w:numFmt w:val="decimal"/>
+      <w:lvlText w:val="%3."/>
+      <w:lvlJc w:val="left"/>
+      <w:pPr>
+        <w:tabs>
+          <w:tab w:val="num" w:pos="2160"/>
+        </w:tabs>
+        <w:ind w:left="2160" w:hanging="360"/>
+      </w:pPr>
+    </w:lvl>
+    <w:lvl w:ilvl="3" w:tentative="1">
+      <w:start w:val="1"/>
+      <w:numFmt w:val="decimal"/>
+      <w:lvlText w:val="%4."/>
+      <w:lvlJc w:val="left"/>
+      <w:pPr>
+        <w:tabs>
+          <w:tab w:val="num" w:pos="2880"/>
+        </w:tabs>
+        <w:ind w:left="2880" w:hanging="360"/>
+      </w:pPr>
+    </w:lvl>
+    <w:lvl w:ilvl="4" w:tentative="1">
+      <w:start w:val="1"/>
+      <w:numFmt w:val="decimal"/>
+      <w:lvlText w:val="%5."/>
+      <w:lvlJc w:val="left"/>
+      <w:pPr>
+        <w:tabs>
+          <w:tab w:val="num" w:pos="3600"/>
+        </w:tabs>
+        <w:ind w:left="3600" w:hanging="360"/>
+      </w:pPr>
+    </w:lvl>
+    <w:lvl w:ilvl="5" w:tentative="1">
+      <w:start w:val="1"/>
+      <w:numFmt w:val="decimal"/>
+      <w:lvlText w:val="%6."/>
+      <w:lvlJc w:val="left"/>
+      <w:pPr>
+        <w:tabs>
+          <w:tab w:val="num" w:pos="4320"/>
+        </w:tabs>
+        <w:ind w:left="4320" w:hanging="360"/>
+      </w:pPr>
+    </w:lvl>
+    <w:lvl w:ilvl="6" w:tentative="1">
+      <w:start w:val="1"/>
+      <w:numFmt w:val="decimal"/>
+      <w:lvlText w:val="%7."/>
+      <w:lvlJc w:val="left"/>
+      <w:pPr>
+        <w:tabs>
+          <w:tab w:val="num" w:pos="5040"/>
+        </w:tabs>
+        <w:ind w:left="5040" w:hanging="360"/>
+      </w:pPr>
+    </w:lvl>
+    <w:lvl w:ilvl="7" w:tentative="1">
+      <w:start w:val="1"/>
+      <w:numFmt w:val="decimal"/>
+      <w:lvlText w:val="%8."/>
+      <w:lvlJc w:val="left"/>
+      <w:pPr>
+        <w:tabs>
+          <w:tab w:val="num" w:pos="5760"/>
+        </w:tabs>
+        <w:ind w:left="5760" w:hanging="360"/>
+      </w:pPr>
+    </w:lvl>
+    <w:lvl w:ilvl="8" w:tentative="1">
+      <w:start w:val="1"/>
+      <w:numFmt w:val="decimal"/>
+      <w:lvlText w:val="%9."/>
+      <w:lvlJc w:val="left"/>
+      <w:pPr>
+        <w:tabs>
+          <w:tab w:val="num" w:pos="6480"/>
+        </w:tabs>
+        <w:ind w:left="6480" w:hanging="360"/>
+      </w:pPr>
+    </w:lvl>
+  </w:abstractNum>
+  <w:abstractNum w:abstractNumId="4" w15:restartNumberingAfterBreak="0">
     <w:nsid w:val="39250F5E"/>
     <w:multiLevelType w:val="hybridMultilevel"/>
     <w:tmpl w:val="F3F8F17E"/>
@@ -457,7 +1174,120 @@
       </w:rPr>
     </w:lvl>
   </w:abstractNum>
-  <w:abstractNum w:abstractNumId="1" w15:restartNumberingAfterBreak="0">
+  <w:abstractNum w:abstractNumId="5" w15:restartNumberingAfterBreak="0">
+    <w:nsid w:val="55AA15FF"/>
+    <w:multiLevelType w:val="multilevel"/>
+    <w:tmpl w:val="37F06F90"/>
+    <w:lvl w:ilvl="0">
+      <w:start w:val="5"/>
+      <w:numFmt w:val="decimal"/>
+      <w:lvlText w:val="%1."/>
+      <w:lvlJc w:val="left"/>
+      <w:pPr>
+        <w:tabs>
+          <w:tab w:val="num" w:pos="720"/>
+        </w:tabs>
+        <w:ind w:left="720" w:hanging="360"/>
+      </w:pPr>
+    </w:lvl>
+    <w:lvl w:ilvl="1" w:tentative="1">
+      <w:start w:val="1"/>
+      <w:numFmt w:val="decimal"/>
+      <w:lvlText w:val="%2."/>
+      <w:lvlJc w:val="left"/>
+      <w:pPr>
+        <w:tabs>
+          <w:tab w:val="num" w:pos="1440"/>
+        </w:tabs>
+        <w:ind w:left="1440" w:hanging="360"/>
+      </w:pPr>
+    </w:lvl>
+    <w:lvl w:ilvl="2" w:tentative="1">
+      <w:start w:val="1"/>
+      <w:numFmt w:val="decimal"/>
+      <w:lvlText w:val="%3."/>
+      <w:lvlJc w:val="left"/>
+      <w:pPr>
+        <w:tabs>
+          <w:tab w:val="num" w:pos="2160"/>
+        </w:tabs>
+        <w:ind w:left="2160" w:hanging="360"/>
+      </w:pPr>
+    </w:lvl>
+    <w:lvl w:ilvl="3" w:tentative="1">
+      <w:start w:val="1"/>
+      <w:numFmt w:val="decimal"/>
+      <w:lvlText w:val="%4."/>
+      <w:lvlJc w:val="left"/>
+      <w:pPr>
+        <w:tabs>
+          <w:tab w:val="num" w:pos="2880"/>
+        </w:tabs>
+        <w:ind w:left="2880" w:hanging="360"/>
+      </w:pPr>
+    </w:lvl>
+    <w:lvl w:ilvl="4" w:tentative="1">
+      <w:start w:val="1"/>
+      <w:numFmt w:val="decimal"/>
+      <w:lvlText w:val="%5."/>
+      <w:lvlJc w:val="left"/>
+      <w:pPr>
+        <w:tabs>
+          <w:tab w:val="num" w:pos="3600"/>
+        </w:tabs>
+        <w:ind w:left="3600" w:hanging="360"/>
+      </w:pPr>
+    </w:lvl>
+    <w:lvl w:ilvl="5" w:tentative="1">
+      <w:start w:val="1"/>
+      <w:numFmt w:val="decimal"/>
+      <w:lvlText w:val="%6."/>
+      <w:lvlJc w:val="left"/>
+      <w:pPr>
+        <w:tabs>
+          <w:tab w:val="num" w:pos="4320"/>
+        </w:tabs>
+        <w:ind w:left="4320" w:hanging="360"/>
+      </w:pPr>
+    </w:lvl>
+    <w:lvl w:ilvl="6" w:tentative="1">
+      <w:start w:val="1"/>
+      <w:numFmt w:val="decimal"/>
+      <w:lvlText w:val="%7."/>
+      <w:lvlJc w:val="left"/>
+      <w:pPr>
+        <w:tabs>
+          <w:tab w:val="num" w:pos="5040"/>
+        </w:tabs>
+        <w:ind w:left="5040" w:hanging="360"/>
+      </w:pPr>
+    </w:lvl>
+    <w:lvl w:ilvl="7" w:tentative="1">
+      <w:start w:val="1"/>
+      <w:numFmt w:val="decimal"/>
+      <w:lvlText w:val="%8."/>
+      <w:lvlJc w:val="left"/>
+      <w:pPr>
+        <w:tabs>
+          <w:tab w:val="num" w:pos="5760"/>
+        </w:tabs>
+        <w:ind w:left="5760" w:hanging="360"/>
+      </w:pPr>
+    </w:lvl>
+    <w:lvl w:ilvl="8" w:tentative="1">
+      <w:start w:val="1"/>
+      <w:numFmt w:val="decimal"/>
+      <w:lvlText w:val="%9."/>
+      <w:lvlJc w:val="left"/>
+      <w:pPr>
+        <w:tabs>
+          <w:tab w:val="num" w:pos="6480"/>
+        </w:tabs>
+        <w:ind w:left="6480" w:hanging="360"/>
+      </w:pPr>
+    </w:lvl>
+  </w:abstractNum>
+  <w:abstractNum w:abstractNumId="6" w15:restartNumberingAfterBreak="0">
     <w:nsid w:val="6A64573E"/>
     <w:multiLevelType w:val="hybridMultilevel"/>
     <w:tmpl w:val="7EA88296"/>
@@ -547,10 +1377,53 @@
     </w:lvl>
   </w:abstractNum>
   <w:num w:numId="1" w16cid:durableId="1524397689">
+    <w:abstractNumId w:val="6"/>
+  </w:num>
+  <w:num w:numId="2" w16cid:durableId="642201778">
+    <w:abstractNumId w:val="4"/>
+  </w:num>
+  <w:num w:numId="3" w16cid:durableId="1494177121">
     <w:abstractNumId w:val="1"/>
   </w:num>
-  <w:num w:numId="2" w16cid:durableId="642201778">
+  <w:num w:numId="4" w16cid:durableId="582567519">
+    <w:abstractNumId w:val="3"/>
+    <w:lvlOverride w:ilvl="0">
+      <w:lvl w:ilvl="0">
+        <w:numFmt w:val="decimal"/>
+        <w:lvlText w:val="%1."/>
+        <w:lvlJc w:val="left"/>
+      </w:lvl>
+    </w:lvlOverride>
+  </w:num>
+  <w:num w:numId="5" w16cid:durableId="1480464158">
     <w:abstractNumId w:val="0"/>
+    <w:lvlOverride w:ilvl="0">
+      <w:lvl w:ilvl="0">
+        <w:numFmt w:val="decimal"/>
+        <w:lvlText w:val="%1."/>
+        <w:lvlJc w:val="left"/>
+      </w:lvl>
+    </w:lvlOverride>
+  </w:num>
+  <w:num w:numId="6" w16cid:durableId="1232234847">
+    <w:abstractNumId w:val="2"/>
+    <w:lvlOverride w:ilvl="0">
+      <w:lvl w:ilvl="0">
+        <w:numFmt w:val="decimal"/>
+        <w:lvlText w:val="%1."/>
+        <w:lvlJc w:val="left"/>
+      </w:lvl>
+    </w:lvlOverride>
+  </w:num>
+  <w:num w:numId="7" w16cid:durableId="942613188">
+    <w:abstractNumId w:val="5"/>
+    <w:lvlOverride w:ilvl="0">
+      <w:lvl w:ilvl="0">
+        <w:numFmt w:val="decimal"/>
+        <w:lvlText w:val="%1."/>
+        <w:lvlJc w:val="left"/>
+      </w:lvl>
+    </w:lvlOverride>
   </w:num>
 </w:numbering>
 </file>
@@ -1158,7 +2031,6 @@
   <w:style w:type="character" w:default="1" w:styleId="DefaultParagraphFont">
     <w:name w:val="Default Paragraph Font"/>
     <w:uiPriority w:val="1"/>
-    <w:semiHidden/>
     <w:unhideWhenUsed/>
   </w:style>
   <w:style w:type="table" w:default="1" w:styleId="TableNormal">

</xml_diff>

<commit_message>
Fixed smart progression overaly for dup exposure and week. not dup signature
</commit_message>
<xml_diff>
--- a/docs/wes2/Next fix bb3 notes, plus circuits.docx
+++ b/docs/wes2/Next fix bb3 notes, plus circuits.docx
@@ -11,26 +11,30 @@
         <w:t>WES2</w:t>
       </w:r>
     </w:p>
+    <w:p>
+      <w:r>
+        <w:t>Dup signature and smart progression working together</w:t>
+      </w:r>
+    </w:p>
     <w:p/>
     <w:p>
       <w:r>
-        <w:t xml:space="preserve"> Snack bar for empty exercise </w:t>
-      </w:r>
-      <w:proofErr w:type="gramStart"/>
-      <w:r>
-        <w:t>replace</w:t>
-      </w:r>
-      <w:proofErr w:type="gramEnd"/>
-      <w:r>
-        <w:t xml:space="preserve"> removed </w:t>
+        <w:t>1. In settings cog wheel, make RIR subtly indicate which instance index we are on. Normally the same as current rep target weekly index.</w:t>
       </w:r>
     </w:p>
     <w:p/>
     <w:p>
       <w:r>
+        <w:t>3. Completed exercise pill better, last exercise</w:t>
+      </w:r>
+    </w:p>
+    <w:p/>
+    <w:p>
+      <w:r>
         <w:t>Legacy template load bb3</w:t>
       </w:r>
     </w:p>
+    <w:p/>
     <w:p/>
     <w:p>
       <w:r>
@@ -51,569 +55,113 @@
       </w:r>
     </w:p>
     <w:p>
-      <w:pPr>
-        <w:numPr>
-          <w:ilvl w:val="0"/>
-          <w:numId w:val="4"/>
-        </w:numPr>
-      </w:pPr>
-      <w:r>
-        <w:t>Fix planned block exercises and workout template lists depending on user onboarding</w:t>
-      </w:r>
-      <w:r>
-        <w:t>.</w:t>
-      </w:r>
-    </w:p>
-    <w:p>
-      <w:r>
-        <w:t>2.aa Still not auto creating blocks to be length 26 weeks or half a year, can we change please? Each block by default when autogenerated or manually generated should be 26 weeks, not something else.</w:t>
-      </w:r>
-    </w:p>
-    <w:p>
-      <w:r>
-        <w:t xml:space="preserve">2.a Can we make sure the following changes are made to work for selected user, which may be different from logged in user? Can we make the </w:t>
+      <w:r>
+        <w:br/>
+      </w:r>
+      <w:r>
+        <w:br/>
+      </w:r>
+    </w:p>
+    <w:p>
+      <w:r>
+        <w:t>Make seeking online training more accessible/ easy</w:t>
+      </w:r>
+    </w:p>
+    <w:p>
+      <w:r>
+        <w:br/>
+      </w:r>
+      <w:r>
+        <w:br/>
+      </w:r>
+      <w:r>
+        <w:t>Circuit logic wes2 needs to be fixed, UI improved.</w:t>
+      </w:r>
+    </w:p>
+    <w:p>
+      <w:r>
+        <w:br/>
+        <w:t xml:space="preserve">Next thing to implement is live edits updating on multiple devices, including last write win rules. Can you summarise spec doc requirements on that please? </w:t>
+      </w:r>
+    </w:p>
+    <w:p>
+      <w:pPr>
+        <w:rPr>
+          <w:i/>
+          <w:iCs/>
+        </w:rPr>
+      </w:pPr>
+    </w:p>
+    <w:p>
+      <w:pPr>
+        <w:rPr>
+          <w:i/>
+          <w:iCs/>
+        </w:rPr>
+      </w:pPr>
+      <w:r>
+        <w:rPr>
+          <w:i/>
+          <w:iCs/>
+        </w:rPr>
+        <w:t>Home page updates</w:t>
+      </w:r>
+    </w:p>
+    <w:p>
+      <w:r>
+        <w:br/>
+      </w:r>
+      <w:r>
+        <w:t xml:space="preserve">7. Can we change friend notification icon to show add friend pop up </w:t>
       </w:r>
       <w:proofErr w:type="spellStart"/>
       <w:r>
-        <w:t>ensureNewBlock</w:t>
+        <w:t>along side</w:t>
       </w:r>
       <w:proofErr w:type="spellEnd"/>
       <w:r>
-        <w:t xml:space="preserve"> exists function </w:t>
-      </w:r>
-      <w:proofErr w:type="gramStart"/>
-      <w:r>
-        <w:t>actually use</w:t>
-      </w:r>
-      <w:proofErr w:type="gramEnd"/>
-      <w:r>
-        <w:t xml:space="preserve"> the entire exercise list. Then can we store </w:t>
-      </w:r>
-      <w:proofErr w:type="spellStart"/>
-      <w:r>
-        <w:t>seperately</w:t>
-      </w:r>
-      <w:proofErr w:type="spellEnd"/>
-      <w:r>
-        <w:t xml:space="preserve"> the list of exercises that </w:t>
-      </w:r>
-      <w:proofErr w:type="spellStart"/>
-      <w:r>
-        <w:t>workoutplanner</w:t>
-      </w:r>
-      <w:proofErr w:type="spellEnd"/>
-      <w:r>
-        <w:t xml:space="preserve"> uses to build templates from, depending on user onboarding preferences. So that when a user changes their preferences, say increased emphasis on a particular body part, or changes weekly training frequency, then the list of exercises their templates are built from changes accordingly, rather than the exercises in their planned block changes - instead all exercises should always be in planned block by default, (but can be deleted and added back in if preferred by user) and the exercises this current block is using to build templates from changes according to user preferences, while planned block exercises stays the full exercise list, all exercises by default. This will mean if someone adds an exercise that </w:t>
-      </w:r>
-      <w:proofErr w:type="spellStart"/>
-      <w:r>
-        <w:t>isnt</w:t>
-      </w:r>
-      <w:proofErr w:type="spellEnd"/>
-      <w:r>
-        <w:t xml:space="preserve"> in their block, they at least get the default block planned values for it. And makes block planning simpler, </w:t>
-      </w:r>
-      <w:proofErr w:type="spellStart"/>
-      <w:proofErr w:type="gramStart"/>
-      <w:r>
-        <w:t>its</w:t>
-      </w:r>
-      <w:proofErr w:type="spellEnd"/>
-      <w:proofErr w:type="gramEnd"/>
-      <w:r>
-        <w:t xml:space="preserve"> always all the exercises, and the templates get built from a separate list within all exercises used in the block, that comes from user preferences.  Restate in your own words please.</w:t>
-      </w:r>
-    </w:p>
-    <w:p/>
-    <w:p>
-      <w:r>
-        <w:t xml:space="preserve">2.b In addition, on </w:t>
-      </w:r>
-      <w:proofErr w:type="spellStart"/>
-      <w:r>
-        <w:t>plannedblocks</w:t>
-      </w:r>
-      <w:proofErr w:type="spellEnd"/>
-      <w:r>
-        <w:t xml:space="preserve"> page, can we please list all the exercises currently existing in that </w:t>
-      </w:r>
-      <w:proofErr w:type="gramStart"/>
-      <w:r>
-        <w:t>users</w:t>
-      </w:r>
-      <w:proofErr w:type="gramEnd"/>
-      <w:r>
-        <w:t xml:space="preserve"> active block templates, alphabetically, and first, before any exercises that are not currently included in the </w:t>
-      </w:r>
-      <w:proofErr w:type="gramStart"/>
-      <w:r>
-        <w:t>users</w:t>
-      </w:r>
-      <w:proofErr w:type="gramEnd"/>
-      <w:r>
-        <w:t xml:space="preserve"> templates. So that if they have 12 exercises used across their templates for active block, then those 12 exercises should be listed first at the start of </w:t>
-      </w:r>
-      <w:proofErr w:type="spellStart"/>
-      <w:r>
-        <w:t>plannedblock</w:t>
-      </w:r>
-      <w:proofErr w:type="spellEnd"/>
-      <w:r>
-        <w:t xml:space="preserve"> exercise list. Then </w:t>
-      </w:r>
-      <w:proofErr w:type="spellStart"/>
-      <w:r>
-        <w:t>aclear</w:t>
-      </w:r>
-      <w:proofErr w:type="spellEnd"/>
-      <w:r>
-        <w:t xml:space="preserve"> white line shows like </w:t>
-      </w:r>
-      <w:r>
-        <w:lastRenderedPageBreak/>
-        <w:t>a border, and beneath that, also alphabetically, all the remaining exercises. This white line is kind of in place already but the description of what counts as a planned exercise was not clear, now we are making it clear by saying any exercise that is currently used in the selected user’s templates within the Templates that are tied to that current opened block. Restate in your own words please.</w:t>
-      </w:r>
-    </w:p>
-    <w:p/>
-    <w:p>
-      <w:r>
-        <w:t xml:space="preserve">2.c Can we also then make all places that toggle on/off ‘planned exercises’ mostly in various add/replace exercise pickers across the app, use the list of exercises that are planned for the user based off their preferences, instead of the full list of all exercises now in planned blocks? </w:t>
-      </w:r>
-      <w:proofErr w:type="gramStart"/>
-      <w:r>
-        <w:t>So</w:t>
-      </w:r>
-      <w:proofErr w:type="gramEnd"/>
-      <w:r>
-        <w:t xml:space="preserve"> the same list as the one the template builder uses based off the user’s preferences to build their templates. Not all exercises in the list must be used for the templates, but all can be. This list is the one that should toggle on off with the ‘planned only’ toggles throughout the app used in alert dialogs to add exercises. Especially in templates page, wes2, and bb3.</w:t>
-      </w:r>
-    </w:p>
-    <w:p>
-      <w:r>
-        <w:br/>
-      </w:r>
-      <w:r>
-        <w:t xml:space="preserve">Can we </w:t>
-      </w:r>
-      <w:proofErr w:type="gramStart"/>
-      <w:r>
-        <w:t>actually make</w:t>
-      </w:r>
-      <w:proofErr w:type="gramEnd"/>
-      <w:r>
-        <w:t xml:space="preserve"> a change to the list showing in </w:t>
-      </w:r>
-      <w:proofErr w:type="spellStart"/>
-      <w:r>
-        <w:t>planned_blocks</w:t>
-      </w:r>
-      <w:proofErr w:type="spellEnd"/>
-      <w:r>
-        <w:t xml:space="preserve"> where the white line is? Can we </w:t>
-      </w:r>
-      <w:proofErr w:type="gramStart"/>
-      <w:r>
-        <w:t>actually instead</w:t>
-      </w:r>
-      <w:proofErr w:type="gramEnd"/>
-      <w:r>
-        <w:t xml:space="preserve"> make it show the exercise above the white line, just the exercises that are used in templates currently? Not exercises that are on candidate list but not in templates? </w:t>
-      </w:r>
-      <w:proofErr w:type="gramStart"/>
-      <w:r>
-        <w:t>So</w:t>
-      </w:r>
-      <w:proofErr w:type="gramEnd"/>
-      <w:r>
-        <w:t xml:space="preserve"> for the specific UI </w:t>
-      </w:r>
-      <w:proofErr w:type="gramStart"/>
-      <w:r>
-        <w:t>component  used</w:t>
-      </w:r>
-      <w:proofErr w:type="gramEnd"/>
-      <w:r>
-        <w:t xml:space="preserve"> in planned blocks where a white line is between two lists of alphabetised exercises, can the first list include JUST the exercises used by the current active block’s templates, and NOT also the exercises in the candidate list but not used by any current template in active block. You suggested something like this before, can we make it like this now? Just for the visual UI white line separator in planned blocks, not for anything functional with this change please</w:t>
-      </w:r>
-    </w:p>
-    <w:p>
-      <w:r>
-        <w:br/>
-      </w:r>
-    </w:p>
-    <w:p>
-      <w:pPr>
-        <w:numPr>
-          <w:ilvl w:val="0"/>
-          <w:numId w:val="6"/>
-        </w:numPr>
-      </w:pPr>
-      <w:r>
-        <w:t xml:space="preserve">Can we also then check if any of the </w:t>
-      </w:r>
-      <w:proofErr w:type="spellStart"/>
-      <w:r>
-        <w:t>warmupservice</w:t>
-      </w:r>
-      <w:proofErr w:type="spellEnd"/>
-      <w:r>
-        <w:t xml:space="preserve"> functions are necessary anymore? They might be tied only to </w:t>
-      </w:r>
-      <w:proofErr w:type="spellStart"/>
-      <w:r>
-        <w:t>workout_entry_screen</w:t>
-      </w:r>
-      <w:proofErr w:type="spellEnd"/>
-      <w:r>
-        <w:t xml:space="preserve"> and Camp_BB2, which we have now replaced and use WES2, and BB3 instead. Check this is safe and </w:t>
-      </w:r>
-      <w:proofErr w:type="spellStart"/>
-      <w:proofErr w:type="gramStart"/>
-      <w:r>
-        <w:t>their</w:t>
-      </w:r>
-      <w:proofErr w:type="gramEnd"/>
-      <w:r>
-        <w:t xml:space="preserve"> are</w:t>
-      </w:r>
-      <w:proofErr w:type="spellEnd"/>
-      <w:r>
-        <w:t xml:space="preserve"> now problems with removing it first, and that </w:t>
-      </w:r>
-      <w:proofErr w:type="gramStart"/>
-      <w:r>
-        <w:t>it</w:t>
-      </w:r>
-      <w:proofErr w:type="gramEnd"/>
-      <w:r>
-        <w:t xml:space="preserve"> </w:t>
-      </w:r>
-      <w:proofErr w:type="spellStart"/>
-      <w:r>
-        <w:t>wont</w:t>
-      </w:r>
-      <w:proofErr w:type="spellEnd"/>
-      <w:r>
-        <w:t xml:space="preserve"> effect the newer pages and flow of app in anyway. Then can we also check the Isar files? I think only </w:t>
-      </w:r>
-      <w:proofErr w:type="spellStart"/>
-      <w:r>
-        <w:t>claude_bullet</w:t>
-      </w:r>
-      <w:proofErr w:type="spellEnd"/>
-      <w:r>
-        <w:t xml:space="preserve"> functions are used now, in those pages. We want to clear the way for the new </w:t>
-      </w:r>
-      <w:proofErr w:type="spellStart"/>
-      <w:r>
-        <w:t>isar</w:t>
-      </w:r>
-      <w:proofErr w:type="spellEnd"/>
-      <w:r>
-        <w:t xml:space="preserve"> files coming, which will be used by WES2 and possibly bb3, but the old ones are built ineffectively, and </w:t>
-      </w:r>
-      <w:proofErr w:type="spellStart"/>
-      <w:proofErr w:type="gramStart"/>
-      <w:r>
-        <w:t>wont</w:t>
-      </w:r>
-      <w:proofErr w:type="spellEnd"/>
-      <w:proofErr w:type="gramEnd"/>
-      <w:r>
-        <w:t xml:space="preserve"> be needed anymore, just check </w:t>
-      </w:r>
-      <w:proofErr w:type="spellStart"/>
-      <w:r>
-        <w:t>its</w:t>
-      </w:r>
-      <w:proofErr w:type="spellEnd"/>
-      <w:r>
-        <w:t xml:space="preserve"> only those two we need. </w:t>
-      </w:r>
-    </w:p>
-    <w:p>
-      <w:r>
-        <w:br/>
-      </w:r>
-    </w:p>
-    <w:p>
-      <w:pPr>
-        <w:numPr>
-          <w:ilvl w:val="0"/>
-          <w:numId w:val="7"/>
-        </w:numPr>
-      </w:pPr>
-      <w:r>
-        <w:t>Make obvious what to do next once account created.</w:t>
-      </w:r>
-    </w:p>
-    <w:p>
-      <w:r>
-        <w:lastRenderedPageBreak/>
-        <w:t xml:space="preserve">Can we make sure the following two changes give an extremely high value, premium feel please? </w:t>
-      </w:r>
-      <w:r>
-        <w:br/>
-      </w:r>
-      <w:r>
-        <w:t>5.a Can we make it easier / more obvious for a new user to understand what to do next after successful account creation? We want to direct them to workout planner so that they can see their new workouts and easily change the workouts there. Drag and drop to re-order, drag to bin to delete, tap to replace, tap add circuit to add circuit to workout. </w:t>
-      </w:r>
-      <w:r>
-        <w:br/>
-        <w:t xml:space="preserve">Can we first include on </w:t>
-      </w:r>
-      <w:proofErr w:type="spellStart"/>
-      <w:r>
-        <w:t>homescreen</w:t>
-      </w:r>
-      <w:proofErr w:type="spellEnd"/>
-      <w:r>
-        <w:t xml:space="preserve"> a conditional visual cue? So that if the user is new and has never opened </w:t>
-      </w:r>
-      <w:proofErr w:type="spellStart"/>
-      <w:r>
-        <w:t>workoutplanner</w:t>
-      </w:r>
-      <w:proofErr w:type="spellEnd"/>
-      <w:r>
-        <w:t xml:space="preserve"> (from quick access, navigates to </w:t>
-      </w:r>
-      <w:proofErr w:type="spellStart"/>
-      <w:proofErr w:type="gramStart"/>
-      <w:r>
-        <w:t>templates.dart</w:t>
-      </w:r>
-      <w:proofErr w:type="spellEnd"/>
-      <w:proofErr w:type="gramEnd"/>
-      <w:r>
-        <w:t xml:space="preserve">) before, then workout planner should have a glowing highlighted border that slowly changes colour, and a little indicator to ‘tap here first’ with minimal or no padding, directly above the panel. Then when opened, while page is loading in the background a screen recording can play within the visible screen space, that shows exercises being re-ordered, deleted, replaced and added. Once the user has opened workout planner AND screen recording has completed once at least, the visual cue to open workout planner panel goes away. </w:t>
-      </w:r>
-      <w:r>
-        <w:t>Could we set that up, would that be easy enough?</w:t>
-      </w:r>
-    </w:p>
-    <w:p>
-      <w:r>
-        <w:t xml:space="preserve">5.b </w:t>
-      </w:r>
-      <w:r>
-        <w:t>Then once workout planner has been opened once, and screen there finished once,</w:t>
-      </w:r>
-      <w:r>
-        <w:t xml:space="preserve"> can we</w:t>
-      </w:r>
-      <w:r>
-        <w:t xml:space="preserve"> next</w:t>
-      </w:r>
-      <w:r>
-        <w:t xml:space="preserve"> direct their attention to WES2, labelled ‘Enter Workout’ in the app</w:t>
-      </w:r>
-      <w:r>
-        <w:t>, top left panel for non-coach users</w:t>
-      </w:r>
-      <w:r>
-        <w:t xml:space="preserve">. </w:t>
-      </w:r>
-      <w:r>
-        <w:t xml:space="preserve">So should be </w:t>
-      </w:r>
-      <w:proofErr w:type="spellStart"/>
-      <w:r>
-        <w:t>color</w:t>
-      </w:r>
-      <w:proofErr w:type="spellEnd"/>
-      <w:r>
-        <w:t xml:space="preserve">-changing border again, with ‘tap here’ above it, no padding. </w:t>
-      </w:r>
-      <w:r>
-        <w:t xml:space="preserve">We want to make it super clear how to enter values for each field when training. </w:t>
-      </w:r>
-      <w:r>
-        <w:t>So, on first WES2 screen open, can the weight field get a highlighted square border around the value and a comment showing from it that is like an alert, can be layered over other items on screen</w:t>
-      </w:r>
-      <w:r>
-        <w:t>, just to the right and a bit above the weight field, so looks like a label or note coming off it, d</w:t>
-      </w:r>
-      <w:r>
-        <w:t>on’t visually block rep target, showing: “Enter a weight you can do for this exercise at the given rep target” and a ‘close’ label button, that when tapped closes it. Then once that is closed, another similar highlighted square border shows around rep target, with the words: “</w:t>
-      </w:r>
-      <w:r>
-        <w:t>Double tap to accept suggestion, type in to enter something different</w:t>
-      </w:r>
-      <w:r>
-        <w:t>.” And a ‘close’ label. Then, once that is closed, the same thing shows around RIR target saying: “</w:t>
-      </w:r>
-    </w:p>
-    <w:p>
-      <w:r>
-        <w:br/>
-      </w:r>
-    </w:p>
-    <w:p>
-      <w:r>
-        <w:t>Make seeking online training more accessible/ easy</w:t>
-      </w:r>
-    </w:p>
-    <w:p>
-      <w:r>
-        <w:br/>
-      </w:r>
-      <w:r>
-        <w:br/>
-      </w:r>
-      <w:r>
-        <w:t>Circuit logic wes2 needs to be fixed, UI improved.</w:t>
-      </w:r>
-    </w:p>
-    <w:p>
-      <w:r>
-        <w:br/>
-        <w:t xml:space="preserve">Next thing to implement is live edits updating on multiple devices, including last write win rules. Can you summarise spec doc requirements on that please? </w:t>
-      </w:r>
-    </w:p>
-    <w:p/>
-    <w:p>
-      <w:r>
-        <w:lastRenderedPageBreak/>
-        <w:t xml:space="preserve">7. Can we change friend notification icon to show add friend pop up </w:t>
-      </w:r>
-      <w:proofErr w:type="spellStart"/>
-      <w:r>
-        <w:t>along side</w:t>
-      </w:r>
-      <w:proofErr w:type="spellEnd"/>
-      <w:r>
         <w:t xml:space="preserve"> notifications of new friends please.</w:t>
       </w:r>
     </w:p>
-    <w:p/>
-    <w:p>
-      <w:r>
-        <w:t>1. In settings cog wheel, make RIR subtly indicate which instance index we are on. Normally the same as current rep target weekly index.</w:t>
+    <w:p>
+      <w:pPr>
+        <w:rPr>
+          <w:i/>
+          <w:iCs/>
+        </w:rPr>
+      </w:pPr>
+      <w:r>
+        <w:br/>
       </w:r>
     </w:p>
     <w:p/>
     <w:p/>
-    <w:p>
-      <w:r>
-        <w:t>3. Completed exercise pill better, last exercise</w:t>
-      </w:r>
-    </w:p>
     <w:p/>
+    <w:p>
+      <w:r>
+        <w:t>BB3 updates</w:t>
+      </w:r>
+    </w:p>
+    <w:p>
+      <w:r>
+        <w:br/>
+      </w:r>
+      <w:r>
+        <w:br/>
+      </w:r>
+      <w:r>
+        <w:br/>
+      </w:r>
+      <w:r>
+        <w:br/>
+      </w:r>
+      <w:r>
+        <w:br/>
+        <w:t>Home screen additions to go to spec doc:</w:t>
+      </w:r>
+    </w:p>
     <w:p/>
     <w:p>
-      <w:r>
-        <w:t>BB3 updates</w:t>
-      </w:r>
-    </w:p>
-    <w:p>
-      <w:r>
-        <w:br/>
-      </w:r>
-      <w:r>
-        <w:br/>
-      </w:r>
-      <w:r>
-        <w:br/>
-      </w:r>
-      <w:r>
-        <w:br/>
-      </w:r>
-      <w:r>
-        <w:br/>
-        <w:t>Home screen additions to go to spec doc:</w:t>
-      </w:r>
-    </w:p>
-    <w:p/>
-    <w:p>
-      <w:r>
-        <w:t xml:space="preserve">Can we update home screen UI? Right </w:t>
-      </w:r>
-      <w:proofErr w:type="gramStart"/>
-      <w:r>
-        <w:t>now</w:t>
-      </w:r>
-      <w:proofErr w:type="gramEnd"/>
-      <w:r>
-        <w:t xml:space="preserve"> what you see when you first log in is taken up mostly calendar picker, with a quick access menu above it, and the start of the home feed beneath it. We want to make </w:t>
-      </w:r>
-      <w:proofErr w:type="gramStart"/>
-      <w:r>
-        <w:t>the majority of</w:t>
-      </w:r>
-      <w:proofErr w:type="gramEnd"/>
-      <w:r>
-        <w:t xml:space="preserve"> the visual space shown on home screen after first app open, before navigating anywhere horizontally or vertically, a panel like the quick access menu, but for that to be two rows across, rather than one. You should still be able to scroll right to see the rest of the menu items in quick access, now showing across two rows instead of one, and the scroll should move both rows together and not be independent (don’t over signpost), the first 4 panels you should see in quick access should be:</w:t>
-      </w:r>
-      <w:r>
-        <w:br/>
-        <w:t>Enter workout (top left)</w:t>
-      </w:r>
-      <w:r>
-        <w:br/>
-        <w:t>Workout planner (right of enter workout)</w:t>
-      </w:r>
-      <w:r>
-        <w:br/>
-        <w:t>Body weight tracker (bottom left)</w:t>
-      </w:r>
-      <w:r>
-        <w:br/>
-        <w:t>Profile (right of body weight picker) not a new page, but new to quick access menu</w:t>
-      </w:r>
-      <w:r>
-        <w:br/>
-        <w:t>Then slightly off screen, Planned blocks (right of workout planner)</w:t>
-      </w:r>
-      <w:r>
-        <w:br/>
-        <w:t>Also</w:t>
-      </w:r>
-      <w:r>
-        <w:t xml:space="preserve"> slightly off screen</w:t>
-      </w:r>
-      <w:r>
-        <w:t>, week planner</w:t>
-      </w:r>
-      <w:r>
-        <w:br/>
-        <w:t>Then right of planned blocks, User settings</w:t>
-      </w:r>
-      <w:r>
-        <w:t xml:space="preserve"> (not new page but new navigation added to quick access)</w:t>
-      </w:r>
-      <w:r>
-        <w:br/>
-      </w:r>
-      <w:r>
-        <w:br/>
-      </w:r>
-      <w:r>
-        <w:lastRenderedPageBreak/>
-        <w:t>So the quick access now takes up two rows, as described above, with the 4 primary tabs visible on screen before horizontal scroll to right require to see the rest, and those 4 primary panels are, ‘Enter Workout’, Workout Planner’, ‘Body Weight Tracker’, ‘Profile’</w:t>
-      </w:r>
-      <w:r>
-        <w:br/>
-      </w:r>
-      <w:r>
-        <w:br/>
-        <w:t xml:space="preserve">Then beneath that, we should have calendar (can remove the row that shows picker between calendar and top lifts – just show calendar, with now heading row above it), and then after that the feed picker showing between the 3 feeds as already doing. </w:t>
-      </w:r>
-      <w:r>
-        <w:br/>
-      </w:r>
-      <w:r>
-        <w:br/>
-        <w:t xml:space="preserve">Can you help me with </w:t>
-      </w:r>
-      <w:proofErr w:type="spellStart"/>
-      <w:r>
-        <w:t>claude</w:t>
-      </w:r>
-      <w:proofErr w:type="spellEnd"/>
-      <w:r>
-        <w:t xml:space="preserve"> code propose plan then wait, for this please?</w:t>
-      </w:r>
       <w:r>
         <w:br/>
       </w:r>
@@ -2237,7 +1785,6 @@
   <w:style w:type="character" w:default="1" w:styleId="DefaultParagraphFont">
     <w:name w:val="Default Paragraph Font"/>
     <w:uiPriority w:val="1"/>
-    <w:semiHidden/>
     <w:unhideWhenUsed/>
   </w:style>
   <w:style w:type="table" w:default="1" w:styleId="TableNormal">

</xml_diff>

<commit_message>
refined calendar home screen 2
</commit_message>
<xml_diff>
--- a/docs/wes2/Next fix bb3 notes, plus circuits.docx
+++ b/docs/wes2/Next fix bb3 notes, plus circuits.docx
@@ -34,7 +34,11 @@
         <w:t>Legacy template load bb3</w:t>
       </w:r>
     </w:p>
-    <w:p/>
+    <w:p>
+      <w:r>
+        <w:t>Circuit logic wes2 needs to be fixed, UI improved.</w:t>
+      </w:r>
+    </w:p>
     <w:p/>
     <w:p>
       <w:r>
@@ -51,31 +55,16 @@
         <w:br/>
       </w:r>
       <w:r>
-        <w:br/>
+        <w:rPr>
+          <w:i/>
+          <w:iCs/>
+        </w:rPr>
+        <w:t>General</w:t>
       </w:r>
     </w:p>
     <w:p>
       <w:r>
-        <w:br/>
-      </w:r>
-      <w:r>
-        <w:br/>
-      </w:r>
-    </w:p>
-    <w:p>
-      <w:r>
         <w:t>Make seeking online training more accessible/ easy</w:t>
-      </w:r>
-    </w:p>
-    <w:p>
-      <w:r>
-        <w:br/>
-      </w:r>
-      <w:r>
-        <w:br/>
-      </w:r>
-      <w:r>
-        <w:t>Circuit logic wes2 needs to be fixed, UI improved.</w:t>
       </w:r>
     </w:p>
     <w:p>
@@ -150,6 +139,7 @@
         <w:br/>
       </w:r>
       <w:r>
+        <w:lastRenderedPageBreak/>
         <w:br/>
       </w:r>
       <w:r>
@@ -1785,6 +1775,7 @@
   <w:style w:type="character" w:default="1" w:styleId="DefaultParagraphFont">
     <w:name w:val="Default Paragraph Font"/>
     <w:uiPriority w:val="1"/>
+    <w:semiHidden/>
     <w:unhideWhenUsed/>
   </w:style>
   <w:style w:type="table" w:default="1" w:styleId="TableNormal">

</xml_diff>

<commit_message>
Make HomeScreen2 the default home screen
</commit_message>
<xml_diff>
--- a/docs/wes2/Next fix bb3 notes, plus circuits.docx
+++ b/docs/wes2/Next fix bb3 notes, plus circuits.docx
@@ -19,26 +19,76 @@
     <w:p/>
     <w:p>
       <w:r>
-        <w:t>1. In settings cog wheel, make RIR subtly indicate which instance index we are on. Normally the same as current rep target weekly index.</w:t>
+        <w:t>Set 2 and beyond weight should not increase higher than previous set</w:t>
+      </w:r>
+      <w:r>
+        <w:t>. Can we add logic to cap set 2 weight and beyond at the same weight or lower than the first set weight? Exception to this rule: If first set RIR is higher than 2.5. then 2</w:t>
+      </w:r>
+      <w:r>
+        <w:rPr>
+          <w:vertAlign w:val="superscript"/>
+        </w:rPr>
+        <w:t>nd</w:t>
+      </w:r>
+      <w:r>
+        <w:t xml:space="preserve"> set or beyond weight is allowed to increase. Otherwise not. If RIR for first set is at or lower than 2.5 then 2</w:t>
+      </w:r>
+      <w:r>
+        <w:rPr>
+          <w:vertAlign w:val="superscript"/>
+        </w:rPr>
+        <w:t>nd</w:t>
+      </w:r>
+      <w:r>
+        <w:t xml:space="preserve"> 2 and beyond weight should not be higher. Same rule should apply to cascading sets after set 2. For example, if set 2 has RIR &gt; 2.5 then weight for set 3 is allowed to be higher, of RIR equal to or lower than 2.5 then weight for set 3 can be the same as set 2, or lower, but not higher. Same should apply for following sets after that, etc. restate this in your own words please. </w:t>
       </w:r>
     </w:p>
     <w:p/>
     <w:p>
       <w:r>
-        <w:t>3. Completed exercise pill better, last exercise</w:t>
+        <w:t xml:space="preserve">Can we make the No internet error message more </w:t>
+      </w:r>
+      <w:proofErr w:type="gramStart"/>
+      <w:r>
+        <w:t>premium  please</w:t>
+      </w:r>
+      <w:proofErr w:type="gramEnd"/>
+      <w:r>
+        <w:t xml:space="preserve">? See screen shot x for example of what it currently is. What customer facing message would you expect here for a </w:t>
+      </w:r>
+      <w:proofErr w:type="gramStart"/>
+      <w:r>
+        <w:t>top of the line</w:t>
+      </w:r>
+      <w:proofErr w:type="gramEnd"/>
+      <w:r>
+        <w:t xml:space="preserve"> premium workout app? </w:t>
       </w:r>
     </w:p>
     <w:p/>
     <w:p>
       <w:r>
-        <w:t>Legacy template load bb3</w:t>
+        <w:t>Can we change the Default</w:t>
+      </w:r>
+      <w:r>
+        <w:t xml:space="preserve"> RIR for extra added set should be the same as most recent set, copied from</w:t>
+      </w:r>
+      <w:r>
+        <w:t xml:space="preserve"> whatever the last set’s RIR was, please? Rather than current default of </w:t>
+      </w:r>
+      <w:r>
+        <w:t>1</w:t>
       </w:r>
     </w:p>
+    <w:p/>
     <w:p>
       <w:r>
-        <w:t>Circuit logic wes2 needs to be fixed, UI improved.</w:t>
+        <w:br/>
+        <w:t xml:space="preserve">Next thing to implement is live edits updating on multiple devices, including last write win rules. Can you summarise spec doc requirements on that please? </w:t>
       </w:r>
     </w:p>
+    <w:p/>
+    <w:p/>
     <w:p/>
     <w:p>
       <w:r>
@@ -70,7 +120,75 @@
     <w:p>
       <w:r>
         <w:br/>
-        <w:t xml:space="preserve">Next thing to implement is live edits updating on multiple devices, including last write win rules. Can you summarise spec doc requirements on that please? </w:t>
+      </w:r>
+      <w:r>
+        <w:br/>
+        <w:t xml:space="preserve">The app takes too long to open for an already logged in account. If the app gets </w:t>
+      </w:r>
+      <w:r>
+        <w:lastRenderedPageBreak/>
+        <w:t xml:space="preserve">backgrounded, it often automatically closes, and then it takes ages to open again and navigate back to the </w:t>
+      </w:r>
+      <w:proofErr w:type="gramStart"/>
+      <w:r>
+        <w:t>half completed</w:t>
+      </w:r>
+      <w:proofErr w:type="gramEnd"/>
+      <w:r>
+        <w:t xml:space="preserve"> workout. Can we somehow make this less likely to close when it is backgrounded and the device is being used to video record a set, and music being changed etc, and then can we make the page open instantly on re-open? </w:t>
+      </w:r>
+      <w:r>
+        <w:br/>
+      </w:r>
+      <w:r>
+        <w:br/>
+      </w:r>
+      <w:r>
+        <w:t>Add a clear warning to account deletion</w:t>
+      </w:r>
+      <w:r>
+        <w:t xml:space="preserve">: </w:t>
+      </w:r>
+      <w:r>
+        <w:t>Deleting your GoodLift account does not cancel an active subscription. Cancel your subscription separately through Apple or your billing provider.</w:t>
+      </w:r>
+      <w:r>
+        <w:br/>
+      </w:r>
+      <w:r>
+        <w:br/>
+      </w:r>
+      <w:r>
+        <w:t>Ensure Meta tracking is properly disclosed and confirm the Apple ATT configuration.</w:t>
+      </w:r>
+      <w:r>
+        <w:t xml:space="preserve"> </w:t>
+      </w:r>
+      <w:r>
+        <w:t>This is mainly a store-compliance risk rather than a conversion improvement, but it should not be left ambiguous.</w:t>
+      </w:r>
+    </w:p>
+    <w:p>
+      <w:pPr>
+        <w:rPr>
+          <w:i/>
+          <w:iCs/>
+        </w:rPr>
+      </w:pPr>
+      <w:r>
+        <w:br/>
+      </w:r>
+      <w:r>
+        <w:rPr>
+          <w:i/>
+          <w:iCs/>
+        </w:rPr>
+        <w:t>Graphs</w:t>
+      </w:r>
+    </w:p>
+    <w:p>
+      <w:r>
+        <w:t>Make specific dates selectable</w:t>
       </w:r>
     </w:p>
     <w:p>
@@ -127,7 +245,17 @@
     <w:p/>
     <w:p/>
     <w:p>
-      <w:r>
+      <w:pPr>
+        <w:rPr>
+          <w:i/>
+          <w:iCs/>
+        </w:rPr>
+      </w:pPr>
+      <w:r>
+        <w:rPr>
+          <w:i/>
+          <w:iCs/>
+        </w:rPr>
         <w:t>BB3 updates</w:t>
       </w:r>
     </w:p>
@@ -136,22 +264,48 @@
         <w:br/>
       </w:r>
       <w:r>
-        <w:br/>
-      </w:r>
-      <w:r>
-        <w:lastRenderedPageBreak/>
-        <w:br/>
-      </w:r>
-      <w:r>
-        <w:br/>
-      </w:r>
-      <w:r>
-        <w:br/>
-        <w:t>Home screen additions to go to spec doc:</w:t>
+        <w:t xml:space="preserve">Can we next please Make notes recorded in wes2 appear in bb3 as notes written in bb3 appear in wes2. There needs to be some visual cue that there is an execution note from the exercise in general for the header, or specific set if per set. Note icon </w:t>
+      </w:r>
+      <w:proofErr w:type="spellStart"/>
+      <w:r>
+        <w:t>color</w:t>
+      </w:r>
+      <w:proofErr w:type="spellEnd"/>
+      <w:r>
+        <w:t xml:space="preserve"> should change, tapping should open. Describe in your own words first, discuss your solution with me first too.</w:t>
+      </w:r>
+      <w:r>
+        <w:br/>
+      </w:r>
+      <w:r>
+        <w:br/>
+      </w:r>
+      <w:r>
+        <w:br/>
+      </w:r>
+      <w:r>
+        <w:br/>
+      </w:r>
+      <w:r>
+        <w:rPr>
+          <w:i/>
+          <w:iCs/>
+        </w:rPr>
+        <w:t xml:space="preserve">Home screen </w:t>
+      </w:r>
+      <w:r>
+        <w:rPr>
+          <w:i/>
+          <w:iCs/>
+        </w:rPr>
+        <w:t>updates</w:t>
       </w:r>
     </w:p>
     <w:p/>
     <w:p>
+      <w:r>
+        <w:t xml:space="preserve">Can we now make homeScreenV2 the main home screen please? It should be the screen users are navigated to once logged in, and if opening app from an already logged in state, the first page that shows. </w:t>
+      </w:r>
       <w:r>
         <w:br/>
       </w:r>
@@ -354,6 +508,95 @@
 <file path=word/numbering.xml><?xml version="1.0" encoding="utf-8"?>
 <w:numbering xmlns:wpc="http://schemas.microsoft.com/office/word/2010/wordprocessingCanvas" xmlns:cx="http://schemas.microsoft.com/office/drawing/2014/chartex" xmlns:cx1="http://schemas.microsoft.com/office/drawing/2015/9/8/chartex" xmlns:cx2="http://schemas.microsoft.com/office/drawing/2015/10/21/chartex" xmlns:cx3="http://schemas.microsoft.com/office/drawing/2016/5/9/chartex" xmlns:cx4="http://schemas.microsoft.com/office/drawing/2016/5/10/chartex" xmlns:cx5="http://schemas.microsoft.com/office/drawing/2016/5/11/chartex" xmlns:cx6="http://schemas.microsoft.com/office/drawing/2016/5/12/chartex" xmlns:cx7="http://schemas.microsoft.com/office/drawing/2016/5/13/chartex" xmlns:cx8="http://schemas.microsoft.com/office/drawing/2016/5/14/chartex" xmlns:mc="http://schemas.openxmlformats.org/markup-compatibility/2006" xmlns:aink="http://schemas.microsoft.com/office/drawing/2016/ink" xmlns:am3d="http://schemas.microsoft.com/office/drawing/2017/model3d" xmlns:o="urn:schemas-microsoft-com:office:office" xmlns:oel="http://schemas.microsoft.com/office/2019/extlst" xmlns:r="http://schemas.openxmlformats.org/officeDocument/2006/relationships" xmlns:m="http://schemas.openxmlformats.org/officeDocument/2006/math" xmlns:v="urn:schemas-microsoft-com:vml" xmlns:wp14="http://schemas.microsoft.com/office/word/2010/wordprocessingDrawing" xmlns:wp="http://schemas.openxmlformats.org/drawingml/2006/wordprocessingDrawing" xmlns:w10="urn:schemas-microsoft-com:office:word" xmlns:w="http://schemas.openxmlformats.org/wordprocessingml/2006/main" xmlns:w14="http://schemas.microsoft.com/office/word/2010/wordml" xmlns:w15="http://schemas.microsoft.com/office/word/2012/wordml" xmlns:w16cex="http://schemas.microsoft.com/office/word/2018/wordml/cex" xmlns:w16cid="http://schemas.microsoft.com/office/word/2016/wordml/cid" xmlns:w16="http://schemas.microsoft.com/office/word/2018/wordml" xmlns:w16du="http://schemas.microsoft.com/office/word/2023/wordml/word16du" xmlns:w16sdtdh="http://schemas.microsoft.com/office/word/2020/wordml/sdtdatahash" xmlns:w16sdtfl="http://schemas.microsoft.com/office/word/2024/wordml/sdtformatlock" xmlns:w16se="http://schemas.microsoft.com/office/word/2015/wordml/symex" xmlns:wpg="http://schemas.microsoft.com/office/word/2010/wordprocessingGroup" xmlns:wpi="http://schemas.microsoft.com/office/word/2010/wordprocessingInk" xmlns:wne="http://schemas.microsoft.com/office/word/2006/wordml" xmlns:wps="http://schemas.microsoft.com/office/word/2010/wordprocessingShape" mc:Ignorable="w14 w15 w16se w16cid w16 w16cex w16sdtdh w16sdtfl w16du wp14">
   <w:abstractNum w:abstractNumId="0" w15:restartNumberingAfterBreak="0">
+    <w:nsid w:val="04111C78"/>
+    <w:multiLevelType w:val="hybridMultilevel"/>
+    <w:tmpl w:val="33709F7A"/>
+    <w:lvl w:ilvl="0" w:tplc="1409000F">
+      <w:start w:val="1"/>
+      <w:numFmt w:val="decimal"/>
+      <w:lvlText w:val="%1."/>
+      <w:lvlJc w:val="left"/>
+      <w:pPr>
+        <w:ind w:left="720" w:hanging="360"/>
+      </w:pPr>
+      <w:rPr>
+        <w:rFonts w:hint="default"/>
+      </w:rPr>
+    </w:lvl>
+    <w:lvl w:ilvl="1" w:tplc="14090019" w:tentative="1">
+      <w:start w:val="1"/>
+      <w:numFmt w:val="lowerLetter"/>
+      <w:lvlText w:val="%2."/>
+      <w:lvlJc w:val="left"/>
+      <w:pPr>
+        <w:ind w:left="1440" w:hanging="360"/>
+      </w:pPr>
+    </w:lvl>
+    <w:lvl w:ilvl="2" w:tplc="1409001B" w:tentative="1">
+      <w:start w:val="1"/>
+      <w:numFmt w:val="lowerRoman"/>
+      <w:lvlText w:val="%3."/>
+      <w:lvlJc w:val="right"/>
+      <w:pPr>
+        <w:ind w:left="2160" w:hanging="180"/>
+      </w:pPr>
+    </w:lvl>
+    <w:lvl w:ilvl="3" w:tplc="1409000F" w:tentative="1">
+      <w:start w:val="1"/>
+      <w:numFmt w:val="decimal"/>
+      <w:lvlText w:val="%4."/>
+      <w:lvlJc w:val="left"/>
+      <w:pPr>
+        <w:ind w:left="2880" w:hanging="360"/>
+      </w:pPr>
+    </w:lvl>
+    <w:lvl w:ilvl="4" w:tplc="14090019" w:tentative="1">
+      <w:start w:val="1"/>
+      <w:numFmt w:val="lowerLetter"/>
+      <w:lvlText w:val="%5."/>
+      <w:lvlJc w:val="left"/>
+      <w:pPr>
+        <w:ind w:left="3600" w:hanging="360"/>
+      </w:pPr>
+    </w:lvl>
+    <w:lvl w:ilvl="5" w:tplc="1409001B" w:tentative="1">
+      <w:start w:val="1"/>
+      <w:numFmt w:val="lowerRoman"/>
+      <w:lvlText w:val="%6."/>
+      <w:lvlJc w:val="right"/>
+      <w:pPr>
+        <w:ind w:left="4320" w:hanging="180"/>
+      </w:pPr>
+    </w:lvl>
+    <w:lvl w:ilvl="6" w:tplc="1409000F" w:tentative="1">
+      <w:start w:val="1"/>
+      <w:numFmt w:val="decimal"/>
+      <w:lvlText w:val="%7."/>
+      <w:lvlJc w:val="left"/>
+      <w:pPr>
+        <w:ind w:left="5040" w:hanging="360"/>
+      </w:pPr>
+    </w:lvl>
+    <w:lvl w:ilvl="7" w:tplc="14090019" w:tentative="1">
+      <w:start w:val="1"/>
+      <w:numFmt w:val="lowerLetter"/>
+      <w:lvlText w:val="%8."/>
+      <w:lvlJc w:val="left"/>
+      <w:pPr>
+        <w:ind w:left="5760" w:hanging="360"/>
+      </w:pPr>
+    </w:lvl>
+    <w:lvl w:ilvl="8" w:tplc="1409001B" w:tentative="1">
+      <w:start w:val="1"/>
+      <w:numFmt w:val="lowerRoman"/>
+      <w:lvlText w:val="%9."/>
+      <w:lvlJc w:val="right"/>
+      <w:pPr>
+        <w:ind w:left="6480" w:hanging="180"/>
+      </w:pPr>
+    </w:lvl>
+  </w:abstractNum>
+  <w:abstractNum w:abstractNumId="1" w15:restartNumberingAfterBreak="0">
     <w:nsid w:val="217D6479"/>
     <w:multiLevelType w:val="multilevel"/>
     <w:tmpl w:val="9D74146C"/>
@@ -466,7 +709,7 @@
       </w:pPr>
     </w:lvl>
   </w:abstractNum>
-  <w:abstractNum w:abstractNumId="1" w15:restartNumberingAfterBreak="0">
+  <w:abstractNum w:abstractNumId="2" w15:restartNumberingAfterBreak="0">
     <w:nsid w:val="220F502C"/>
     <w:multiLevelType w:val="multilevel"/>
     <w:tmpl w:val="BBCC09F0"/>
@@ -579,7 +822,7 @@
       </w:pPr>
     </w:lvl>
   </w:abstractNum>
-  <w:abstractNum w:abstractNumId="2" w15:restartNumberingAfterBreak="0">
+  <w:abstractNum w:abstractNumId="3" w15:restartNumberingAfterBreak="0">
     <w:nsid w:val="25F61545"/>
     <w:multiLevelType w:val="multilevel"/>
     <w:tmpl w:val="388E266A"/>
@@ -692,7 +935,7 @@
       </w:pPr>
     </w:lvl>
   </w:abstractNum>
-  <w:abstractNum w:abstractNumId="3" w15:restartNumberingAfterBreak="0">
+  <w:abstractNum w:abstractNumId="4" w15:restartNumberingAfterBreak="0">
     <w:nsid w:val="2CAD29D7"/>
     <w:multiLevelType w:val="multilevel"/>
     <w:tmpl w:val="B8CE4DF2"/>
@@ -805,7 +1048,7 @@
       </w:pPr>
     </w:lvl>
   </w:abstractNum>
-  <w:abstractNum w:abstractNumId="4" w15:restartNumberingAfterBreak="0">
+  <w:abstractNum w:abstractNumId="5" w15:restartNumberingAfterBreak="0">
     <w:nsid w:val="39250F5E"/>
     <w:multiLevelType w:val="hybridMultilevel"/>
     <w:tmpl w:val="F3F8F17E"/>
@@ -918,7 +1161,7 @@
       </w:rPr>
     </w:lvl>
   </w:abstractNum>
-  <w:abstractNum w:abstractNumId="5" w15:restartNumberingAfterBreak="0">
+  <w:abstractNum w:abstractNumId="6" w15:restartNumberingAfterBreak="0">
     <w:nsid w:val="55AA15FF"/>
     <w:multiLevelType w:val="multilevel"/>
     <w:tmpl w:val="37F06F90"/>
@@ -1031,7 +1274,7 @@
       </w:pPr>
     </w:lvl>
   </w:abstractNum>
-  <w:abstractNum w:abstractNumId="6" w15:restartNumberingAfterBreak="0">
+  <w:abstractNum w:abstractNumId="7" w15:restartNumberingAfterBreak="0">
     <w:nsid w:val="6A64573E"/>
     <w:multiLevelType w:val="hybridMultilevel"/>
     <w:tmpl w:val="7EA88296"/>
@@ -1121,15 +1364,35 @@
     </w:lvl>
   </w:abstractNum>
   <w:num w:numId="1" w16cid:durableId="1524397689">
-    <w:abstractNumId w:val="6"/>
+    <w:abstractNumId w:val="7"/>
   </w:num>
   <w:num w:numId="2" w16cid:durableId="642201778">
-    <w:abstractNumId w:val="4"/>
+    <w:abstractNumId w:val="5"/>
   </w:num>
   <w:num w:numId="3" w16cid:durableId="1494177121">
-    <w:abstractNumId w:val="1"/>
+    <w:abstractNumId w:val="2"/>
   </w:num>
   <w:num w:numId="4" w16cid:durableId="582567519">
+    <w:abstractNumId w:val="4"/>
+    <w:lvlOverride w:ilvl="0">
+      <w:lvl w:ilvl="0">
+        <w:numFmt w:val="decimal"/>
+        <w:lvlText w:val="%1."/>
+        <w:lvlJc w:val="left"/>
+      </w:lvl>
+    </w:lvlOverride>
+  </w:num>
+  <w:num w:numId="5" w16cid:durableId="1480464158">
+    <w:abstractNumId w:val="1"/>
+    <w:lvlOverride w:ilvl="0">
+      <w:lvl w:ilvl="0">
+        <w:numFmt w:val="decimal"/>
+        <w:lvlText w:val="%1."/>
+        <w:lvlJc w:val="left"/>
+      </w:lvl>
+    </w:lvlOverride>
+  </w:num>
+  <w:num w:numId="6" w16cid:durableId="1232234847">
     <w:abstractNumId w:val="3"/>
     <w:lvlOverride w:ilvl="0">
       <w:lvl w:ilvl="0">
@@ -1139,8 +1402,8 @@
       </w:lvl>
     </w:lvlOverride>
   </w:num>
-  <w:num w:numId="5" w16cid:durableId="1480464158">
-    <w:abstractNumId w:val="0"/>
+  <w:num w:numId="7" w16cid:durableId="942613188">
+    <w:abstractNumId w:val="6"/>
     <w:lvlOverride w:ilvl="0">
       <w:lvl w:ilvl="0">
         <w:numFmt w:val="decimal"/>
@@ -1149,25 +1412,8 @@
       </w:lvl>
     </w:lvlOverride>
   </w:num>
-  <w:num w:numId="6" w16cid:durableId="1232234847">
-    <w:abstractNumId w:val="2"/>
-    <w:lvlOverride w:ilvl="0">
-      <w:lvl w:ilvl="0">
-        <w:numFmt w:val="decimal"/>
-        <w:lvlText w:val="%1."/>
-        <w:lvlJc w:val="left"/>
-      </w:lvl>
-    </w:lvlOverride>
-  </w:num>
-  <w:num w:numId="7" w16cid:durableId="942613188">
-    <w:abstractNumId w:val="5"/>
-    <w:lvlOverride w:ilvl="0">
-      <w:lvl w:ilvl="0">
-        <w:numFmt w:val="decimal"/>
-        <w:lvlText w:val="%1."/>
-        <w:lvlJc w:val="left"/>
-      </w:lvl>
-    </w:lvlOverride>
+  <w:num w:numId="8" w16cid:durableId="1987927810">
+    <w:abstractNumId w:val="0"/>
   </w:num>
 </w:numbering>
 </file>

</xml_diff>

<commit_message>
Fixed settings cog wheel. refined colors
</commit_message>
<xml_diff>
--- a/docs/wes2/Next fix bb3 notes, plus circuits.docx
+++ b/docs/wes2/Next fix bb3 notes, plus circuits.docx
@@ -19,33 +19,6 @@
     <w:p/>
     <w:p>
       <w:r>
-        <w:t>Set 2 and beyond weight should not increase higher than previous set</w:t>
-      </w:r>
-      <w:r>
-        <w:t>. Can we add logic to cap set 2 weight and beyond at the same weight or lower than the first set weight? Exception to this rule: If first set RIR is higher than 2.5. then 2</w:t>
-      </w:r>
-      <w:r>
-        <w:rPr>
-          <w:vertAlign w:val="superscript"/>
-        </w:rPr>
-        <w:t>nd</w:t>
-      </w:r>
-      <w:r>
-        <w:t xml:space="preserve"> set or beyond weight is allowed to increase. Otherwise not. If RIR for first set is at or lower than 2.5 then 2</w:t>
-      </w:r>
-      <w:r>
-        <w:rPr>
-          <w:vertAlign w:val="superscript"/>
-        </w:rPr>
-        <w:t>nd</w:t>
-      </w:r>
-      <w:r>
-        <w:t xml:space="preserve"> 2 and beyond weight should not be higher. Same rule should apply to cascading sets after set 2. For example, if set 2 has RIR &gt; 2.5 then weight for set 3 is allowed to be higher, of RIR equal to or lower than 2.5 then weight for set 3 can be the same as set 2, or lower, but not higher. Same should apply for following sets after that, etc. restate this in your own words please. </w:t>
-      </w:r>
-    </w:p>
-    <w:p/>
-    <w:p>
-      <w:r>
         <w:t xml:space="preserve">Can we make the No internet error message more </w:t>
       </w:r>
       <w:proofErr w:type="gramStart"/>
@@ -63,21 +36,6 @@
       <w:proofErr w:type="gramEnd"/>
       <w:r>
         <w:t xml:space="preserve"> premium workout app? </w:t>
-      </w:r>
-    </w:p>
-    <w:p/>
-    <w:p>
-      <w:r>
-        <w:t>Can we change the Default</w:t>
-      </w:r>
-      <w:r>
-        <w:t xml:space="preserve"> RIR for extra added set should be the same as most recent set, copied from</w:t>
-      </w:r>
-      <w:r>
-        <w:t xml:space="preserve"> whatever the last set’s RIR was, please? Rather than current default of </w:t>
-      </w:r>
-      <w:r>
-        <w:t>1</w:t>
       </w:r>
     </w:p>
     <w:p/>
@@ -123,23 +81,9 @@
       </w:r>
       <w:r>
         <w:br/>
-        <w:t xml:space="preserve">The app takes too long to open for an already logged in account. If the app gets </w:t>
-      </w:r>
-      <w:r>
-        <w:lastRenderedPageBreak/>
-        <w:t xml:space="preserve">backgrounded, it often automatically closes, and then it takes ages to open again and navigate back to the </w:t>
-      </w:r>
-      <w:proofErr w:type="gramStart"/>
-      <w:r>
-        <w:t>half completed</w:t>
-      </w:r>
-      <w:proofErr w:type="gramEnd"/>
-      <w:r>
-        <w:t xml:space="preserve"> workout. Can we somehow make this less likely to close when it is backgrounded and the device is being used to video record a set, and music being changed etc, and then can we make the page open instantly on re-open? </w:t>
-      </w:r>
-      <w:r>
-        <w:br/>
-      </w:r>
+      </w:r>
+    </w:p>
+    <w:p>
       <w:r>
         <w:br/>
       </w:r>
@@ -216,6 +160,7 @@
     </w:p>
     <w:p>
       <w:r>
+        <w:lastRenderedPageBreak/>
         <w:br/>
       </w:r>
       <w:r>
@@ -343,6 +288,7 @@
         <w:br/>
       </w:r>
       <w:r>
+        <w:lastRenderedPageBreak/>
         <w:t>Hi Aja, your workout is ready. For today’s added conditioning stimulus, a live bear has been programmed to attack at an undisclosed time. Good luck.</w:t>
       </w:r>
     </w:p>
@@ -493,6 +439,25 @@
       </w:r>
       <w:r>
         <w:t>your workout is ready. For today’s added accountability measure, a judgemental goose has been assigned to monitor your rest periods.</w:t>
+      </w:r>
+    </w:p>
+    <w:p/>
+    <w:p/>
+    <w:p>
+      <w:pPr>
+        <w:rPr>
+          <w:lang w:val="en-US"/>
+        </w:rPr>
+      </w:pPr>
+      <w:r>
+        <w:t>Added replace template alert ‘are you sure’ pop up – for if the current workout has entered values.</w:t>
+      </w:r>
+      <w:r>
+        <w:rPr>
+          <w:lang w:val="en-US"/>
+        </w:rPr>
+        <w:br/>
+        <w:t>improved subsequent set weight recommendation, dependent on RIR.</w:t>
       </w:r>
     </w:p>
     <w:sectPr>
@@ -2021,7 +1986,6 @@
   <w:style w:type="character" w:default="1" w:styleId="DefaultParagraphFont">
     <w:name w:val="Default Paragraph Font"/>
     <w:uiPriority w:val="1"/>
-    <w:semiHidden/>
     <w:unhideWhenUsed/>
   </w:style>
   <w:style w:type="table" w:default="1" w:styleId="TableNormal">
@@ -2333,6 +2297,17 @@
       <w:smallCaps/>
       <w:color w:val="0F4761" w:themeColor="accent1" w:themeShade="BF"/>
       <w:spacing w:val="5"/>
+    </w:rPr>
+  </w:style>
+  <w:style w:type="paragraph" w:styleId="NormalWeb">
+    <w:name w:val="Normal (Web)"/>
+    <w:basedOn w:val="Normal"/>
+    <w:uiPriority w:val="99"/>
+    <w:semiHidden/>
+    <w:unhideWhenUsed/>
+    <w:rsid w:val="00B14BE2"/>
+    <w:rPr>
+      <w:rFonts w:ascii="Times New Roman" w:hAnsi="Times New Roman" w:cs="Times New Roman"/>
     </w:rPr>
   </w:style>
 </w:styles>

</xml_diff>

<commit_message>
bb3 notes fixed. account deletion message clarified
</commit_message>
<xml_diff>
--- a/docs/wes2/Next fix bb3 notes, plus circuits.docx
+++ b/docs/wes2/Next fix bb3 notes, plus circuits.docx
@@ -19,23 +19,7 @@
     <w:p/>
     <w:p>
       <w:r>
-        <w:t xml:space="preserve">Can we make the No internet error message more </w:t>
-      </w:r>
-      <w:proofErr w:type="gramStart"/>
-      <w:r>
-        <w:t>premium  please</w:t>
-      </w:r>
-      <w:proofErr w:type="gramEnd"/>
-      <w:r>
-        <w:t xml:space="preserve">? See screen shot x for example of what it currently is. What customer facing message would you expect here for a </w:t>
-      </w:r>
-      <w:proofErr w:type="gramStart"/>
-      <w:r>
-        <w:t>top of the line</w:t>
-      </w:r>
-      <w:proofErr w:type="gramEnd"/>
-      <w:r>
-        <w:t xml:space="preserve"> premium workout app? </w:t>
+        <w:t xml:space="preserve">Can we make the No internet error message more premium  please? See screen shot x for example of what it currently is. What customer facing message would you expect here for a top of the line premium workout app? </w:t>
       </w:r>
     </w:p>
     <w:p/>
@@ -87,30 +71,6 @@
       <w:r>
         <w:br/>
       </w:r>
-      <w:r>
-        <w:t>Add a clear warning to account deletion</w:t>
-      </w:r>
-      <w:r>
-        <w:t xml:space="preserve">: </w:t>
-      </w:r>
-      <w:r>
-        <w:t>Deleting your GoodLift account does not cancel an active subscription. Cancel your subscription separately through Apple or your billing provider.</w:t>
-      </w:r>
-      <w:r>
-        <w:br/>
-      </w:r>
-      <w:r>
-        <w:br/>
-      </w:r>
-      <w:r>
-        <w:t>Ensure Meta tracking is properly disclosed and confirm the Apple ATT configuration.</w:t>
-      </w:r>
-      <w:r>
-        <w:t xml:space="preserve"> </w:t>
-      </w:r>
-      <w:r>
-        <w:t>This is mainly a store-compliance risk rather than a conversion improvement, but it should not be left ambiguous.</w:t>
-      </w:r>
     </w:p>
     <w:p>
       <w:pPr>
@@ -160,7 +120,6 @@
     </w:p>
     <w:p>
       <w:r>
-        <w:lastRenderedPageBreak/>
         <w:br/>
       </w:r>
       <w:r>
@@ -209,26 +168,6 @@
         <w:br/>
       </w:r>
       <w:r>
-        <w:t xml:space="preserve">Can we next please Make notes recorded in wes2 appear in bb3 as notes written in bb3 appear in wes2. There needs to be some visual cue that there is an execution note from the exercise in general for the header, or specific set if per set. Note icon </w:t>
-      </w:r>
-      <w:proofErr w:type="spellStart"/>
-      <w:r>
-        <w:t>color</w:t>
-      </w:r>
-      <w:proofErr w:type="spellEnd"/>
-      <w:r>
-        <w:t xml:space="preserve"> should change, tapping should open. Describe in your own words first, discuss your solution with me first too.</w:t>
-      </w:r>
-      <w:r>
-        <w:br/>
-      </w:r>
-      <w:r>
-        <w:br/>
-      </w:r>
-      <w:r>
-        <w:br/>
-      </w:r>
-      <w:r>
         <w:br/>
       </w:r>
       <w:r>
@@ -245,155 +184,173 @@
         </w:rPr>
         <w:t>updates</w:t>
       </w:r>
+      <w:r>
+        <w:br/>
+      </w:r>
+      <w:r>
+        <w:br/>
+      </w:r>
+      <w:r>
+        <w:br/>
+      </w:r>
+      <w:r>
+        <w:rPr>
+          <w:i/>
+          <w:iCs/>
+        </w:rPr>
+        <w:t>Boring bits</w:t>
+      </w:r>
+      <w:r>
+        <w:t>:</w:t>
+      </w:r>
+      <w:r>
+        <w:rPr>
+          <w:i/>
+          <w:iCs/>
+        </w:rPr>
+        <w:br/>
+      </w:r>
+      <w:r>
+        <w:t>Add a clear warning to account deletion: Deleting your GoodLift account does not cancel an active subscription. Cancel your subscription separately through Apple or your billing provider.</w:t>
+      </w:r>
+      <w:r>
+        <w:br/>
+      </w:r>
+      <w:r>
+        <w:br/>
+        <w:t>Ensure Meta tracking is properly disclosed and confirm the Apple ATT configuration. This is mainly a store-compliance risk rather than a conversion improvement, but it should not be left ambiguous.</w:t>
+      </w:r>
+      <w:r>
+        <w:br/>
+      </w:r>
+      <w:r>
+        <w:br/>
+        <w:t xml:space="preserve">Hi Aja, this is your reminder to do better today. </w:t>
+      </w:r>
+      <w:r>
+        <w:br/>
+      </w:r>
+      <w:r>
+        <w:br/>
+        <w:t>Hi Aja, you last workout was not enough. If you ever want to be a firefighting lady, you are going to have to train harder</w:t>
+      </w:r>
     </w:p>
     <w:p/>
     <w:p>
       <w:r>
-        <w:t xml:space="preserve">Can we now make homeScreenV2 the main home screen please? It should be the screen users are navigated to once logged in, and if opening app from an already logged in state, the first page that shows. </w:t>
-      </w:r>
-      <w:r>
-        <w:br/>
-      </w:r>
-      <w:r>
-        <w:br/>
-      </w:r>
-      <w:r>
-        <w:br/>
-        <w:t xml:space="preserve">Hi Aja, this is your reminder to do better today. </w:t>
-      </w:r>
-      <w:r>
-        <w:br/>
-      </w:r>
-      <w:r>
-        <w:br/>
-        <w:t>Hi Aja, you last workout was not enough. If you ever want to be a firefighting lady, you are going to have to train harder</w:t>
+        <w:t xml:space="preserve">Hi Aja, your last session I decided you were not trying hard enough so I didn’t count it. Please start again from scratch. </w:t>
+      </w:r>
+      <w:r>
+        <w:br/>
+      </w:r>
+      <w:r>
+        <w:br/>
+        <w:t>Hi, Aja, why can you still fit through doors?? Eat more protein.</w:t>
+      </w:r>
+      <w:r>
+        <w:br/>
+      </w:r>
+      <w:r>
+        <w:br/>
+      </w:r>
+      <w:r>
+        <w:t>Hi Aja, your workout is ready. For today’s added conditioning stimulus, a live bear has been programmed to attack at an undisclosed time. Good luck.</w:t>
+      </w:r>
+    </w:p>
+    <w:p>
+      <w:r>
+        <w:br w:type="page"/>
+      </w:r>
+    </w:p>
+    <w:p>
+      <w:r>
+        <w:lastRenderedPageBreak/>
+        <w:t xml:space="preserve">Hi Aja, your workout is ready. </w:t>
+      </w:r>
+      <w:r>
+        <w:t>The</w:t>
+      </w:r>
+      <w:r>
+        <w:t xml:space="preserve"> exit doors </w:t>
+      </w:r>
+      <w:r>
+        <w:t>have been</w:t>
+      </w:r>
+      <w:r>
+        <w:t xml:space="preserve"> lock</w:t>
+      </w:r>
+      <w:r>
+        <w:t>ed and staff have been notified prevent you from leaving</w:t>
+      </w:r>
+      <w:r>
+        <w:t xml:space="preserve"> until sufficient effort has been demonstrated.</w:t>
+      </w:r>
+      <w:r>
+        <w:t xml:space="preserve"> </w:t>
       </w:r>
     </w:p>
     <w:p/>
     <w:p>
       <w:r>
-        <w:t xml:space="preserve">Hi Aja, your last session I decided you were not trying hard enough so I didn’t count it. Please start again from scratch. </w:t>
-      </w:r>
-      <w:r>
-        <w:br/>
-      </w:r>
-      <w:r>
-        <w:br/>
-        <w:t>Hi, Aja, why can you still fit through doors?? Eat more protein.</w:t>
-      </w:r>
-      <w:r>
-        <w:br/>
-      </w:r>
-      <w:r>
-        <w:br/>
-      </w:r>
-      <w:r>
-        <w:lastRenderedPageBreak/>
-        <w:t>Hi Aja, your workout is ready. For today’s added conditioning stimulus, a live bear has been programmed to attack at an undisclosed time. Good luck.</w:t>
-      </w:r>
-    </w:p>
-    <w:p>
-      <w:r>
-        <w:br w:type="page"/>
-      </w:r>
-    </w:p>
-    <w:p>
-      <w:r>
-        <w:lastRenderedPageBreak/>
-        <w:t xml:space="preserve">Hi Aja, your workout is ready. </w:t>
-      </w:r>
-      <w:r>
-        <w:t>The</w:t>
-      </w:r>
-      <w:r>
-        <w:t xml:space="preserve"> exit doors </w:t>
-      </w:r>
-      <w:r>
-        <w:t>have been</w:t>
-      </w:r>
-      <w:r>
-        <w:t xml:space="preserve"> </w:t>
-      </w:r>
-      <w:proofErr w:type="gramStart"/>
-      <w:r>
-        <w:t>lock</w:t>
-      </w:r>
-      <w:r>
-        <w:t>ed</w:t>
-      </w:r>
-      <w:proofErr w:type="gramEnd"/>
-      <w:r>
-        <w:t xml:space="preserve"> and staff have been notified prevent you from leaving</w:t>
-      </w:r>
-      <w:r>
-        <w:t xml:space="preserve"> until sufficient effort has been demonstrated.</w:t>
-      </w:r>
-      <w:r>
-        <w:t xml:space="preserve"> </w:t>
+        <w:t xml:space="preserve">Hi Aja, your workout is ready. For today’s added conditioning stimulus, a goose with poor </w:t>
+      </w:r>
+      <w:r>
+        <w:t xml:space="preserve">personal </w:t>
+      </w:r>
+      <w:r>
+        <w:t>boundar</w:t>
+      </w:r>
+      <w:r>
+        <w:t>y understanding</w:t>
+      </w:r>
+      <w:r>
+        <w:t xml:space="preserve"> has been programmed to appear at an undisclosed time. Good luck.</w:t>
       </w:r>
     </w:p>
     <w:p/>
     <w:p>
       <w:r>
-        <w:t xml:space="preserve">Hi Aja, your workout is ready. For today’s added conditioning stimulus, a goose with poor </w:t>
-      </w:r>
-      <w:r>
-        <w:t xml:space="preserve">personal </w:t>
-      </w:r>
-      <w:r>
-        <w:t>boundar</w:t>
-      </w:r>
-      <w:r>
-        <w:t>y understanding</w:t>
-      </w:r>
-      <w:r>
-        <w:t xml:space="preserve"> has been programmed to appear at an undisclosed time. Good luck.</w:t>
+        <w:t xml:space="preserve">Hi Aja, your workout is ready. </w:t>
+      </w:r>
+      <w:r>
+        <w:t>Today the</w:t>
+      </w:r>
+      <w:r>
+        <w:t xml:space="preserve"> floor will become lava</w:t>
+      </w:r>
+      <w:r>
+        <w:t xml:space="preserve"> if you rest for too long, or too short. Get it right</w:t>
+      </w:r>
+      <w:r>
+        <w:t>.</w:t>
+      </w:r>
+      <w:r>
+        <w:br/>
+      </w:r>
+      <w:r>
+        <w:t>Good luck.</w:t>
+      </w:r>
+      <w:r>
+        <w:br/>
+      </w:r>
+      <w:r>
+        <w:br/>
+      </w:r>
+      <w:r>
+        <w:br/>
+        <w:t>Hi Mike, this is your friendly reminder to do better.</w:t>
+      </w:r>
+      <w:r>
+        <w:br/>
+      </w:r>
+      <w:r>
+        <w:br/>
+        <w:t xml:space="preserve">Hi Mike, try smiling. </w:t>
       </w:r>
     </w:p>
     <w:p/>
     <w:p>
       <w:r>
-        <w:t xml:space="preserve">Hi Aja, your workout is ready. </w:t>
-      </w:r>
-      <w:r>
-        <w:t>Today the</w:t>
-      </w:r>
-      <w:r>
-        <w:t xml:space="preserve"> floor will become lava</w:t>
-      </w:r>
-      <w:r>
-        <w:t xml:space="preserve"> if you rest for too long, or too short. Get it right</w:t>
-      </w:r>
-      <w:r>
-        <w:t>.</w:t>
-      </w:r>
-      <w:r>
-        <w:br/>
-      </w:r>
-      <w:r>
-        <w:t>Good luck.</w:t>
-      </w:r>
-      <w:r>
-        <w:br/>
-      </w:r>
-      <w:r>
-        <w:br/>
-      </w:r>
-      <w:r>
-        <w:br/>
-        <w:t>Hi Mike, this is your friendly reminder to do better.</w:t>
-      </w:r>
-      <w:r>
-        <w:br/>
-      </w:r>
-      <w:r>
-        <w:br/>
-        <w:t xml:space="preserve">Hi Mike, try smiling. </w:t>
-      </w:r>
-    </w:p>
-    <w:p/>
-    <w:p>
-      <w:r>
         <w:t xml:space="preserve">Hi Mike, everyone here thinks you are great. </w:t>
       </w:r>
       <w:r>
@@ -401,15 +358,7 @@
       </w:r>
       <w:r>
         <w:br/>
-        <w:t xml:space="preserve">Hi Mike, </w:t>
-      </w:r>
-      <w:proofErr w:type="gramStart"/>
-      <w:r>
-        <w:t>Remember</w:t>
-      </w:r>
-      <w:proofErr w:type="gramEnd"/>
-      <w:r>
-        <w:t xml:space="preserve"> to put people in their place today, help them </w:t>
+        <w:t xml:space="preserve">Hi Mike, Remember to put people in their place today, help them </w:t>
       </w:r>
       <w:r>
         <w:t>to control their</w:t>

</xml_diff>

<commit_message>
Implement fast startup and WES2 route restoration
</commit_message>
<xml_diff>
--- a/docs/wes2/Next fix bb3 notes, plus circuits.docx
+++ b/docs/wes2/Next fix bb3 notes, plus circuits.docx
@@ -147,6 +147,12 @@
       </w:r>
     </w:p>
     <w:p>
+      <w:pPr>
+        <w:rPr>
+          <w:i/>
+          <w:iCs/>
+        </w:rPr>
+      </w:pPr>
       <w:r>
         <w:br/>
       </w:r>
@@ -186,24 +192,10 @@
       <w:r>
         <w:t>:</w:t>
       </w:r>
-      <w:r>
-        <w:rPr>
-          <w:i/>
-          <w:iCs/>
-        </w:rPr>
-        <w:br/>
-      </w:r>
-      <w:r>
-        <w:t xml:space="preserve">Add a clear warning to account deletion: Deleting your GoodLift account does not </w:t>
-      </w:r>
+    </w:p>
+    <w:p>
       <w:r>
         <w:lastRenderedPageBreak/>
-        <w:t>cancel an active subscription. Cancel your subscription separately through Apple or your billing provider.</w:t>
-      </w:r>
-      <w:r>
-        <w:br/>
-      </w:r>
-      <w:r>
         <w:br/>
         <w:t>Ensure Meta tracking is properly disclosed and confirm the Apple ATT configuration. This is mainly a store-compliance risk rather than a conversion improvement, but it should not be left ambiguous.</w:t>
       </w:r>
@@ -264,18 +256,10 @@
         <w:t>have been</w:t>
       </w:r>
       <w:r>
-        <w:t xml:space="preserve"> </w:t>
-      </w:r>
-      <w:proofErr w:type="gramStart"/>
-      <w:r>
-        <w:t>lock</w:t>
-      </w:r>
-      <w:r>
-        <w:t>ed</w:t>
-      </w:r>
-      <w:proofErr w:type="gramEnd"/>
-      <w:r>
-        <w:t xml:space="preserve"> and staff have been notified prevent you from leaving</w:t>
+        <w:t xml:space="preserve"> lock</w:t>
+      </w:r>
+      <w:r>
+        <w:t>ed and staff have been notified prevent you from leaving</w:t>
       </w:r>
       <w:r>
         <w:t xml:space="preserve"> until sufficient effort has been demonstrated.</w:t>
@@ -353,15 +337,7 @@
       </w:r>
       <w:r>
         <w:br/>
-        <w:t xml:space="preserve">Hi Mike, </w:t>
-      </w:r>
-      <w:proofErr w:type="gramStart"/>
-      <w:r>
-        <w:t>Remember</w:t>
-      </w:r>
-      <w:proofErr w:type="gramEnd"/>
-      <w:r>
-        <w:t xml:space="preserve"> to put people in their place today, help them </w:t>
+        <w:t xml:space="preserve">Hi Mike, Remember to put people in their place today, help them </w:t>
       </w:r>
       <w:r>
         <w:t>to control their</w:t>
@@ -401,16 +377,13 @@
           <w:lang w:val="en-US"/>
         </w:rPr>
       </w:pPr>
-      <w:r>
-        <w:t>Added replace template alert ‘are you sure’ pop up – for if the current workout has entered values.</w:t>
-      </w:r>
-      <w:r>
+    </w:p>
+    <w:p>
+      <w:pPr>
         <w:rPr>
           <w:lang w:val="en-US"/>
         </w:rPr>
-        <w:br/>
-        <w:t>improved subsequent set weight recommendation, dependent on RIR.</w:t>
-      </w:r>
+      </w:pPr>
     </w:p>
     <w:sectPr>
       <w:pgSz w:w="11906" w:h="16838"/>

</xml_diff>

<commit_message>
Fixed apple back button
</commit_message>
<xml_diff>
--- a/docs/wes2/Next fix bb3 notes, plus circuits.docx
+++ b/docs/wes2/Next fix bb3 notes, plus circuits.docx
@@ -238,112 +238,126 @@
     </w:p>
     <w:p>
       <w:r>
-        <w:br w:type="page"/>
-      </w:r>
-    </w:p>
-    <w:p>
+        <w:t xml:space="preserve">Hi Aja, your workout is ready. </w:t>
+      </w:r>
+      <w:r>
+        <w:t>The</w:t>
+      </w:r>
+      <w:r>
+        <w:t xml:space="preserve"> exit doors </w:t>
+      </w:r>
+      <w:r>
+        <w:t>have been</w:t>
+      </w:r>
+      <w:r>
+        <w:t xml:space="preserve"> </w:t>
+      </w:r>
+      <w:proofErr w:type="gramStart"/>
+      <w:r>
+        <w:t>lock</w:t>
+      </w:r>
+      <w:r>
+        <w:t>ed</w:t>
+      </w:r>
+      <w:proofErr w:type="gramEnd"/>
+      <w:r>
+        <w:t xml:space="preserve"> and staff have been notified prevent you from leaving</w:t>
+      </w:r>
+      <w:r>
+        <w:t xml:space="preserve"> until sufficient effort has been demonstrated.</w:t>
+      </w:r>
+      <w:r>
+        <w:t xml:space="preserve"> </w:t>
+      </w:r>
+    </w:p>
+    <w:p/>
+    <w:p>
+      <w:r>
+        <w:t xml:space="preserve">Hi Aja, your workout is ready. For today’s added conditioning stimulus, a goose with poor </w:t>
+      </w:r>
+      <w:r>
+        <w:t xml:space="preserve">personal </w:t>
+      </w:r>
+      <w:r>
+        <w:t>boundar</w:t>
+      </w:r>
+      <w:r>
+        <w:t>y understanding</w:t>
+      </w:r>
+      <w:r>
+        <w:t xml:space="preserve"> has been programmed to appear at an undisclosed time. Good luck.</w:t>
+      </w:r>
+    </w:p>
+    <w:p/>
+    <w:p>
+      <w:r>
+        <w:t xml:space="preserve">Hi Aja, your workout is ready. </w:t>
+      </w:r>
+      <w:r>
+        <w:t>Today the</w:t>
+      </w:r>
+      <w:r>
+        <w:t xml:space="preserve"> floor will become lava</w:t>
+      </w:r>
+      <w:r>
+        <w:t xml:space="preserve"> if you rest for too long, or too short. Get it right</w:t>
+      </w:r>
+      <w:r>
+        <w:t>.</w:t>
+      </w:r>
+      <w:r>
+        <w:br/>
+      </w:r>
+      <w:r>
+        <w:t>Good luck.</w:t>
+      </w:r>
+      <w:r>
+        <w:br/>
+      </w:r>
+      <w:r>
+        <w:br/>
+      </w:r>
+      <w:r>
+        <w:br/>
+        <w:t>Hi Mike, this is your friendly reminder to do better.</w:t>
+      </w:r>
+      <w:r>
+        <w:br/>
+      </w:r>
+      <w:r>
+        <w:br/>
+        <w:t xml:space="preserve">Hi Mike, try smiling. </w:t>
+      </w:r>
+    </w:p>
+    <w:p/>
+    <w:p>
+      <w:r>
+        <w:t xml:space="preserve">Hi Mike, everyone here thinks you are great. </w:t>
+      </w:r>
+      <w:r>
+        <w:br/>
+      </w:r>
+      <w:r>
+        <w:br/>
+        <w:t xml:space="preserve">Hi Mike, </w:t>
+      </w:r>
+      <w:proofErr w:type="gramStart"/>
+      <w:r>
+        <w:t>Remember</w:t>
+      </w:r>
+      <w:proofErr w:type="gramEnd"/>
+      <w:r>
+        <w:t xml:space="preserve"> to put people in their place today, help them </w:t>
+      </w:r>
+      <w:r>
+        <w:t>to control their</w:t>
+      </w:r>
+      <w:r>
+        <w:t xml:space="preserve"> ego’s, </w:t>
+      </w:r>
       <w:r>
         <w:lastRenderedPageBreak/>
-        <w:t xml:space="preserve">Hi Aja, your workout is ready. </w:t>
-      </w:r>
-      <w:r>
-        <w:t>The</w:t>
-      </w:r>
-      <w:r>
-        <w:t xml:space="preserve"> exit doors </w:t>
-      </w:r>
-      <w:r>
-        <w:t>have been</w:t>
-      </w:r>
-      <w:r>
-        <w:t xml:space="preserve"> lock</w:t>
-      </w:r>
-      <w:r>
-        <w:t>ed and staff have been notified prevent you from leaving</w:t>
-      </w:r>
-      <w:r>
-        <w:t xml:space="preserve"> until sufficient effort has been demonstrated.</w:t>
-      </w:r>
-      <w:r>
-        <w:t xml:space="preserve"> </w:t>
-      </w:r>
-    </w:p>
-    <w:p/>
-    <w:p>
-      <w:r>
-        <w:t xml:space="preserve">Hi Aja, your workout is ready. For today’s added conditioning stimulus, a goose with poor </w:t>
-      </w:r>
-      <w:r>
-        <w:t xml:space="preserve">personal </w:t>
-      </w:r>
-      <w:r>
-        <w:t>boundar</w:t>
-      </w:r>
-      <w:r>
-        <w:t>y understanding</w:t>
-      </w:r>
-      <w:r>
-        <w:t xml:space="preserve"> has been programmed to appear at an undisclosed time. Good luck.</w:t>
-      </w:r>
-    </w:p>
-    <w:p/>
-    <w:p>
-      <w:r>
-        <w:t xml:space="preserve">Hi Aja, your workout is ready. </w:t>
-      </w:r>
-      <w:r>
-        <w:t>Today the</w:t>
-      </w:r>
-      <w:r>
-        <w:t xml:space="preserve"> floor will become lava</w:t>
-      </w:r>
-      <w:r>
-        <w:t xml:space="preserve"> if you rest for too long, or too short. Get it right</w:t>
-      </w:r>
-      <w:r>
-        <w:t>.</w:t>
-      </w:r>
-      <w:r>
-        <w:br/>
-      </w:r>
-      <w:r>
-        <w:t>Good luck.</w:t>
-      </w:r>
-      <w:r>
-        <w:br/>
-      </w:r>
-      <w:r>
-        <w:br/>
-      </w:r>
-      <w:r>
-        <w:br/>
-        <w:t>Hi Mike, this is your friendly reminder to do better.</w:t>
-      </w:r>
-      <w:r>
-        <w:br/>
-      </w:r>
-      <w:r>
-        <w:br/>
-        <w:t xml:space="preserve">Hi Mike, try smiling. </w:t>
-      </w:r>
-    </w:p>
-    <w:p/>
-    <w:p>
-      <w:r>
-        <w:t xml:space="preserve">Hi Mike, everyone here thinks you are great. </w:t>
-      </w:r>
-      <w:r>
-        <w:br/>
-      </w:r>
-      <w:r>
-        <w:br/>
-        <w:t xml:space="preserve">Hi Mike, Remember to put people in their place today, help them </w:t>
-      </w:r>
-      <w:r>
-        <w:t>to control their</w:t>
-      </w:r>
-      <w:r>
-        <w:t xml:space="preserve"> ego’s, it’s a kindness. </w:t>
+        <w:t xml:space="preserve">it’s a kindness. </w:t>
       </w:r>
       <w:r>
         <w:br/>
@@ -384,6 +398,67 @@
           <w:lang w:val="en-US"/>
         </w:rPr>
       </w:pPr>
+      <w:r>
+        <w:rPr>
+          <w:lang w:val="en-US"/>
+        </w:rPr>
+        <w:t>Improved log in flow.</w:t>
+      </w:r>
+    </w:p>
+    <w:p>
+      <w:pPr>
+        <w:rPr>
+          <w:lang w:val="en-US"/>
+        </w:rPr>
+      </w:pPr>
+      <w:r>
+        <w:rPr>
+          <w:lang w:val="en-US"/>
+        </w:rPr>
+        <w:t>reduced app open time from cold start</w:t>
+      </w:r>
+    </w:p>
+    <w:p>
+      <w:pPr>
+        <w:rPr>
+          <w:lang w:val="en-US"/>
+        </w:rPr>
+      </w:pPr>
+    </w:p>
+    <w:p>
+      <w:pPr>
+        <w:rPr>
+          <w:lang w:val="en-US"/>
+        </w:rPr>
+      </w:pPr>
+    </w:p>
+    <w:p>
+      <w:pPr>
+        <w:rPr>
+          <w:lang w:val="en-US"/>
+        </w:rPr>
+      </w:pPr>
+      <w:r>
+        <w:rPr>
+          <w:lang w:val="en-US"/>
+        </w:rPr>
+        <w:t xml:space="preserve">Can we next add </w:t>
+      </w:r>
+      <w:hyperlink r:id="rId5" w:history="1">
+        <w:r>
+          <w:rPr>
+            <w:rStyle w:val="Hyperlink"/>
+            <w:lang w:val="en-US"/>
+          </w:rPr>
+          <w:t>shawn@mrwalker.co.nz</w:t>
+        </w:r>
+      </w:hyperlink>
+      <w:r>
+        <w:rPr>
+          <w:lang w:val="en-US"/>
+        </w:rPr>
+        <w:t xml:space="preserve"> email address to the internal booking summary message? And make it so that he gets the same email currently directed to richard@razorsedgesystems.com</w:t>
+      </w:r>
     </w:p>
     <w:sectPr>
       <w:pgSz w:w="11906" w:h="16838"/>
@@ -2235,6 +2310,29 @@
       <w:rFonts w:ascii="Times New Roman" w:hAnsi="Times New Roman" w:cs="Times New Roman"/>
     </w:rPr>
   </w:style>
+  <w:style w:type="character" w:styleId="Hyperlink">
+    <w:name w:val="Hyperlink"/>
+    <w:basedOn w:val="DefaultParagraphFont"/>
+    <w:uiPriority w:val="99"/>
+    <w:unhideWhenUsed/>
+    <w:rsid w:val="00333868"/>
+    <w:rPr>
+      <w:color w:val="467886" w:themeColor="hyperlink"/>
+      <w:u w:val="single"/>
+    </w:rPr>
+  </w:style>
+  <w:style w:type="character" w:styleId="UnresolvedMention">
+    <w:name w:val="Unresolved Mention"/>
+    <w:basedOn w:val="DefaultParagraphFont"/>
+    <w:uiPriority w:val="99"/>
+    <w:semiHidden/>
+    <w:unhideWhenUsed/>
+    <w:rsid w:val="00333868"/>
+    <w:rPr>
+      <w:color w:val="605E5C"/>
+      <w:shd w:val="clear" w:color="auto" w:fill="E1DFDD"/>
+    </w:rPr>
+  </w:style>
 </w:styles>
 </file>
 

</xml_diff>

<commit_message>
added google pay succesfully
</commit_message>
<xml_diff>
--- a/docs/wes2/Next fix bb3 notes, plus circuits.docx
+++ b/docs/wes2/Next fix bb3 notes, plus circuits.docx
@@ -25,6 +25,41 @@
     <w:p/>
     <w:p>
       <w:r>
+        <w:t>Next thing to fix is some of the hint text been behaving strangely. Can you see how the lying leg curl is behaving as if it had no user history</w:t>
+      </w:r>
+      <w:r>
+        <w:t xml:space="preserve">, but when you open top </w:t>
+      </w:r>
+      <w:proofErr w:type="gramStart"/>
+      <w:r>
+        <w:t>sets</w:t>
+      </w:r>
+      <w:proofErr w:type="gramEnd"/>
+      <w:r>
+        <w:t xml:space="preserve"> you can see e1rm should </w:t>
+      </w:r>
+      <w:proofErr w:type="gramStart"/>
+      <w:r>
+        <w:t>actually be</w:t>
+      </w:r>
+      <w:proofErr w:type="gramEnd"/>
+      <w:r>
+        <w:t xml:space="preserve"> above 46kg. Have seen this for a few exercises, both in my account and when coaching others.</w:t>
+      </w:r>
+      <w:r>
+        <w:br/>
+      </w:r>
+      <w:r>
+        <w:br/>
+      </w:r>
+      <w:r>
+        <w:br/>
+        <w:t>I also see another error in this example for the leg extensions, where it somehow computes a higher e1rm at a lower RIR, for the same weight and rep combination? This should surely never happen, right? Seems like a task for fable?</w:t>
+      </w:r>
+    </w:p>
+    <w:p/>
+    <w:p>
+      <w:r>
         <w:rPr>
           <w:i/>
           <w:iCs/>
@@ -195,169 +230,165 @@
     </w:p>
     <w:p>
       <w:r>
+        <w:br/>
+        <w:t>Ensure Meta tracking is properly disclosed and confirm the Apple ATT configuration. This is mainly a store-compliance risk rather than a conversion improvement, but it should not be left ambiguous.</w:t>
+      </w:r>
+      <w:r>
+        <w:br/>
+      </w:r>
+      <w:r>
+        <w:br/>
+        <w:t xml:space="preserve">Hi Aja, this is your reminder to do better today. </w:t>
+      </w:r>
+      <w:r>
+        <w:br/>
+      </w:r>
+      <w:r>
+        <w:br/>
+        <w:t>Hi Aja, you last workout was not enough. If you ever want to be a firefighting lady, you are going to have to train harder</w:t>
+      </w:r>
+    </w:p>
+    <w:p/>
+    <w:p>
+      <w:r>
+        <w:t xml:space="preserve">Hi Aja, your last session I decided you were not trying hard enough so I didn’t count it. Please start again from scratch. </w:t>
+      </w:r>
+      <w:r>
+        <w:br/>
+      </w:r>
+      <w:r>
+        <w:br/>
+        <w:t>Hi, Aja, why can you still fit through doors?? Eat more protein.</w:t>
+      </w:r>
+      <w:r>
+        <w:br/>
+      </w:r>
+      <w:r>
+        <w:br/>
+      </w:r>
+      <w:r>
+        <w:t>Hi Aja, your workout is ready. For today’s added conditioning stimulus, a live bear has been programmed to attack at an undisclosed time. Good luck.</w:t>
+      </w:r>
+    </w:p>
+    <w:p>
+      <w:r>
+        <w:t xml:space="preserve">Hi Aja, your workout is ready. </w:t>
+      </w:r>
+      <w:r>
+        <w:t>The</w:t>
+      </w:r>
+      <w:r>
+        <w:t xml:space="preserve"> exit doors </w:t>
+      </w:r>
+      <w:r>
+        <w:t>have been</w:t>
+      </w:r>
+      <w:r>
+        <w:t xml:space="preserve"> </w:t>
+      </w:r>
+      <w:proofErr w:type="gramStart"/>
+      <w:r>
+        <w:t>lock</w:t>
+      </w:r>
+      <w:r>
+        <w:t>ed</w:t>
+      </w:r>
+      <w:proofErr w:type="gramEnd"/>
+      <w:r>
+        <w:t xml:space="preserve"> and staff have been notified prevent you from leaving</w:t>
+      </w:r>
+      <w:r>
+        <w:t xml:space="preserve"> until sufficient effort has been demonstrated.</w:t>
+      </w:r>
+      <w:r>
+        <w:t xml:space="preserve"> </w:t>
+      </w:r>
+    </w:p>
+    <w:p/>
+    <w:p>
+      <w:r>
+        <w:t xml:space="preserve">Hi Aja, your workout is ready. For today’s added conditioning stimulus, a goose with poor </w:t>
+      </w:r>
+      <w:r>
+        <w:t xml:space="preserve">personal </w:t>
+      </w:r>
+      <w:r>
+        <w:t>boundar</w:t>
+      </w:r>
+      <w:r>
+        <w:t>y understanding</w:t>
+      </w:r>
+      <w:r>
+        <w:t xml:space="preserve"> has been programmed to appear at an undisclosed time. Good luck.</w:t>
+      </w:r>
+    </w:p>
+    <w:p/>
+    <w:p>
+      <w:r>
+        <w:t xml:space="preserve">Hi Aja, your workout is ready. </w:t>
+      </w:r>
+      <w:r>
+        <w:t>Today the</w:t>
+      </w:r>
+      <w:r>
+        <w:t xml:space="preserve"> floor will become lava</w:t>
+      </w:r>
+      <w:r>
+        <w:t xml:space="preserve"> if you rest for too long, or too short. Get it right</w:t>
+      </w:r>
+      <w:r>
+        <w:t>.</w:t>
+      </w:r>
+      <w:r>
+        <w:br/>
+      </w:r>
+      <w:r>
+        <w:t>Good luck.</w:t>
+      </w:r>
+      <w:r>
+        <w:br/>
+      </w:r>
+      <w:r>
         <w:lastRenderedPageBreak/>
         <w:br/>
-        <w:t>Ensure Meta tracking is properly disclosed and confirm the Apple ATT configuration. This is mainly a store-compliance risk rather than a conversion improvement, but it should not be left ambiguous.</w:t>
-      </w:r>
-      <w:r>
-        <w:br/>
-      </w:r>
-      <w:r>
-        <w:br/>
-        <w:t xml:space="preserve">Hi Aja, this is your reminder to do better today. </w:t>
-      </w:r>
-      <w:r>
-        <w:br/>
-      </w:r>
-      <w:r>
-        <w:br/>
-        <w:t>Hi Aja, you last workout was not enough. If you ever want to be a firefighting lady, you are going to have to train harder</w:t>
+      </w:r>
+      <w:r>
+        <w:br/>
+        <w:t>Hi Mike, this is your friendly reminder to do better.</w:t>
+      </w:r>
+      <w:r>
+        <w:br/>
+      </w:r>
+      <w:r>
+        <w:br/>
+        <w:t xml:space="preserve">Hi Mike, try smiling. </w:t>
       </w:r>
     </w:p>
     <w:p/>
     <w:p>
       <w:r>
-        <w:t xml:space="preserve">Hi Aja, your last session I decided you were not trying hard enough so I didn’t count it. Please start again from scratch. </w:t>
-      </w:r>
-      <w:r>
-        <w:br/>
-      </w:r>
-      <w:r>
-        <w:br/>
-        <w:t>Hi, Aja, why can you still fit through doors?? Eat more protein.</w:t>
-      </w:r>
-      <w:r>
-        <w:br/>
-      </w:r>
-      <w:r>
-        <w:br/>
-      </w:r>
-      <w:r>
-        <w:t>Hi Aja, your workout is ready. For today’s added conditioning stimulus, a live bear has been programmed to attack at an undisclosed time. Good luck.</w:t>
-      </w:r>
-    </w:p>
-    <w:p>
-      <w:r>
-        <w:t xml:space="preserve">Hi Aja, your workout is ready. </w:t>
-      </w:r>
-      <w:r>
-        <w:t>The</w:t>
-      </w:r>
-      <w:r>
-        <w:t xml:space="preserve"> exit doors </w:t>
-      </w:r>
-      <w:r>
-        <w:t>have been</w:t>
-      </w:r>
-      <w:r>
-        <w:t xml:space="preserve"> </w:t>
+        <w:t xml:space="preserve">Hi Mike, everyone here thinks you are great. </w:t>
+      </w:r>
+      <w:r>
+        <w:br/>
+      </w:r>
+      <w:r>
+        <w:br/>
+        <w:t xml:space="preserve">Hi Mike, </w:t>
       </w:r>
       <w:proofErr w:type="gramStart"/>
       <w:r>
-        <w:t>lock</w:t>
-      </w:r>
-      <w:r>
-        <w:t>ed</w:t>
+        <w:t>Remember</w:t>
       </w:r>
       <w:proofErr w:type="gramEnd"/>
       <w:r>
-        <w:t xml:space="preserve"> and staff have been notified prevent you from leaving</w:t>
-      </w:r>
-      <w:r>
-        <w:t xml:space="preserve"> until sufficient effort has been demonstrated.</w:t>
-      </w:r>
-      <w:r>
-        <w:t xml:space="preserve"> </w:t>
-      </w:r>
-    </w:p>
-    <w:p/>
-    <w:p>
-      <w:r>
-        <w:t xml:space="preserve">Hi Aja, your workout is ready. For today’s added conditioning stimulus, a goose with poor </w:t>
-      </w:r>
-      <w:r>
-        <w:t xml:space="preserve">personal </w:t>
-      </w:r>
-      <w:r>
-        <w:t>boundar</w:t>
-      </w:r>
-      <w:r>
-        <w:t>y understanding</w:t>
-      </w:r>
-      <w:r>
-        <w:t xml:space="preserve"> has been programmed to appear at an undisclosed time. Good luck.</w:t>
-      </w:r>
-    </w:p>
-    <w:p/>
-    <w:p>
-      <w:r>
-        <w:t xml:space="preserve">Hi Aja, your workout is ready. </w:t>
-      </w:r>
-      <w:r>
-        <w:t>Today the</w:t>
-      </w:r>
-      <w:r>
-        <w:t xml:space="preserve"> floor will become lava</w:t>
-      </w:r>
-      <w:r>
-        <w:t xml:space="preserve"> if you rest for too long, or too short. Get it right</w:t>
-      </w:r>
-      <w:r>
-        <w:t>.</w:t>
-      </w:r>
-      <w:r>
-        <w:br/>
-      </w:r>
-      <w:r>
-        <w:t>Good luck.</w:t>
-      </w:r>
-      <w:r>
-        <w:br/>
-      </w:r>
-      <w:r>
-        <w:br/>
-      </w:r>
-      <w:r>
-        <w:br/>
-        <w:t>Hi Mike, this is your friendly reminder to do better.</w:t>
-      </w:r>
-      <w:r>
-        <w:br/>
-      </w:r>
-      <w:r>
-        <w:br/>
-        <w:t xml:space="preserve">Hi Mike, try smiling. </w:t>
-      </w:r>
-    </w:p>
-    <w:p/>
-    <w:p>
-      <w:r>
-        <w:t xml:space="preserve">Hi Mike, everyone here thinks you are great. </w:t>
-      </w:r>
-      <w:r>
-        <w:br/>
-      </w:r>
-      <w:r>
-        <w:br/>
-        <w:t xml:space="preserve">Hi Mike, </w:t>
-      </w:r>
-      <w:proofErr w:type="gramStart"/>
-      <w:r>
-        <w:t>Remember</w:t>
-      </w:r>
-      <w:proofErr w:type="gramEnd"/>
-      <w:r>
         <w:t xml:space="preserve"> to put people in their place today, help them </w:t>
       </w:r>
       <w:r>
         <w:t>to control their</w:t>
       </w:r>
       <w:r>
-        <w:t xml:space="preserve"> ego’s, </w:t>
-      </w:r>
-      <w:r>
-        <w:lastRenderedPageBreak/>
-        <w:t xml:space="preserve">it’s a kindness. </w:t>
+        <w:t xml:space="preserve"> ego’s, it’s a kindness. </w:t>
       </w:r>
       <w:r>
         <w:br/>
@@ -1986,6 +2017,7 @@
   <w:style w:type="character" w:default="1" w:styleId="DefaultParagraphFont">
     <w:name w:val="Default Paragraph Font"/>
     <w:uiPriority w:val="1"/>
+    <w:semiHidden/>
     <w:unhideWhenUsed/>
   </w:style>
   <w:style w:type="table" w:default="1" w:styleId="TableNormal">

</xml_diff>

<commit_message>
docs(wes2): update BB3 fix notes and circuits working document
Tracked planning document, updated in the WES2/BB3 threads.

Co-Authored-By: Claude Opus 5 <noreply@anthropic.com>
Claude-Session: https://claude.ai/code/session_018zTnVunA7rriBnBrH9DRRh
</commit_message>
<xml_diff>
--- a/docs/wes2/Next fix bb3 notes, plus circuits.docx
+++ b/docs/wes2/Next fix bb3 notes, plus circuits.docx
@@ -16,87 +16,83 @@
         <w:t>Dup signature and smart progression working together</w:t>
       </w:r>
     </w:p>
-    <w:p>
-      <w:r>
-        <w:br/>
-        <w:t xml:space="preserve">Next thing to implement is live edits updating on multiple devices, including last write win rules. Can you summarise spec doc requirements on that please? </w:t>
-      </w:r>
-    </w:p>
     <w:p/>
     <w:p>
       <w:r>
-        <w:t>Next thing to fix is some of the hint text been behaving strangely. Can you see how the lying leg curl is behaving as if it had no user history</w:t>
-      </w:r>
-      <w:r>
-        <w:t xml:space="preserve">, but when you open top </w:t>
+        <w:t xml:space="preserve">Can we add video capacity per set inside WES2? </w:t>
       </w:r>
       <w:proofErr w:type="gramStart"/>
       <w:r>
-        <w:t>sets</w:t>
+        <w:t>So</w:t>
       </w:r>
       <w:proofErr w:type="gramEnd"/>
       <w:r>
-        <w:t xml:space="preserve"> you can see e1rm should </w:t>
+        <w:t xml:space="preserve"> an option to open device camera to film a set appears to the right of the add note icon, as a video camera icon. Tapping opens the device camera and enables filming of the set without leaving GoodLift. Immediately after recording, editing is opened, and the standard editing options of the device are shown, most importantly the ability to very easily trim the video to the start and finish of the set are readily available. The video should be saved in relation to the set on the device, rather than on server, unless the lift is a PB on one of the point-scoring big five lifts. We will be adding a further 5 or so lifts to the big </w:t>
       </w:r>
       <w:proofErr w:type="gramStart"/>
       <w:r>
-        <w:t>actually be</w:t>
+        <w:t>five point</w:t>
       </w:r>
       <w:proofErr w:type="gramEnd"/>
       <w:r>
-        <w:t xml:space="preserve"> above 46kg. Have seen this for a few exercises, both in my account and when coaching others.</w:t>
-      </w:r>
-      <w:r>
-        <w:br/>
-      </w:r>
-      <w:r>
-        <w:br/>
-      </w:r>
-      <w:r>
-        <w:br/>
-        <w:t>I also see another error in this example for the leg extensions, where it somehow computes a higher e1rm at a lower RIR, for the same weight and rep combination? This should surely never happen, right? Seems like a task for fable?</w:t>
-      </w:r>
-    </w:p>
-    <w:p/>
-    <w:p>
+        <w:t xml:space="preserve"> scorers in time to come, so make sure it saves the video server side if one of the recognised lifts from ‘the big five’ list, knowing the list may be updated in the future. We want the video to be accessible and stored on profile page by default, once trimmed, if it is a PB on one of these lifts, as one of the lifts on the </w:t>
+      </w:r>
+      <w:proofErr w:type="gramStart"/>
+      <w:r>
+        <w:t>users</w:t>
+      </w:r>
+      <w:proofErr w:type="gramEnd"/>
+      <w:r>
+        <w:t xml:space="preserve"> profile page. With option to replace or delete on profile page. Encouragement to trim the video to the start of the first rep and completion of re-rack, or end of last rep, should be strong – we don’t want to waste storage on video of someone setting up for 5 mins. </w:t>
+      </w:r>
+      <w:r>
+        <w:t>Claude code, sonnet or opus for this? Check the repo as it stands and suggest.</w:t>
+      </w:r>
+      <w:r>
+        <w:br/>
+      </w:r>
+      <w:r>
+        <w:br/>
+        <w:t>Can we please add the capacity to edit and manually enter a time for any timed exercise like the plank? Currently requires actual set to be tapped to start/stop, press and hold to restart, this is good, but can we also add the option to manually edit or enter a time? Should be a scroll dial rather than normal numeric entry. Claude code, sonnet or opus for this? Check the repo as it stands and suggest.</w:t>
+      </w:r>
+    </w:p>
+    <w:p>
+      <w:r>
+        <w:br/>
+      </w:r>
+      <w:r>
+        <w:br/>
+      </w:r>
       <w:r>
         <w:rPr>
           <w:i/>
           <w:iCs/>
         </w:rPr>
-        <w:t>Account Creation</w:t>
-      </w:r>
-      <w:r>
-        <w:br/>
-      </w:r>
-      <w:r>
-        <w:br/>
+        <w:t>Formula (PMU)</w:t>
       </w:r>
       <w:r>
         <w:rPr>
           <w:i/>
           <w:iCs/>
         </w:rPr>
-        <w:t>General</w:t>
-      </w:r>
-    </w:p>
-    <w:p>
-      <w:r>
-        <w:t>Make seeking online training more accessible/ easy</w:t>
-      </w:r>
-    </w:p>
-    <w:p>
-      <w:r>
-        <w:br/>
-      </w:r>
-    </w:p>
-    <w:p>
-      <w:pPr>
+        <w:br/>
+      </w:r>
+      <w:r>
+        <w:t>Update formula to something less inflating of E1RM at higher rep targets.</w:t>
+      </w:r>
+    </w:p>
+    <w:p/>
+    <w:p>
+      <w:r>
         <w:rPr>
           <w:i/>
           <w:iCs/>
         </w:rPr>
-      </w:pPr>
+        <w:t>Account Creation</w:t>
+      </w:r>
+      <w:r>
+        <w:br/>
+      </w:r>
       <w:r>
         <w:br/>
       </w:r>
@@ -105,12 +101,23 @@
           <w:i/>
           <w:iCs/>
         </w:rPr>
-        <w:t>Graphs</w:t>
-      </w:r>
-    </w:p>
-    <w:p>
-      <w:r>
-        <w:t>Make specific dates selectable</w:t>
+        <w:t>General</w:t>
+      </w:r>
+    </w:p>
+    <w:p>
+      <w:r>
+        <w:t>Make seeking online training more accessible/ easy</w:t>
+      </w:r>
+    </w:p>
+    <w:p>
+      <w:r>
+        <w:t>Make adding</w:t>
+      </w:r>
+      <w:r>
+        <w:t xml:space="preserve"> a new</w:t>
+      </w:r>
+      <w:r>
+        <w:t xml:space="preserve"> coach easy</w:t>
       </w:r>
     </w:p>
     <w:p>
@@ -120,45 +127,193 @@
           <w:iCs/>
         </w:rPr>
       </w:pPr>
-    </w:p>
-    <w:p>
-      <w:pPr>
+      <w:r>
+        <w:br/>
+      </w:r>
+      <w:r>
         <w:rPr>
           <w:i/>
           <w:iCs/>
         </w:rPr>
-      </w:pPr>
-      <w:r>
+        <w:t>Graphs</w:t>
+      </w:r>
+    </w:p>
+    <w:p/>
+    <w:p>
+      <w:pPr>
         <w:rPr>
           <w:i/>
           <w:iCs/>
         </w:rPr>
-        <w:t>Home page updates</w:t>
-      </w:r>
-    </w:p>
-    <w:p>
-      <w:r>
-        <w:br/>
-      </w:r>
-      <w:r>
-        <w:t xml:space="preserve">7. Can we change friend notification icon to show add friend pop up </w:t>
-      </w:r>
-      <w:proofErr w:type="spellStart"/>
-      <w:r>
-        <w:t>along side</w:t>
-      </w:r>
-      <w:proofErr w:type="spellEnd"/>
-      <w:r>
-        <w:t xml:space="preserve"> notifications of new friends please.</w:t>
-      </w:r>
-    </w:p>
-    <w:p>
-      <w:pPr>
+      </w:pPr>
+      <w:r>
         <w:rPr>
           <w:i/>
           <w:iCs/>
         </w:rPr>
-      </w:pPr>
+        <w:t>Profile page</w:t>
+      </w:r>
+    </w:p>
+    <w:p>
+      <w:r>
+        <w:t>Can we completely rebuild the profile page for the app? Should</w:t>
+      </w:r>
+      <w:r>
+        <w:t xml:space="preserve"> start with profile pic and username. Username should be changeable here, and that should update everywhere in the app. Profile pic should be easily changeable here too. Then underneath username, profile pic and short bio, there should</w:t>
+      </w:r>
+      <w:r>
+        <w:t xml:space="preserve"> be able to display the user</w:t>
+      </w:r>
+      <w:r>
+        <w:t>’</w:t>
+      </w:r>
+      <w:r>
+        <w:t xml:space="preserve">s best lifts from the big five based on E1RM excluding RIR, </w:t>
+      </w:r>
+      <w:r>
+        <w:t xml:space="preserve">from their training history </w:t>
+      </w:r>
+      <w:r>
+        <w:t xml:space="preserve">with </w:t>
+      </w:r>
+      <w:r>
+        <w:t>an easy</w:t>
+      </w:r>
+      <w:r>
+        <w:t xml:space="preserve"> option to upload video of relevant lift for proof. Should show heaviest weight lifted per big five lift (normally a single </w:t>
+      </w:r>
+      <w:proofErr w:type="gramStart"/>
+      <w:r>
+        <w:t>rep, but</w:t>
+      </w:r>
+      <w:proofErr w:type="gramEnd"/>
+      <w:r>
+        <w:t xml:space="preserve"> could be multiple reps if they haven’t tried a single at anything heavier according to their history) as well, with easy option to upload video of said lift as proof too. The whole page should look and feel like a </w:t>
+      </w:r>
+      <w:proofErr w:type="spellStart"/>
+      <w:r>
+        <w:t>super premium</w:t>
+      </w:r>
+      <w:proofErr w:type="spellEnd"/>
+      <w:r>
+        <w:t xml:space="preserve"> experience, show casing the lifters achievements on the app to date. Should load </w:t>
+      </w:r>
+      <w:proofErr w:type="spellStart"/>
+      <w:r>
+        <w:t>super fast</w:t>
+      </w:r>
+      <w:proofErr w:type="spellEnd"/>
+      <w:r>
+        <w:t xml:space="preserve">, cache and be accessible </w:t>
+      </w:r>
+      <w:proofErr w:type="gramStart"/>
+      <w:r>
+        <w:t>off line</w:t>
+      </w:r>
+      <w:proofErr w:type="gramEnd"/>
+      <w:r>
+        <w:t xml:space="preserve"> once loaded once. Should flow super seamlessly, be </w:t>
+      </w:r>
+      <w:proofErr w:type="gramStart"/>
+      <w:r>
+        <w:t>really easy</w:t>
+      </w:r>
+      <w:proofErr w:type="gramEnd"/>
+      <w:r>
+        <w:t xml:space="preserve"> to navigate, and give an ultimate high end and clear feel. Underneath the pinned big five lifts there should be an option to upload media of any kind, video or images, that becomes a collection of training related media for the user. This part of the page should be, look like, and function just like profile page of Instagram, apart from colour themes and text fonts should rather be consistent with GoodLift. The top part of the page for displaying best lifts and video proofs of best lifts should be like the bio section of </w:t>
+      </w:r>
+      <w:proofErr w:type="spellStart"/>
+      <w:r>
+        <w:t>instagram</w:t>
+      </w:r>
+      <w:proofErr w:type="spellEnd"/>
+      <w:r>
+        <w:t>, although be taking up a bit more space. There should be a literal bio section as well,</w:t>
+      </w:r>
+      <w:r>
+        <w:t xml:space="preserve"> at the top of the page, right underneath username,</w:t>
+      </w:r>
+      <w:r>
+        <w:t xml:space="preserve"> with linkable text, that should be same word count as Instagram bio for this. Option to easily change profile pic. Option to add story that lasts 24 hours. Doesn’t need the rest of the details currently shown in profile. Just the best five lifts based off E1RM excluding RIR, and the best heaviest weight lifted for each of these lifts, excluding RIR, and linked videos displayed enticingly</w:t>
+      </w:r>
+    </w:p>
+    <w:p/>
+    <w:p>
+      <w:pPr>
+        <w:rPr>
+          <w:i/>
+          <w:iCs/>
+        </w:rPr>
+      </w:pPr>
+    </w:p>
+    <w:p>
+      <w:r>
+        <w:rPr>
+          <w:i/>
+          <w:iCs/>
+        </w:rPr>
+        <w:t>RE Points</w:t>
+      </w:r>
+    </w:p>
+    <w:p>
+      <w:r>
+        <w:t xml:space="preserve">Rewrite from scratch, use same formula. </w:t>
+      </w:r>
+    </w:p>
+    <w:p/>
+    <w:p>
+      <w:pPr>
+        <w:rPr>
+          <w:i/>
+          <w:iCs/>
+        </w:rPr>
+      </w:pPr>
+      <w:r>
+        <w:rPr>
+          <w:i/>
+          <w:iCs/>
+        </w:rPr>
+        <w:t>Home page updates</w:t>
+      </w:r>
+    </w:p>
+    <w:p>
+      <w:r>
+        <w:br/>
+      </w:r>
+      <w:r>
+        <w:t xml:space="preserve">Can we make app make use of push notifications? So that if you get a new friend request, or a new DM sent, it notifies you like any other app would? Just friend adds, and </w:t>
+      </w:r>
+      <w:proofErr w:type="gramStart"/>
+      <w:r>
+        <w:t>DM’s</w:t>
+      </w:r>
+      <w:proofErr w:type="gramEnd"/>
+      <w:r>
+        <w:t xml:space="preserve"> at this point please. Are there any other triggers for push notifications you would recommend? </w:t>
+      </w:r>
+    </w:p>
+    <w:p/>
+    <w:p>
+      <w:r>
+        <w:rPr>
+          <w:i/>
+          <w:iCs/>
+        </w:rPr>
+        <w:t>Friend requests approval</w:t>
+      </w:r>
+    </w:p>
+    <w:p>
+      <w:r>
+        <w:t xml:space="preserve">Can we now also improve the friend adding and accepting experience? As well as the DM experience of the app? Both seem rather outdated. License to start from scratch, should be an easy, seamless experience, easy to look up and add a friend, and for that friend to accept. Once friends are accepted, access to that </w:t>
+      </w:r>
+      <w:proofErr w:type="gramStart"/>
+      <w:r>
+        <w:t>users</w:t>
+      </w:r>
+      <w:proofErr w:type="gramEnd"/>
+      <w:r>
+        <w:t xml:space="preserve"> profile page becomes enabled, and bi-directionally approved friends can send each other messages, upload content to each other, including both videos and images. Push notifications should alert the user on their device if new friend request, new DM, or new comment on post. Current firebase rules I think are set right for this and should be observed / things built around them, unless you see obvious need for change. Can you access them easily yourself? </w:t>
+      </w:r>
       <w:r>
         <w:br/>
       </w:r>
@@ -181,47 +336,271 @@
         <w:t>BB3 updates</w:t>
       </w:r>
     </w:p>
-    <w:p>
-      <w:pPr>
+    <w:p/>
+    <w:p>
+      <w:pPr>
+        <w:rPr>
+          <w:lang w:val="en-US"/>
+        </w:rPr>
+      </w:pPr>
+      <w:r>
         <w:rPr>
           <w:i/>
           <w:iCs/>
-        </w:rPr>
-      </w:pPr>
-      <w:r>
-        <w:br/>
-      </w:r>
-      <w:r>
-        <w:br/>
-      </w:r>
-      <w:r>
+          <w:lang w:val="en-US"/>
+        </w:rPr>
+        <w:t>Membership gate</w:t>
+      </w:r>
+      <w:r>
+        <w:rPr>
+          <w:lang w:val="en-US"/>
+        </w:rPr>
+        <w:br/>
+        <w:t xml:space="preserve">Can we please an annual fee rather than a monthly fee possible for GoodLift please? Make it $199 annual (SAVE $149) as an option </w:t>
+      </w:r>
+      <w:proofErr w:type="spellStart"/>
+      <w:proofErr w:type="gramStart"/>
+      <w:r>
+        <w:rPr>
+          <w:lang w:val="en-US"/>
+        </w:rPr>
+        <w:t>along side</w:t>
+      </w:r>
+      <w:proofErr w:type="spellEnd"/>
+      <w:proofErr w:type="gramEnd"/>
+      <w:r>
+        <w:rPr>
+          <w:lang w:val="en-US"/>
+        </w:rPr>
+        <w:t xml:space="preserve"> the $29 per month option. $29 should be the default and what gets debited when someone double clicks side button from apple </w:t>
+      </w:r>
+      <w:proofErr w:type="gramStart"/>
+      <w:r>
+        <w:rPr>
+          <w:lang w:val="en-US"/>
+        </w:rPr>
+        <w:t>pay</w:t>
+      </w:r>
+      <w:proofErr w:type="gramEnd"/>
+      <w:r>
+        <w:rPr>
+          <w:lang w:val="en-US"/>
+        </w:rPr>
+        <w:t xml:space="preserve"> when no further action is taken to change to annual rather than monthly. Think about the best way to pitch this from a sales perspective that does not entail creating friction at checkout. For both apple and google pay. Give me specific instructions for configuring each if in addition to </w:t>
+      </w:r>
+      <w:proofErr w:type="spellStart"/>
+      <w:r>
+        <w:rPr>
+          <w:lang w:val="en-US"/>
+        </w:rPr>
+        <w:t>claude</w:t>
+      </w:r>
+      <w:proofErr w:type="spellEnd"/>
+      <w:r>
+        <w:rPr>
+          <w:lang w:val="en-US"/>
+        </w:rPr>
+        <w:t xml:space="preserve"> code prompt for code change. </w:t>
+      </w:r>
+    </w:p>
+    <w:p/>
+    <w:p>
+      <w:pPr>
         <w:rPr>
           <w:i/>
           <w:iCs/>
         </w:rPr>
-        <w:t xml:space="preserve">Home screen </w:t>
-      </w:r>
+      </w:pPr>
       <w:r>
         <w:rPr>
           <w:i/>
           <w:iCs/>
         </w:rPr>
-        <w:t>updates</w:t>
-      </w:r>
-      <w:r>
-        <w:br/>
-      </w:r>
-      <w:r>
-        <w:br/>
-      </w:r>
-      <w:r>
-        <w:br/>
-      </w:r>
-      <w:r>
+        <w:t>Data structure</w:t>
+      </w:r>
+    </w:p>
+    <w:p>
+      <w:pPr>
         <w:rPr>
           <w:i/>
           <w:iCs/>
         </w:rPr>
+      </w:pPr>
+      <w:r>
+        <w:t>Can we please update the source code</w:t>
+      </w:r>
+      <w:r>
+        <w:t xml:space="preserve"> and </w:t>
+      </w:r>
+      <w:proofErr w:type="spellStart"/>
+      <w:r>
+        <w:t>firestore</w:t>
+      </w:r>
+      <w:proofErr w:type="spellEnd"/>
+      <w:r>
+        <w:t xml:space="preserve"> structure</w:t>
+      </w:r>
+      <w:r>
+        <w:t xml:space="preserve"> so that the data structure writes </w:t>
+      </w:r>
+      <w:proofErr w:type="spellStart"/>
+      <w:r>
+        <w:t>planned_blocks</w:t>
+      </w:r>
+      <w:proofErr w:type="spellEnd"/>
+      <w:r>
+        <w:t xml:space="preserve"> to users rather than </w:t>
+      </w:r>
+      <w:proofErr w:type="spellStart"/>
+      <w:r>
+        <w:t>planned_blocks</w:t>
+      </w:r>
+      <w:proofErr w:type="spellEnd"/>
+      <w:r>
+        <w:t xml:space="preserve"> existing as its own hierarchy in </w:t>
+      </w:r>
+      <w:proofErr w:type="spellStart"/>
+      <w:r>
+        <w:t>firestore</w:t>
+      </w:r>
+      <w:proofErr w:type="spellEnd"/>
+      <w:r>
+        <w:t xml:space="preserve"> at the same level as users, with a further field, ‘</w:t>
+      </w:r>
+      <w:proofErr w:type="spellStart"/>
+      <w:r>
+        <w:t>userid</w:t>
+      </w:r>
+      <w:proofErr w:type="spellEnd"/>
+      <w:r>
+        <w:t xml:space="preserve">’ sitting in planned blocks. Right </w:t>
+      </w:r>
+      <w:proofErr w:type="gramStart"/>
+      <w:r>
+        <w:t>now</w:t>
+      </w:r>
+      <w:proofErr w:type="gramEnd"/>
+      <w:r>
+        <w:t xml:space="preserve"> it is:</w:t>
+      </w:r>
+      <w:r>
+        <w:br/>
+        <w:t>planned blocks and user</w:t>
+      </w:r>
+      <w:r>
+        <w:t>s</w:t>
+      </w:r>
+      <w:r>
+        <w:t xml:space="preserve"> on one level, you click into planned blocks and then select </w:t>
+      </w:r>
+      <w:proofErr w:type="spellStart"/>
+      <w:r>
+        <w:t>userid</w:t>
+      </w:r>
+      <w:proofErr w:type="spellEnd"/>
+      <w:r>
+        <w:t>, then navigate to the relevant block</w:t>
+      </w:r>
+      <w:r>
+        <w:t xml:space="preserve"> for that user</w:t>
+      </w:r>
+      <w:r>
+        <w:t xml:space="preserve">. </w:t>
+      </w:r>
+      <w:r>
+        <w:br/>
+        <w:t>Can we instead make it so that planned blocks is not the same level as user</w:t>
+      </w:r>
+      <w:r>
+        <w:t>s</w:t>
+      </w:r>
+      <w:r>
+        <w:t xml:space="preserve">, but once you click on user, </w:t>
+      </w:r>
+      <w:proofErr w:type="spellStart"/>
+      <w:r>
+        <w:t>planned_blocks</w:t>
+      </w:r>
+      <w:proofErr w:type="spellEnd"/>
+      <w:r>
+        <w:t xml:space="preserve"> is in the next level</w:t>
+      </w:r>
+      <w:r>
+        <w:t xml:space="preserve"> down</w:t>
+      </w:r>
+      <w:r>
+        <w:t xml:space="preserve"> in users, </w:t>
+      </w:r>
+      <w:r>
+        <w:t xml:space="preserve">so would sit </w:t>
+      </w:r>
+      <w:proofErr w:type="spellStart"/>
+      <w:r>
+        <w:t xml:space="preserve">along </w:t>
+      </w:r>
+      <w:r>
+        <w:lastRenderedPageBreak/>
+        <w:t>side</w:t>
+      </w:r>
+      <w:proofErr w:type="spellEnd"/>
+      <w:r>
+        <w:t xml:space="preserve"> profile and </w:t>
+      </w:r>
+      <w:proofErr w:type="spellStart"/>
+      <w:r>
+        <w:t>re_cache</w:t>
+      </w:r>
+      <w:proofErr w:type="spellEnd"/>
+      <w:r>
+        <w:t xml:space="preserve"> in this example screenshot. How easy is it to change the source code so everywhere these fields are written to or read from its taken care of, and to change the actual data structure currently in </w:t>
+      </w:r>
+      <w:proofErr w:type="spellStart"/>
+      <w:r>
+        <w:t>firestore</w:t>
+      </w:r>
+      <w:proofErr w:type="spellEnd"/>
+      <w:r>
+        <w:t xml:space="preserve">, so the current data does not get lost but moves </w:t>
+      </w:r>
+      <w:proofErr w:type="spellStart"/>
+      <w:r>
+        <w:t>succesfully</w:t>
+      </w:r>
+      <w:proofErr w:type="spellEnd"/>
+      <w:r>
+        <w:br/>
+      </w:r>
+      <w:r>
+        <w:br/>
+      </w:r>
+      <w:r>
+        <w:rPr>
+          <w:i/>
+          <w:iCs/>
+        </w:rPr>
+        <w:t xml:space="preserve">Home screen </w:t>
+      </w:r>
+      <w:r>
+        <w:rPr>
+          <w:i/>
+          <w:iCs/>
+        </w:rPr>
+        <w:t>updates</w:t>
+      </w:r>
+      <w:r>
+        <w:br/>
+      </w:r>
+      <w:r>
+        <w:br/>
+      </w:r>
+      <w:r>
+        <w:br/>
+      </w:r>
+      <w:r>
+        <w:rPr>
+          <w:i/>
+          <w:iCs/>
+        </w:rPr>
         <w:t>Boring bits</w:t>
       </w:r>
       <w:r>
@@ -349,10 +728,10 @@
         <w:br/>
       </w:r>
       <w:r>
+        <w:br/>
+      </w:r>
+      <w:r>
         <w:lastRenderedPageBreak/>
-        <w:br/>
-      </w:r>
-      <w:r>
         <w:br/>
         <w:t>Hi Mike, this is your friendly reminder to do better.</w:t>
       </w:r>
@@ -429,24 +808,24 @@
           <w:lang w:val="en-US"/>
         </w:rPr>
       </w:pPr>
-      <w:r>
+    </w:p>
+    <w:p>
+      <w:pPr>
         <w:rPr>
           <w:lang w:val="en-US"/>
         </w:rPr>
-        <w:t>Improved log in flow.</w:t>
-      </w:r>
-    </w:p>
-    <w:p>
-      <w:pPr>
+      </w:pPr>
+      <w:r>
         <w:rPr>
           <w:lang w:val="en-US"/>
         </w:rPr>
-      </w:pPr>
+        <w:t>Release notes:</w:t>
+      </w:r>
       <w:r>
         <w:rPr>
           <w:lang w:val="en-US"/>
         </w:rPr>
-        <w:t>reduced app open time from cold start</w:t>
+        <w:br/>
       </w:r>
     </w:p>
     <w:p>
@@ -455,41 +834,82 @@
           <w:lang w:val="en-US"/>
         </w:rPr>
       </w:pPr>
-    </w:p>
-    <w:p>
-      <w:pPr>
+      <w:r>
         <w:rPr>
           <w:lang w:val="en-US"/>
         </w:rPr>
-      </w:pPr>
-    </w:p>
-    <w:p>
-      <w:pPr>
+        <w:t>Version</w:t>
+      </w:r>
+      <w:r>
         <w:rPr>
           <w:lang w:val="en-US"/>
         </w:rPr>
-      </w:pPr>
+        <w:t xml:space="preserve"> 81</w:t>
+      </w:r>
       <w:r>
         <w:rPr>
           <w:lang w:val="en-US"/>
         </w:rPr>
-        <w:t xml:space="preserve">Can we next add </w:t>
-      </w:r>
-      <w:hyperlink r:id="rId5" w:history="1">
-        <w:r>
-          <w:rPr>
-            <w:rStyle w:val="Hyperlink"/>
-            <w:lang w:val="en-US"/>
-          </w:rPr>
-          <w:t>shawn@mrwalker.co.nz</w:t>
-        </w:r>
-      </w:hyperlink>
+        <w:br/>
+      </w:r>
       <w:r>
         <w:rPr>
           <w:lang w:val="en-US"/>
         </w:rPr>
-        <w:t xml:space="preserve"> email address to the internal booking summary message? And make it so that he gets the same email currently directed to richard@razorsedgesystems.com</w:t>
-      </w:r>
+        <w:t>Coach Mode applications and athlete invitations, improved coach roster management, manual time entry for timed exercises, and reliability improvements.</w:t>
+      </w:r>
+      <w:r>
+        <w:rPr>
+          <w:lang w:val="en-US"/>
+        </w:rPr>
+        <w:br/>
+        <w:t xml:space="preserve">updated </w:t>
+      </w:r>
+      <w:proofErr w:type="spellStart"/>
+      <w:r>
+        <w:rPr>
+          <w:lang w:val="en-US"/>
+        </w:rPr>
+        <w:t>planned_blocks</w:t>
+      </w:r>
+      <w:proofErr w:type="spellEnd"/>
+      <w:r>
+        <w:rPr>
+          <w:lang w:val="en-US"/>
+        </w:rPr>
+        <w:t xml:space="preserve"> data schema</w:t>
+      </w:r>
+      <w:r>
+        <w:rPr>
+          <w:lang w:val="en-US"/>
+        </w:rPr>
+        <w:br/>
+      </w:r>
+    </w:p>
+    <w:p>
+      <w:pPr>
+        <w:rPr>
+          <w:lang w:val="en-US"/>
+        </w:rPr>
+      </w:pPr>
+    </w:p>
+    <w:p>
+      <w:r>
+        <w:t xml:space="preserve">There is also an unrelated recent change to wes2 we have worked on in parallel that can be </w:t>
+      </w:r>
+      <w:r>
+        <w:t>committed</w:t>
+      </w:r>
+      <w:r>
+        <w:t>/pushed/deployed along with the next for this thread together</w:t>
+      </w:r>
+    </w:p>
+    <w:p>
+      <w:pPr>
+        <w:rPr>
+          <w:lang w:val="en-US"/>
+        </w:rPr>
+      </w:pPr>
     </w:p>
     <w:sectPr>
       <w:pgSz w:w="11906" w:h="16838"/>
@@ -2017,7 +2437,6 @@
   <w:style w:type="character" w:default="1" w:styleId="DefaultParagraphFont">
     <w:name w:val="Default Paragraph Font"/>
     <w:uiPriority w:val="1"/>
-    <w:semiHidden/>
     <w:unhideWhenUsed/>
   </w:style>
   <w:style w:type="table" w:default="1" w:styleId="TableNormal">
@@ -2363,6 +2782,36 @@
     <w:rPr>
       <w:color w:val="605E5C"/>
       <w:shd w:val="clear" w:color="auto" w:fill="E1DFDD"/>
+    </w:rPr>
+  </w:style>
+  <w:style w:type="paragraph" w:styleId="HTMLPreformatted">
+    <w:name w:val="HTML Preformatted"/>
+    <w:basedOn w:val="Normal"/>
+    <w:link w:val="HTMLPreformattedChar"/>
+    <w:uiPriority w:val="99"/>
+    <w:semiHidden/>
+    <w:unhideWhenUsed/>
+    <w:rsid w:val="001E570B"/>
+    <w:pPr>
+      <w:spacing w:after="0" w:line="240" w:lineRule="auto"/>
+    </w:pPr>
+    <w:rPr>
+      <w:rFonts w:ascii="Consolas" w:hAnsi="Consolas"/>
+      <w:sz w:val="20"/>
+      <w:szCs w:val="20"/>
+    </w:rPr>
+  </w:style>
+  <w:style w:type="character" w:customStyle="1" w:styleId="HTMLPreformattedChar">
+    <w:name w:val="HTML Preformatted Char"/>
+    <w:basedOn w:val="DefaultParagraphFont"/>
+    <w:link w:val="HTMLPreformatted"/>
+    <w:uiPriority w:val="99"/>
+    <w:semiHidden/>
+    <w:rsid w:val="001E570B"/>
+    <w:rPr>
+      <w:rFonts w:ascii="Consolas" w:hAnsi="Consolas"/>
+      <w:sz w:val="20"/>
+      <w:szCs w:val="20"/>
     </w:rPr>
   </w:style>
 </w:styles>

</xml_diff>